<commit_message>
Apply Apollo KB corrections
</commit_message>
<xml_diff>
--- a/Apollo_Master_Verification_Reference_Organized.docx
+++ b/Apollo_Master_Verification_Reference_Organized.docx
@@ -15724,3288 +15724,28 @@
       </w:r>
     </w:p>
     <w:p>
-      <w:pPr>
-        <w:rPr>
-          <w:rFonts w:ascii="Proxima Nova" w:cs="Proxima Nova" w:eastAsia="Proxima Nova" w:hAnsi="Proxima Nova"/>
-        </w:rPr>
-      </w:pPr>
-      <w:r>
-        <w:rPr>
-          <w:rFonts w:ascii="Proxima Nova" w:cs="Proxima Nova" w:eastAsia="Proxima Nova" w:hAnsi="Proxima Nova"/>
-          <w:rtl w:val="0"/>
-        </w:rPr>
-        <w:t xml:space="preserve">*41_TECH__POWER_FAILURE_AND_REBOOT_PROCESS*</w:t>
-        <w:br w:type="textWrapping"/>
-        <w:t xml:space="preserve">---</w:t>
-        <w:br w:type="textWrapping"/>
-        <w:t xml:space="preserve">*Purpose*</w:t>
-      </w:r>
-    </w:p>
-    <w:p>
-      <w:pPr>
-        <w:pStyle w:val="Heading2"/>
-        <w:rPr>
-          <w:rFonts w:ascii="Proxima Nova" w:cs="Proxima Nova" w:eastAsia="Proxima Nova" w:hAnsi="Proxima Nova"/>
-        </w:rPr>
-      </w:pPr>
-      <w:r>
-        <w:rPr>
-          <w:rFonts w:ascii="Proxima Nova" w:cs="Proxima Nova" w:eastAsia="Proxima Nova" w:hAnsi="Proxima Nova"/>
-          <w:rtl w:val="0"/>
-        </w:rPr>
-        <w:t xml:space="preserve"> 57 OPERATIONS  PEAK HOURS</w:t>
-      </w:r>
-    </w:p>
-    <w:p>
-      <w:pPr>
-        <w:rPr>
-          <w:rFonts w:ascii="Proxima Nova" w:cs="Proxima Nova" w:eastAsia="Proxima Nova" w:hAnsi="Proxima Nova"/>
-        </w:rPr>
-      </w:pPr>
-      <w:r>
-        <w:rPr>
-          <w:rFonts w:ascii="Proxima Nova" w:cs="Proxima Nova" w:eastAsia="Proxima Nova" w:hAnsi="Proxima Nova"/>
-          <w:rtl w:val="0"/>
-        </w:rPr>
-        <w:t xml:space="preserve">*57_OPERATIONS__PEAK_HOURS*</w:t>
-        <w:br w:type="textWrapping"/>
-        <w:t xml:space="preserve">---</w:t>
-        <w:br w:type="textWrapping"/>
-        <w:t xml:space="preserve">*Purpose*</w:t>
-        <w:br w:type="textWrapping"/>
-        <w:t xml:space="preserve">Give simple, useful guidance on peak hours to team members who may not have Power BI access.</w:t>
-        <w:br w:type="textWrapping"/>
-        <w:t xml:space="preserve">*Core Answer*</w:t>
-        <w:br w:type="textWrapping"/>
-        <w:t xml:space="preserve">Peak hours are the times when the store is busiest -- the most bookings, the most rooms running, and the most guest activity.</w:t>
-        <w:br w:type="textWrapping"/>
-        <w:t xml:space="preserve">General pattern for most stores:</w:t>
-        <w:br w:type="textWrapping"/>
-        <w:t xml:space="preserve">- Busiest days are typically Friday, Saturday, and Sunday.</w:t>
-        <w:br w:type="textWrapping"/>
-        <w:t xml:space="preserve">- A common peak window on those days is approximately 2:00 PM to 9:00 PM.</w:t>
-        <w:br w:type="textWrapping"/>
-        <w:t xml:space="preserve">- Local patterns vary. Some stores have different peaks based on their market, location, or guest base.</w:t>
-        <w:br w:type="textWrapping"/>
-        <w:t xml:space="preserve">Peak periods across the year:</w:t>
-        <w:br w:type="textWrapping"/>
-        <w:t xml:space="preserve">- School breaks (spring break, summer, winter break)</w:t>
-        <w:br w:type="textWrapping"/>
-        <w:t xml:space="preserve">- Major holidays and long weekends</w:t>
-        <w:br w:type="textWrapping"/>
-        <w:t xml:space="preserve">- Regional busy seasons specific to the store's market</w:t>
-        <w:br w:type="textWrapping"/>
-        <w:t xml:space="preserve">*If You Don't Have Power BI Access*</w:t>
-        <w:br w:type="textWrapping"/>
-        <w:t xml:space="preserve">- Look at today's or this week's staffing schedule -- more staff scheduled usually indicates expected peak hours.</w:t>
-        <w:br w:type="textWrapping"/>
-        <w:t xml:space="preserve">- Check whatever booking visibility you have access to.</w:t>
-        <w:br w:type="textWrapping"/>
-        <w:t xml:space="preserve">- Ask your Store Manager or ASM which hours are typically considered peak at your location.</w:t>
-        <w:br w:type="textWrapping"/>
-        <w:t xml:space="preserve">Apollo does not know a specific store's actual peak hours unless store-specific data is provided. The above is a general pattern, not a guarantee for any given location.</w:t>
-        <w:br w:type="textWrapping"/>
-        <w:t xml:space="preserve">*Trigger Phrases*</w:t>
-        <w:br w:type="textWrapping"/>
-        <w:t xml:space="preserve">- peak hours</w:t>
-        <w:br w:type="textWrapping"/>
-        <w:t xml:space="preserve">- when are we busiest</w:t>
-        <w:br w:type="textWrapping"/>
-        <w:t xml:space="preserve">- what are our busiest times</w:t>
-        <w:br w:type="textWrapping"/>
-        <w:t xml:space="preserve">- peak times</w:t>
-        <w:br w:type="textWrapping"/>
-        <w:t xml:space="preserve">- busy hours</w:t>
-        <w:br w:type="textWrapping"/>
-        <w:t xml:space="preserve">- when do we get the most guests</w:t>
-        <w:br w:type="textWrapping"/>
-        <w:t xml:space="preserve">- what days are busiest</w:t>
-        <w:br w:type="textWrapping"/>
-        <w:t xml:space="preserve">- school break busy</w:t>
-        <w:br w:type="textWrapping"/>
-        <w:t xml:space="preserve">- holiday rush</w:t>
-        <w:br w:type="textWrapping"/>
-        <w:t xml:space="preserve">*Example Response Patterns*</w:t>
-        <w:br w:type="textWrapping"/>
-        <w:t xml:space="preserve">- "Peak hours are typically Friday through Sunday, roughly 2:00 PM to 9:00 PM, though this varies by store. School breaks and major holidays are also high-traffic periods."</w:t>
-        <w:br w:type="textWrapping"/>
-        <w:t xml:space="preserve">- "For your specific store's peak hours, check this week's staffing schedule or ask your Store Manager or ASM -- they'll know the local pattern."</w:t>
-        <w:br w:type="textWrapping"/>
-        <w:t xml:space="preserve">- "Without Power BI access, the best way to gauge busy times is to check the staffing schedule or ask your manager."</w:t>
-      </w:r>
-    </w:p>
-    <w:p>
-      <w:pPr>
-        <w:pStyle w:val="Heading2"/>
-        <w:rPr>
-          <w:rFonts w:ascii="Proxima Nova" w:cs="Proxima Nova" w:eastAsia="Proxima Nova" w:hAnsi="Proxima Nova"/>
-        </w:rPr>
-      </w:pPr>
-      <w:r>
-        <w:rPr>
-          <w:rFonts w:ascii="Proxima Nova" w:cs="Proxima Nova" w:eastAsia="Proxima Nova" w:hAnsi="Proxima Nova"/>
-          <w:rtl w:val="0"/>
-        </w:rPr>
-        <w:t xml:space="preserve"> 70 TECH  T1 SLACK WORKFLOW PROTOCOL</w:t>
-      </w:r>
-    </w:p>
-    <w:p>
-      <w:pPr>
-        <w:rPr>
-          <w:rFonts w:ascii="Proxima Nova" w:cs="Proxima Nova" w:eastAsia="Proxima Nova" w:hAnsi="Proxima Nova"/>
-        </w:rPr>
-      </w:pPr>
-      <w:r>
-        <w:rPr>
-          <w:rFonts w:ascii="Proxima Nova" w:cs="Proxima Nova" w:eastAsia="Proxima Nova" w:hAnsi="Proxima Nova"/>
-          <w:rtl w:val="0"/>
-        </w:rPr>
-        <w:t xml:space="preserve">*70_TECH__T1_SLACK_WORKFLOW_PROTOCOL*</w:t>
-        <w:br w:type="textWrapping"/>
-        <w:t xml:space="preserve">*Purpose*</w:t>
-        <w:br w:type="textWrapping"/>
-        <w:t xml:space="preserve">This file defines the T1 Slack workflow protocol for holodeck hardware and session tech issues ONLY. It overrides all other Apollo response behavior -- but ONLY after confirming the topic is a holodeck tech issue. This file does NOT apply to HR platforms, scheduling tools, booking systems, guest policy, or people operations questions. Read the When NOT to Use section before applying any rule in this file.</w:t>
-        <w:br w:type="textWrapping"/>
-        <w:t xml:space="preserve">---</w:t>
-        <w:br w:type="textWrapping"/>
-        <w:t xml:space="preserve">*Hard Rule: If you cannot identify the issue as one of the holodeck hardware/session tech types listed in "When to Use This File," do not apply the T1 workflow protocol. Identify the correct resource and route there instead.*</w:t>
-        <w:br w:type="textWrapping"/>
-        <w:t xml:space="preserve">---</w:t>
-        <w:br w:type="textWrapping"/>
-        <w:t xml:space="preserve">*Step 0 -- Topic Check (Required Before Applying Any Rule Below)*</w:t>
-        <w:br w:type="textWrapping"/>
-        <w:t xml:space="preserve">Before applying any rule in this file, Apollo must confirm the topic is a holodeck hardware or session tech issue.</w:t>
-        <w:br w:type="textWrapping"/>
-        <w:t xml:space="preserve">Ask: is this about holodeck hardware, headsets, SPCs, vests, props, audio, tracking, Silica, Unity, Evoke, network issues affecting sessions, or power failures?</w:t>
-        <w:br w:type="textWrapping"/>
-        <w:t xml:space="preserve">- If YES -- apply the rules below. The workflow link goes first.</w:t>
-        <w:br w:type="textWrapping"/>
-        <w:t xml:space="preserve">- If NO -- stop. Do not apply this file. Route to the correct resource using the When NOT to Use section above. Do not output a workflow link. Do not mention T1.</w:t>
-        <w:br w:type="textWrapping"/>
-        <w:t xml:space="preserve">Apollo must never skip Step 0. The rules below only apply after Step 0 confirms a holodeck tech topic.</w:t>
-        <w:br w:type="textWrapping"/>
-        <w:t xml:space="preserve">---</w:t>
-        <w:br w:type="textWrapping"/>
-        <w:t xml:space="preserve">*Non-Negotiable Rules (Holodeck Tech Issues Only)*</w:t>
-        <w:br w:type="textWrapping"/>
-        <w:t xml:space="preserve">*Rule 1 -- Workflow Link Always Comes First*</w:t>
-        <w:br w:type="textWrapping"/>
-        <w:t xml:space="preserve">For confirmed holodeck tech issues only: the workflow link must be the absolute first line of the response. No exceptions. No diagnosis first. No "this sounds like X" first. No context first. The link is line one.</w:t>
-        <w:br w:type="textWrapping"/>
-        <w:t xml:space="preserve">Format it exactly like this:</w:t>
-        <w:br w:type="textWrapping"/>
-        <w:t xml:space="preserve">*Submit your workflow ticket first:* [link]</w:t>
-        <w:br w:type="textWrapping"/>
-        <w:t xml:space="preserve">Do this now before troubleshooting.</w:t>
-        <w:br w:type="textWrapping"/>
-        <w:t xml:space="preserve">Apollo must never provide troubleshooting steps, context, diagnosis, or any other information before delivering the workflow link -- for holodeck tech issues.</w:t>
-        <w:br w:type="textWrapping"/>
-        <w:t xml:space="preserve">*Rule 2 -- The Slack Workflow Ticket Is Always Required*</w:t>
-        <w:br w:type="textWrapping"/>
-        <w:t xml:space="preserve">Submitting the Slack workflow ticket is mandatory for every tech issue, no matter what.</w:t>
-        <w:br w:type="textWrapping"/>
-        <w:t xml:space="preserve">- Submit immediately, as the very first action, before any troubleshooting begins.</w:t>
-        <w:br w:type="textWrapping"/>
-        <w:t xml:space="preserve">- Submit even if the store team resolved the issue independently -- the workflow ticket is still required for documentation.</w:t>
-        <w:br w:type="textWrapping"/>
-        <w:t xml:space="preserve">- Submit immediately and wait for T1 if the initial troubleshooting sequence does not resolve the issue.</w:t>
-        <w:br w:type="textWrapping"/>
-        <w:t xml:space="preserve">Apollo must never close a tech issue response without confirming the Slack workflow ticket has been submitted.</w:t>
-        <w:br w:type="textWrapping"/>
-        <w:t xml:space="preserve">*Rule 3 -- HTC Resyncs and AP Reboots Are T1-Only Actions*</w:t>
-        <w:br w:type="textWrapping"/>
-        <w:t xml:space="preserve">Store teams are not permitted to resync HTCs or reboot APs under any circumstances. If either action would be required, Apollo must stop troubleshooting guidance at that point and instruct the store team to submit the appropriate workflow ticket and wait for T1. Apollo must not list these as steps. Apollo must not suggest them as options.</w:t>
-        <w:br w:type="textWrapping"/>
-        <w:t xml:space="preserve">*Rule 4 -- Never Tell Stores to Refer to an SOP*</w:t>
-        <w:br w:type="textWrapping"/>
-        <w:t xml:space="preserve">Apollo must provide the full troubleshooting steps directly in its response. Apollo must never tell a store team to "refer to the SOP," "check the guide," or "see documentation." If the steps are not in Apollo's knowledge base, direct the team to submit the appropriate Slack workflow ticket.</w:t>
-        <w:br w:type="textWrapping"/>
-        <w:t xml:space="preserve">*Rule 5 -- Responses Must Be Direct and Sequential*</w:t>
-        <w:br w:type="textWrapping"/>
-        <w:t xml:space="preserve">Troubleshooting steps must be numbered and followed in order. Apollo must not present steps as optional suggestions. Use instructional language -- tell the team what to do.</w:t>
-        <w:br w:type="textWrapping"/>
-        <w:t xml:space="preserve">---</w:t>
-        <w:br w:type="textWrapping"/>
-        <w:t xml:space="preserve">*Response Format (Every Tech Issue)*</w:t>
-        <w:br w:type="textWrapping"/>
-        <w:t xml:space="preserve">The VERY FIRST LINE of every tech issue response must be the workflow ticket link. No context, no diagnosis, no preamble before it. The link comes first, always.</w:t>
-        <w:br w:type="textWrapping"/>
-        <w:t xml:space="preserve">Required opening format:</w:t>
-        <w:br w:type="textWrapping"/>
-        <w:t xml:space="preserve">*Submit your workflow ticket first:* [Workflow Link]</w:t>
-        <w:br w:type="textWrapping"/>
-        <w:t xml:space="preserve">Do this now before troubleshooting.</w:t>
-        <w:br w:type="textWrapping"/>
-        <w:t xml:space="preserve">Then troubleshooting steps if applicable.</w:t>
-        <w:br w:type="textWrapping"/>
-        <w:t xml:space="preserve">The workflow link must also appear at the END as a reminder if the response includes troubleshooting steps.</w:t>
-        <w:br w:type="textWrapping"/>
-        <w:t xml:space="preserve">⚠️ If any step requires resyncing HTCs or rebooting APs -- stop immediately. Store teams are not authorized to perform these actions. T1 will assist via your submitted workflow ticket.</w:t>
-        <w:br w:type="textWrapping"/>
-        <w:t xml:space="preserve">---</w:t>
-        <w:br w:type="textWrapping"/>
-        <w:t xml:space="preserve">*Issue Types, Workflow Links, and Troubleshooting Steps*</w:t>
-        <w:br w:type="textWrapping"/>
-        <w:t xml:space="preserve">*Audio -- Tech Issue*</w:t>
-        <w:br w:type="textWrapping"/>
-        <w:t xml:space="preserve">Workflow: &lt;https://slack.com/shortcuts/Ft09451D5YV8/8dd493bd042d66f44bc546d66cf35d2d|Submit Audio Workflow&gt;</w:t>
-        <w:br w:type="textWrapping"/>
-        <w:t xml:space="preserve">*If guests are hearing an echo:*</w:t>
-        <w:br w:type="textWrapping"/>
-        <w:t xml:space="preserve">Submit the workflow ticket immediately and contact T1 on Slack. Echo issues require T1 involvement to resolve.</w:t>
-        <w:br w:type="textWrapping"/>
-        <w:t xml:space="preserve">Quick check before contacting T1: confirm the server mic mute state (center button -- green LED = unmuted, red LED = muted). If the mic is unmuted and the echo persists, submit the ticket and wait for T1. Do not spend time attempting further fixes.</w:t>
-        <w:br w:type="textWrapping"/>
-        <w:t xml:space="preserve">&lt;https://slack.com/shortcuts/Ft09451D5YV8/8dd493bd042d66f44bc546d66cf35d2d|Submit Audio Workflow&gt;</w:t>
-        <w:br w:type="textWrapping"/>
-        <w:t xml:space="preserve">*If a guest cannot hear audio (single headset):*</w:t>
-        <w:br w:type="textWrapping"/>
-        <w:t xml:space="preserve">Steps:</w:t>
-        <w:br w:type="textWrapping"/>
-        <w:t xml:space="preserve">1. Reseat the audio cable on the affected HTC headset.</w:t>
-        <w:br w:type="textWrapping"/>
-        <w:t xml:space="preserve">2. Power cycle the HTC headset.</w:t>
-        <w:br w:type="textWrapping"/>
-        <w:t xml:space="preserve">3. Swap the headphone on the affected headset.</w:t>
-        <w:br w:type="textWrapping"/>
-        <w:t xml:space="preserve">4. If audio is still not working, swap the HTC headset entirely.</w:t>
-        <w:br w:type="textWrapping"/>
-        <w:t xml:space="preserve">5. Run a test to confirm audio is restored.</w:t>
-        <w:br w:type="textWrapping"/>
-        <w:t xml:space="preserve">Submit even if resolved. Submit immediately and wait for T1 if none of the above steps resolve the issue.</w:t>
-        <w:br w:type="textWrapping"/>
-        <w:t xml:space="preserve">*Crash -- Sudden Technical Failures*</w:t>
-        <w:br w:type="textWrapping"/>
-        <w:t xml:space="preserve">Workflow: &lt;https://slack.com/shortcuts/Ft094SS52D5E/1f8724542c0c2f48af42a0719b8ac3f9|Submit Crash Workflow&gt;</w:t>
-        <w:br w:type="textWrapping"/>
-        <w:t xml:space="preserve">*Submit the workflow ticket immediately -- before anything else:*</w:t>
-        <w:br w:type="textWrapping"/>
-        <w:t xml:space="preserve">&lt;https://slack.com/shortcuts/Ft094SS52D5E/1f8724542c0c2f48af42a0719b8ac3f9|Submit Crash Workflow&gt;</w:t>
-        <w:br w:type="textWrapping"/>
-        <w:t xml:space="preserve">*If Silica itself won't launch a session or keeps failing to start:* this is a system-level failure. Submit the ticket and wait for T1. No further steps.</w:t>
-        <w:br w:type="textWrapping"/>
-        <w:t xml:space="preserve">*If Unity crashed mid-session:* store teams cannot resolve Unity crashes independently. Submit the ticket, then ask: did Unity reboot automatically? If yes, monitor and let T1 know via the ticket. If no, wait for T1 to respond -- they will guide next steps. Do not attempt to restart Unity, reboot the SPC, or reboot the Experience Server independently.</w:t>
-        <w:br w:type="textWrapping"/>
-        <w:t xml:space="preserve">Submit the ticket even if the issue appears to resolve on its own. Documentation is required every time.</w:t>
-        <w:br w:type="textWrapping"/>
-        <w:t xml:space="preserve">*Props (Bluetooth and WiFi) -- Guns, Pistols, and Wands*</w:t>
-        <w:br w:type="textWrapping"/>
-        <w:t xml:space="preserve">Workflow: &lt;https://slack.com/shortcuts/Ft09408QFB2A/14825a4ac857d038430de4b5fa769ef9|Submit Props Workflow&gt;</w:t>
-        <w:br w:type="textWrapping"/>
-        <w:t xml:space="preserve">Steps:</w:t>
-        <w:br w:type="textWrapping"/>
-        <w:t xml:space="preserve">1. Power cycle the affected prop.</w:t>
-        <w:br w:type="textWrapping"/>
-        <w:t xml:space="preserve">2. Check that the prop's WiFi Brain is properly seated. Reseat if loose.</w:t>
-        <w:br w:type="textWrapping"/>
-        <w:t xml:space="preserve">3. Re-pair the prop to the system.</w:t>
-        <w:br w:type="textWrapping"/>
-        <w:t xml:space="preserve">4. Restart the relevant prop application on the SPC.</w:t>
-        <w:br w:type="textWrapping"/>
-        <w:t xml:space="preserve">5. Run a test to confirm the prop is functioning.</w:t>
-        <w:br w:type="textWrapping"/>
-        <w:t xml:space="preserve">6. If still not working, swap with a spare.</w:t>
-        <w:br w:type="textWrapping"/>
-        <w:t xml:space="preserve">Submit even if resolved. Submit immediately and wait for T1 if: no spare is available and the prop cannot be restored, or the WiFi Brain needs replacement.</w:t>
-        <w:br w:type="textWrapping"/>
-        <w:t xml:space="preserve">*Vest -- Haptic Feedback Vest Issues*</w:t>
-        <w:br w:type="textWrapping"/>
-        <w:t xml:space="preserve">Workflow: &lt;https://slack.com/shortcuts/Ft094SSF1KU0/1c866a8261923bf429312c8ba03b5c32|Submit Vest Workflow&gt;</w:t>
-        <w:br w:type="textWrapping"/>
-        <w:t xml:space="preserve">*Submit the workflow ticket first -- before troubleshooting:*</w:t>
-        <w:br w:type="textWrapping"/>
-        <w:t xml:space="preserve">&lt;https://slack.com/shortcuts/Ft094SSF1KU0/1c866a8261923bf429312c8ba03b5c32|Submit Vest Workflow&gt;</w:t>
-        <w:br w:type="textWrapping"/>
-        <w:t xml:space="preserve">Steps:</w:t>
-        <w:br w:type="textWrapping"/>
-        <w:t xml:space="preserve">1. Power cycle the affected vest: hold power button 3 seconds to turn off, wait 10 seconds, hold 3 seconds to turn back on. Confirm solid blue LED.</w:t>
-        <w:br w:type="textWrapping"/>
-        <w:t xml:space="preserve">2. Re-pair via VirtualHere:</w:t>
-        <w:br w:type="textWrapping"/>
-        <w:t xml:space="preserve">   - VNC into the corresponding SPC.</w:t>
-        <w:br w:type="textWrapping"/>
-        <w:t xml:space="preserve">   - Open VirtualHere Client: right-click the icon in the taskbar, select Show.</w:t>
-        <w:br w:type="textWrapping"/>
-        <w:t xml:space="preserve">   - Right-click the correct SPC, select Auto-Use Device Port.</w:t>
-        <w:br w:type="textWrapping"/>
-        <w:t xml:space="preserve">   - Confirm the vest shows "in use by you" in parentheses.</w:t>
-        <w:br w:type="textWrapping"/>
-        <w:t xml:space="preserve">3. Confirm bHaptics settings: Button Lock = ON, Stay Locked = ON, Turn Off After = Never.</w:t>
-        <w:br w:type="textWrapping"/>
-        <w:t xml:space="preserve">4. Close VNC after troubleshooting. Leaving it open slows SPC performance.</w:t>
-        <w:br w:type="textWrapping"/>
-        <w:t xml:space="preserve">5. If the vest is stuck vibrating, allow it to fully drain its battery, then recharge before re-pairing.</w:t>
-        <w:br w:type="textWrapping"/>
-        <w:t xml:space="preserve">⚠️ Do not reseat or touch the vest Bluetooth dongle unless T1 explicitly instructs you to. Dongle ports are assigned -- changing them disrupts vest functionality.</w:t>
-        <w:br w:type="textWrapping"/>
-        <w:t xml:space="preserve">If none of these steps resolve the issue, do not swap in the spare vest independently. Work with T1 on a solution via your submitted workflow ticket.</w:t>
-        <w:br w:type="textWrapping"/>
-        <w:t xml:space="preserve">Submit the ticket even if the issue resolves on its own. Documentation is required every time.</w:t>
-        <w:br w:type="textWrapping"/>
-        <w:t xml:space="preserve">*DGE -- Post-Experience Videos / Trailers*</w:t>
-        <w:br w:type="textWrapping"/>
-        <w:t xml:space="preserve">Workflow: &lt;https://slack.com/shortcuts/Ft094091CNVC/59698415f42d2612cf21137e1236c13c|Submit DGE Workflow&gt;</w:t>
-        <w:br w:type="textWrapping"/>
-        <w:t xml:space="preserve">Steps:</w:t>
-        <w:br w:type="textWrapping"/>
-        <w:t xml:space="preserve">1. Locate the session videos on the system.</w:t>
-        <w:br w:type="textWrapping"/>
-        <w:t xml:space="preserve">2. Check if videos have fully rendered. If not, re-render the videos.</w:t>
-        <w:br w:type="textWrapping"/>
-        <w:t xml:space="preserve">3. Upload the videos to WeTransfer.</w:t>
-        <w:br w:type="textWrapping"/>
-        <w:t xml:space="preserve">4. Generate the WeTransfer download link.</w:t>
-        <w:br w:type="textWrapping"/>
-        <w:t xml:space="preserve">5. Provide the link to the guest.</w:t>
-        <w:br w:type="textWrapping"/>
-        <w:t xml:space="preserve">Submit even if resolved. Submit immediately and wait for T1 if: videos cannot be located, re-rendering fails or errors out, or there is an ongoing SilicaOS outage affecting video rendering.</w:t>
-        <w:br w:type="textWrapping"/>
-        <w:t xml:space="preserve">*Network Latency -- Headset Showing High Network Latency or Lag*</w:t>
-        <w:br w:type="textWrapping"/>
-        <w:t xml:space="preserve">Workflow: &lt;https://slack.com/shortcuts/Ft094SSU4RQQ/9da4bb3de1ada37019fc3fbae06493c2|Submit Latency Workflow&gt;</w:t>
-        <w:br w:type="textWrapping"/>
-        <w:t xml:space="preserve">Steps:</w:t>
-        <w:br w:type="textWrapping"/>
-        <w:t xml:space="preserve">1. Reboot the affected HTC headset.</w:t>
-        <w:br w:type="textWrapping"/>
-        <w:t xml:space="preserve">2. If latency persists, restart Unity on the affected player's SPC. If Unity is full screen: press ALT + ENTER to minimize, then click X to close. Unity restarts automatically.</w:t>
-        <w:br w:type="textWrapping"/>
-        <w:t xml:space="preserve">3. If latency still persists after both steps, do not reboot the SPC. Submit the workflow ticket and wait for T1.</w:t>
-        <w:br w:type="textWrapping"/>
-        <w:t xml:space="preserve">⚠️ Do not reboot the SPC for network latency issues. T1 handles anything beyond the two steps above.</w:t>
-        <w:br w:type="textWrapping"/>
-        <w:t xml:space="preserve">*Game Latency -- In-Experience Lag or Delayed Response*</w:t>
-        <w:br w:type="textWrapping"/>
-        <w:t xml:space="preserve">Workflow: &lt;https://slack.com/shortcuts/Ft094SSU4RQQ/9da4bb3de1ada37019fc3fbae06493c2|Submit Latency Workflow&gt;</w:t>
-        <w:br w:type="textWrapping"/>
-        <w:t xml:space="preserve">Steps:</w:t>
-        <w:br w:type="textWrapping"/>
-        <w:t xml:space="preserve">1. Restart Unity on the affected player's SPC. If Unity is full screen: press ALT + ENTER to minimize, then click X to close. Unity restarts automatically.</w:t>
-        <w:br w:type="textWrapping"/>
-        <w:t xml:space="preserve">2. If game latency persists after Unity restart, submit the workflow ticket and wait for T1.</w:t>
-        <w:br w:type="textWrapping"/>
-        <w:t xml:space="preserve">⚠️ Do not reboot the SPC. Do not resync HTCs. If Unity restart does not resolve it, T1 takes it from here.</w:t>
-        <w:br w:type="textWrapping"/>
-        <w:t xml:space="preserve">Submit even if resolved. Documentation is required every time.</w:t>
-        <w:br w:type="textWrapping"/>
-        <w:t xml:space="preserve">*Tracking -- Tracking Issues Impacting Players*</w:t>
-        <w:br w:type="textWrapping"/>
-        <w:t xml:space="preserve">Workflow: &lt;https://slack.com/shortcuts/Ft094SSX6KU0/417d021c28828176de95d55a2c884f1e|Submit Tracking Workflow&gt;</w:t>
-        <w:br w:type="textWrapping"/>
-        <w:t xml:space="preserve">*Submit your workflow ticket NOW -- before you do anything else:*</w:t>
-        <w:br w:type="textWrapping"/>
-        <w:t xml:space="preserve">&lt;https://slack.com/shortcuts/Ft094SSX6KU0/417d021c28828176de95d55a2c884f1e|Submit Tracking Workflow&gt;</w:t>
-        <w:br w:type="textWrapping"/>
-        <w:t xml:space="preserve">This is mandatory. Submit it before any troubleshooting begins. Even if you resolve the issue on your own, the ticket must be submitted for documentation.</w:t>
-        <w:br w:type="textWrapping"/>
-        <w:t xml:space="preserve">*Single-player only: player stuck in the ground or appearing at wrong height*</w:t>
-        <w:br w:type="textWrapping"/>
-        <w:t xml:space="preserve">If only one player is affected and tracking looks fine on the Experience Server, this is a Unity/SPC issue, not a MoCap failure.</w:t>
-        <w:br w:type="textWrapping"/>
-        <w:t xml:space="preserve">1. Pause the session in Silica to stop the timer so the guest does not lose play time. Get on the mic and let the guest know: "I'm pausing your session so you don't lose any time. I'm going to restart the headset software real quick -- should take about 30 seconds."</w:t>
-        <w:br w:type="textWrapping"/>
-        <w:t xml:space="preserve">2. Restart Unity on the affected player's SPC. This is the primary fix -- do this first.</w:t>
-        <w:br w:type="textWrapping"/>
-        <w:t xml:space="preserve">   - If Unity is full screen: press ALT + ENTER to minimize, then click X to close. Unity restarts automatically.</w:t>
-        <w:br w:type="textWrapping"/>
-        <w:t xml:space="preserve">3. If Unity restart does not resolve it, reboot the affected HTC headset.</w:t>
-        <w:br w:type="textWrapping"/>
-        <w:t xml:space="preserve">4. Check the ATH:</w:t>
-        <w:br w:type="textWrapping"/>
-        <w:t xml:space="preserve">   - Power switch is ON (slid to the right).</w:t>
-        <w:br w:type="textWrapping"/>
-        <w:t xml:space="preserve">   - Status LED is not red.</w:t>
-        <w:br w:type="textWrapping"/>
-        <w:t xml:space="preserve">   - 3.5mm audio cable and Type-C cable are fully seated.</w:t>
-        <w:br w:type="textWrapping"/>
-        <w:t xml:space="preserve">5. Resume the session.</w:t>
-        <w:br w:type="textWrapping"/>
-        <w:t xml:space="preserve">⚠️ Stop and wait for T1 if:</w:t>
-        <w:br w:type="textWrapping"/>
-        <w:t xml:space="preserve">- The issue persists after Unity restart and HTC reboot.</w:t>
-        <w:br w:type="textWrapping"/>
-        <w:t xml:space="preserve">- HTC resync would be required -- store teams are not authorized to resync HTCs.</w:t>
-        <w:br w:type="textWrapping"/>
-        <w:t xml:space="preserve">Submit the workflow ticket even if resolved. Documentation is required every time.</w:t>
-        <w:br w:type="textWrapping"/>
-        <w:t xml:space="preserve">*Room-wide or MoCap tracking issues:*</w:t>
-        <w:br w:type="textWrapping"/>
-        <w:t xml:space="preserve">1. Restart Evoke.</w:t>
-        <w:br w:type="textWrapping"/>
-        <w:t xml:space="preserve">2. Reboot the MoCap server.</w:t>
-        <w:br w:type="textWrapping"/>
-        <w:t xml:space="preserve">3. Reboot the MoCap cameras via Evoke.</w:t>
-        <w:br w:type="textWrapping"/>
-        <w:t xml:space="preserve">4. Check ATH cable connections on the affected HTC headsets and reseat if needed.</w:t>
-        <w:br w:type="textWrapping"/>
-        <w:t xml:space="preserve">5. Recalibrate the room and run a test session.</w:t>
-        <w:br w:type="textWrapping"/>
-        <w:t xml:space="preserve">⚠️ If resyncing HTCs would be required at any point -- stop. T1 only.</w:t>
-        <w:br w:type="textWrapping"/>
-        <w:t xml:space="preserve">Submit even if resolved. Submit immediately and wait for T1 if: image error remains consistently too high after multiple calibration attempts, HTC resync would be required, or tracking issues persist after full Evoke and MoCap server reboot and recalibration.</w:t>
-        <w:br w:type="textWrapping"/>
-        <w:t xml:space="preserve">*Headset Swap Request*</w:t>
-        <w:br w:type="textWrapping"/>
-        <w:t xml:space="preserve">Workflow: &lt;https://slack.com/shortcuts/Ft0943CU9MKP/04c90cde53a4bd09b7029c88006882f2|Submit Headset Swap Workflow&gt;</w:t>
-        <w:br w:type="textWrapping"/>
-        <w:t xml:space="preserve">Steps:</w:t>
-        <w:br w:type="textWrapping"/>
-        <w:t xml:space="preserve">1. Submit the Headset Swap workflow immediately.</w:t>
-        <w:br w:type="textWrapping"/>
-        <w:t xml:space="preserve">2. Follow all steps provided in the workflow to complete the swap.</w:t>
-        <w:br w:type="textWrapping"/>
-        <w:t xml:space="preserve">⚠️ If a factory reset of the HTC is needed -- stop. T1 only.</w:t>
-        <w:br w:type="textWrapping"/>
-        <w:t xml:space="preserve">⚠️ If HTC resync is required as part of the swap -- stop. T1 only.</w:t>
-        <w:br w:type="textWrapping"/>
-        <w:t xml:space="preserve">Submit even after the swap is complete. Submit immediately and wait for T1 if: the replacement headset also has an issue after swapping, or a factory reset or HTC resync is required.</w:t>
-        <w:br w:type="textWrapping"/>
-        <w:t xml:space="preserve">*RMA Requests -- Hardware RMAs*</w:t>
-        <w:br w:type="textWrapping"/>
-        <w:t xml:space="preserve">Workflow: &lt;https://slack.com/shortcuts/Ft094HR6RGF3/37f33ae317b3f99279b217d5067a846a|Submit RMA Workflow&gt;</w:t>
-        <w:br w:type="textWrapping"/>
-        <w:t xml:space="preserve">Steps:</w:t>
-        <w:br w:type="textWrapping"/>
-        <w:t xml:space="preserve">1. Submit the RMA workflow immediately.</w:t>
-        <w:br w:type="textWrapping"/>
-        <w:t xml:space="preserve">2. Do not attempt to handle RMA logistics independently.</w:t>
-        <w:br w:type="textWrapping"/>
-        <w:t xml:space="preserve">3. T1 will take it from here.</w:t>
-        <w:br w:type="textWrapping"/>
-        <w:t xml:space="preserve">RMA requests are always a T1 matter. Store teams submit the workflow and wait.</w:t>
-        <w:br w:type="textWrapping"/>
-        <w:t xml:space="preserve">*Calibration*</w:t>
-        <w:br w:type="textWrapping"/>
-        <w:t xml:space="preserve">Workflow: &lt;https://slack.com/shortcuts/Ft09452EKGDQ/a5c6ebf2294321dda928432d27a6465f|Submit Calibration Workflow&gt;</w:t>
-        <w:br w:type="textWrapping"/>
-        <w:t xml:space="preserve">Steps:</w:t>
-        <w:br w:type="textWrapping"/>
-        <w:t xml:space="preserve">1. Restart Evoke.</w:t>
-        <w:br w:type="textWrapping"/>
-        <w:t xml:space="preserve">2. Reboot the MoCap server.</w:t>
-        <w:br w:type="textWrapping"/>
-        <w:t xml:space="preserve">3. Recalibrate the room using the T-Wand.</w:t>
-        <w:br w:type="textWrapping"/>
-        <w:t xml:space="preserve">4. Run a test session to confirm calibration is successful.</w:t>
-        <w:br w:type="textWrapping"/>
-        <w:t xml:space="preserve">Submit even if calibration was resolved. Submit immediately and wait for T1 if: image error remains consistently too high after multiple calibration attempts, only one calibration wand is available and it appears faulty, or calibration cannot be completed before a guest session begins.</w:t>
-        <w:br w:type="textWrapping"/>
-        <w:t xml:space="preserve">*Hardware Replacement and Installation (No HTCs)*</w:t>
-        <w:br w:type="textWrapping"/>
-        <w:t xml:space="preserve">Workflow: &lt;https://slack.com/shortcuts/Ft094STTAQ9E/784a540ec53c443b10a329e76e37b159|Submit Hardware Replacement Workflow&gt;</w:t>
-        <w:br w:type="textWrapping"/>
-        <w:t xml:space="preserve">Steps:</w:t>
-        <w:br w:type="textWrapping"/>
-        <w:t xml:space="preserve">1. Submit the Hardware Replacement and Installation workflow immediately.</w:t>
-        <w:br w:type="textWrapping"/>
-        <w:t xml:space="preserve">2. This covers all hardware except HTCs. HTC issues use the Headset Swap or RMA workflows.</w:t>
-        <w:br w:type="textWrapping"/>
-        <w:t xml:space="preserve">3. Do not attempt hardware replacement or installation independently.</w:t>
-        <w:br w:type="textWrapping"/>
-        <w:t xml:space="preserve">4. T1 oversight is required for all hardware replacement and installation tasks.</w:t>
-        <w:br w:type="textWrapping"/>
-        <w:t xml:space="preserve">*Other Technical Issues*</w:t>
-        <w:br w:type="textWrapping"/>
-        <w:t xml:space="preserve">Workflow: &lt;https://slack.com/shortcuts/Ft0943D99FUM/a0f585b129313535ca3f090ae27e523a|Submit Other Tech Issues Workflow&gt;</w:t>
-        <w:br w:type="textWrapping"/>
-        <w:t xml:space="preserve">Steps:</w:t>
-        <w:br w:type="textWrapping"/>
-        <w:t xml:space="preserve">1. Submit the Other Technical Issues workflow immediately.</w:t>
-        <w:br w:type="textWrapping"/>
-        <w:t xml:space="preserve">2. Wait for T1 to respond.</w:t>
-        <w:br w:type="textWrapping"/>
-        <w:t xml:space="preserve">If the issue does not clearly fit any other category, it goes here. Apollo must not attempt to troubleshoot unknown or ambiguous issues independently.</w:t>
-        <w:br w:type="textWrapping"/>
-        <w:t xml:space="preserve">*Non-Urgent Tech Issues*</w:t>
-        <w:br w:type="textWrapping"/>
-        <w:t xml:space="preserve">Workflow: &lt;https://slack.com/shortcuts/Ft094STGQS9E/b25a902ba207c42d018002e89cd5e29f|Submit Non-Urgent Tech Workflow&gt;</w:t>
-        <w:br w:type="textWrapping"/>
-        <w:t xml:space="preserve">Steps:</w:t>
-        <w:br w:type="textWrapping"/>
-        <w:t xml:space="preserve">1. Submit the Non-Urgent Tech Issues workflow.</w:t>
-        <w:br w:type="textWrapping"/>
-        <w:t xml:space="preserve">2. If the issue is not impacting an active guest session, it can be queued for the next available T1 window -- but the workflow must still be submitted. Every issue requires documentation.</w:t>
-        <w:br w:type="textWrapping"/>
-        <w:t xml:space="preserve">*Power Failure*</w:t>
-        <w:br w:type="textWrapping"/>
-        <w:t xml:space="preserve">Workflow: &lt;https://slack.com/shortcuts/Ft09AAEL9RM1/115ab8bb206b819d4d71e563344170f4|Submit Power Failure Workflow&gt;</w:t>
-        <w:br w:type="textWrapping"/>
-        <w:t xml:space="preserve">Steps:</w:t>
-        <w:br w:type="textWrapping"/>
-        <w:t xml:space="preserve">1. Submit the Power Failure workflow immediately.</w:t>
-        <w:br w:type="textWrapping"/>
-        <w:t xml:space="preserve">2. Prioritize guest safety first. Follow all in-store emergency procedures.</w:t>
-        <w:br w:type="textWrapping"/>
-        <w:t xml:space="preserve">3. Do not attempt to diagnose or restore power independently.</w:t>
-        <w:br w:type="textWrapping"/>
-        <w:t xml:space="preserve">4. T1 and facilities will take it from here.</w:t>
-        <w:br w:type="textWrapping"/>
-        <w:t xml:space="preserve">Power failures are always an immediate T1 and facilities matter. Apollo must not provide electrical troubleshooting guidance under any circumstances.</w:t>
-        <w:br w:type="textWrapping"/>
-        <w:t xml:space="preserve">---</w:t>
-        <w:br w:type="textWrapping"/>
-        <w:t xml:space="preserve">*Strict Behavior Guardrails*</w:t>
-        <w:br w:type="textWrapping"/>
-        <w:t xml:space="preserve">Apollo must never:</w:t>
-        <w:br w:type="textWrapping"/>
-        <w:t xml:space="preserve">- Respond to a tech issue without the workflow link as the absolute first line -- no diagnosis, no context, no preamble before it. Line one is always the link.</w:t>
-        <w:br w:type="textWrapping"/>
-        <w:t xml:space="preserve">- Provide troubleshooting steps that include resyncing HTCs or rebooting APs.</w:t>
-        <w:br w:type="textWrapping"/>
-        <w:t xml:space="preserve">- Suggest that submitting the Slack workflow ticket is optional.</w:t>
-        <w:br w:type="textWrapping"/>
-        <w:t xml:space="preserve">- Tell a store team the workflow ticket is not needed because they resolved the issue themselves.</w:t>
-        <w:br w:type="textWrapping"/>
-        <w:t xml:space="preserve">- Tell a store team to refer to a guide or SOP instead of providing steps.</w:t>
-        <w:br w:type="textWrapping"/>
-        <w:t xml:space="preserve">- Attempt to troubleshoot a Power Failure, RMA request, Hardware Replacement, or Other Technical Issue beyond providing the workflow link.</w:t>
-        <w:br w:type="textWrapping"/>
-        <w:t xml:space="preserve">- Skip the workflow ticket reminder at the end of any tech issue response.</w:t>
-        <w:br w:type="textWrapping"/>
-        <w:t xml:space="preserve">- Provide a workflow link that does not match the issue type being asked about.</w:t>
-        <w:br w:type="textWrapping"/>
-        <w:t xml:space="preserve">---</w:t>
-        <w:br w:type="textWrapping"/>
-        <w:t xml:space="preserve">*Quick Reference -- All Workflow Links*</w:t>
-        <w:br w:type="textWrapping"/>
-        <w:t xml:space="preserve">| Issue Type | Workflow Link |</w:t>
-        <w:br w:type="textWrapping"/>
-        <w:t xml:space="preserve">|------------|--------------|</w:t>
-        <w:br w:type="textWrapping"/>
-        <w:t xml:space="preserve">| Audio | &lt;https://slack.com/shortcuts/Ft09451D5YV8/8dd493bd042d66f44bc546d66cf35d2d|Submit Audio Workflow&gt; |</w:t>
-        <w:br w:type="textWrapping"/>
-        <w:t xml:space="preserve">| Crash | &lt;https://slack.com/shortcuts/Ft094SS52D5E/1f8724542c0c2f48af42a0719b8ac3f9|Submit Crash Workflow&gt; |</w:t>
-        <w:br w:type="textWrapping"/>
-        <w:t xml:space="preserve">| Props (Guns, Pistols, Wands) | &lt;https://slack.com/shortcuts/Ft09408QFB2A/14825a4ac857d038430de4b5fa769ef9|Submit Props Workflow&gt; |</w:t>
-        <w:br w:type="textWrapping"/>
-        <w:t xml:space="preserve">| Vest | &lt;https://slack.com/shortcuts/Ft094SSF1KU0/1c866a8261923bf429312c8ba03b5c32|Submit Vest Workflow&gt; |</w:t>
-        <w:br w:type="textWrapping"/>
-        <w:t xml:space="preserve">| DGE / Post-Experience Videos | &lt;https://slack.com/shortcuts/Ft094091CNVC/59698415f42d2612cf21137e1236c13c|Submit DGE Workflow&gt; |</w:t>
-        <w:br w:type="textWrapping"/>
-        <w:t xml:space="preserve">| Latency | &lt;https://slack.com/shortcuts/Ft094SSU4RQQ/9da4bb3de1ada37019fc3fbae06493c2|Submit Latency Workflow&gt; |</w:t>
-        <w:br w:type="textWrapping"/>
-        <w:t xml:space="preserve">| Tracking | &lt;https://slack.com/shortcuts/Ft094SSX6KU0/417d021c28828176de95d55a2c884f1e|Submit Tracking Workflow&gt; |</w:t>
-        <w:br w:type="textWrapping"/>
-        <w:t xml:space="preserve">| Headset Swap | &lt;https://slack.com/shortcuts/Ft0943CU9MKP/04c90cde53a4bd09b7029c88006882f2|Submit Headset Swap Workflow&gt; |</w:t>
-        <w:br w:type="textWrapping"/>
-        <w:t xml:space="preserve">| RMA | &lt;https://slack.com/shortcuts/Ft094HR6RGF3/37f33ae317b3f99279b217d5067a846a|Submit RMA Workflow&gt; |</w:t>
-        <w:br w:type="textWrapping"/>
-        <w:t xml:space="preserve">| Calibration | &lt;https://slack.com/shortcuts/Ft09452EKGDQ/a5c6ebf2294321dda928432d27a6465f|Submit Calibration Workflow&gt; |</w:t>
-        <w:br w:type="textWrapping"/>
-        <w:t xml:space="preserve">| Hardware Replacement (No HTCs) | &lt;https://slack.com/shortcuts/Ft094STTAQ9E/784a540ec53c443b10a329e76e37b159|Submit Hardware Replacement Workflow&gt; |</w:t>
-        <w:br w:type="textWrapping"/>
-        <w:t xml:space="preserve">| Other Technical Issues | &lt;https://slack.com/shortcuts/Ft0943D99FUM/a0f585b129313535ca3f090ae27e523a|Submit Other Tech Issues Workflow&gt; |</w:t>
-        <w:br w:type="textWrapping"/>
-        <w:t xml:space="preserve">| Non-Urgent Tech Issues | &lt;https://slack.com/shortcuts/Ft094STGQS9E/b25a902ba207c42d018002e89cd5e29f|Submit Non-Urgent Tech Workflow&gt; |</w:t>
-        <w:br w:type="textWrapping"/>
-        <w:t xml:space="preserve">| Power Failure | &lt;https://slack.com/shortcuts/Ft09AAEL9RM1/115ab8bb206b819d4d71e563344170f4|Submit Power Failure Workflow&gt; |</w:t>
-        <w:br w:type="textWrapping"/>
-        <w:t xml:space="preserve">---</w:t>
-        <w:br w:type="textWrapping"/>
-        <w:t xml:space="preserve">*Trigger Phrases*</w:t>
-        <w:br w:type="textWrapping"/>
-        <w:t xml:space="preserve">These phrases indicate a genuine holodeck tech issue and should trigger this file:</w:t>
-        <w:br w:type="textWrapping"/>
-        <w:t xml:space="preserve">- audio issue holodeck</w:t>
-        <w:br w:type="textWrapping"/>
-        <w:t xml:space="preserve">- guest can't hear</w:t>
-        <w:br w:type="textWrapping"/>
-        <w:t xml:space="preserve">- echo in headset</w:t>
-        <w:br w:type="textWrapping"/>
-        <w:t xml:space="preserve">- crash headset</w:t>
-        <w:br w:type="textWrapping"/>
-        <w:t xml:space="preserve">- crash silica</w:t>
-        <w:br w:type="textWrapping"/>
-        <w:t xml:space="preserve">- crash unity</w:t>
-        <w:br w:type="textWrapping"/>
-        <w:t xml:space="preserve">- experience crashed</w:t>
-        <w:br w:type="textWrapping"/>
-        <w:t xml:space="preserve">- prop not working</w:t>
-        <w:br w:type="textWrapping"/>
-        <w:t xml:space="preserve">- gun not working</w:t>
-        <w:br w:type="textWrapping"/>
-        <w:t xml:space="preserve">- wand not working</w:t>
-        <w:br w:type="textWrapping"/>
-        <w:t xml:space="preserve">- pistol not working</w:t>
-        <w:br w:type="textWrapping"/>
-        <w:t xml:space="preserve">- vest issue</w:t>
-        <w:br w:type="textWrapping"/>
-        <w:t xml:space="preserve">- haptic vest not working</w:t>
-        <w:br w:type="textWrapping"/>
-        <w:t xml:space="preserve">- vest not vibrating</w:t>
-        <w:br w:type="textWrapping"/>
-        <w:t xml:space="preserve">- vest stuck vibrating</w:t>
-        <w:br w:type="textWrapping"/>
-        <w:t xml:space="preserve">- DGE issue</w:t>
-        <w:br w:type="textWrapping"/>
-        <w:t xml:space="preserve">- post experience video not working</w:t>
-        <w:br w:type="textWrapping"/>
-        <w:t xml:space="preserve">- video not rendering</w:t>
-        <w:br w:type="textWrapping"/>
-        <w:t xml:space="preserve">- latency</w:t>
-        <w:br w:type="textWrapping"/>
-        <w:t xml:space="preserve">- lag</w:t>
-        <w:br w:type="textWrapping"/>
-        <w:t xml:space="preserve">- high latency session</w:t>
-        <w:br w:type="textWrapping"/>
-        <w:t xml:space="preserve">- tracking issue</w:t>
-        <w:br w:type="textWrapping"/>
-        <w:t xml:space="preserve">- player not tracking</w:t>
-        <w:br w:type="textWrapping"/>
-        <w:t xml:space="preserve">- tracker not working</w:t>
-        <w:br w:type="textWrapping"/>
-        <w:t xml:space="preserve">- limb not tracking</w:t>
-        <w:br w:type="textWrapping"/>
-        <w:t xml:space="preserve">- headset swap</w:t>
-        <w:br w:type="textWrapping"/>
-        <w:t xml:space="preserve">- HTC not working</w:t>
-        <w:br w:type="textWrapping"/>
-        <w:t xml:space="preserve">- headset black screen</w:t>
-        <w:br w:type="textWrapping"/>
-        <w:t xml:space="preserve">- headset won't connect</w:t>
-        <w:br w:type="textWrapping"/>
-        <w:t xml:space="preserve">- RMA hardware</w:t>
-        <w:br w:type="textWrapping"/>
-        <w:t xml:space="preserve">- return hardware broken</w:t>
-        <w:br w:type="textWrapping"/>
-        <w:t xml:space="preserve">- calibration issue</w:t>
-        <w:br w:type="textWrapping"/>
-        <w:t xml:space="preserve">- room calibration failing</w:t>
-        <w:br w:type="textWrapping"/>
-        <w:t xml:space="preserve">- MoCap not calibrating</w:t>
-        <w:br w:type="textWrapping"/>
-        <w:t xml:space="preserve">- hardware replacement holodeck</w:t>
-        <w:br w:type="textWrapping"/>
-        <w:t xml:space="preserve">- power failure holodeck</w:t>
-        <w:br w:type="textWrapping"/>
-        <w:t xml:space="preserve">- holodeck tech issue</w:t>
-        <w:br w:type="textWrapping"/>
-        <w:t xml:space="preserve">- T1 workflow</w:t>
-        <w:br w:type="textWrapping"/>
-        <w:t xml:space="preserve">- Slack workflow ticket</w:t>
-        <w:br w:type="textWrapping"/>
-        <w:t xml:space="preserve">- submit a T1 ticket</w:t>
-        <w:br w:type="textWrapping"/>
-        <w:t xml:space="preserve">- non-urgent tech issue</w:t>
-        <w:br w:type="textWrapping"/>
-        <w:t xml:space="preserve">- dead spot tracking</w:t>
-        <w:br w:type="textWrapping"/>
-        <w:t xml:space="preserve">- Vicon camera issue</w:t>
-        <w:br w:type="textWrapping"/>
-        <w:t xml:space="preserve">- SPC not responding</w:t>
-        <w:br w:type="textWrapping"/>
-        <w:t xml:space="preserve">- experience server down</w:t>
-        <w:br w:type="textWrapping"/>
-        <w:t xml:space="preserve">- Silica not launching</w:t>
-        <w:br w:type="textWrapping"/>
-        <w:t xml:space="preserve">- Evoke not loading</w:t>
-        <w:br w:type="textWrapping"/>
-        <w:t xml:space="preserve">- VNC issue</w:t>
-        <w:br w:type="textWrapping"/>
-        <w:t xml:space="preserve">- Raspberry Pi issue</w:t>
-        <w:br w:type="textWrapping"/>
-        <w:t xml:space="preserve">- server rack issue</w:t>
-        <w:br w:type="textWrapping"/>
-        <w:t xml:space="preserve">- network issue holodeck</w:t>
-        <w:br w:type="textWrapping"/>
-        <w:t xml:space="preserve">*Explicit Exclusions -- Never Apply T1 Workflow Protocol to These*</w:t>
-        <w:br w:type="textWrapping"/>
-        <w:t xml:space="preserve">- Lever, Lever login, Lever not working, Lever issues, Easy Book Link, candidate stages, interview scheduling -- route to file 33</w:t>
-        <w:br w:type="textWrapping"/>
-        <w:t xml:space="preserve">- Rippling, Rippling login, Rippling schedule, Rippling not working, shift issues Rippling, time card Rippling -- route to file 32</w:t>
-        <w:br w:type="textWrapping"/>
-        <w:t xml:space="preserve">- Checkfront, Checkfront login, booking issues, manifest issues, refund processing, Checkfront not loading -- route to file 52</w:t>
-        <w:br w:type="textWrapping"/>
-        <w:t xml:space="preserve">- Gift card admin app, Retool, gift card 403 error, gift card not loading -- route to file 53</w:t>
-        <w:br w:type="textWrapping"/>
-        <w:t xml:space="preserve">- Freshdesk issues -- route to file 67 for the correct Freshdesk form</w:t>
-        <w:br w:type="textWrapping"/>
-        <w:t xml:space="preserve">- Google Workspace (non-password), Slack app issues, Microsoft Office -- not T1 tech issues</w:t>
-        <w:br w:type="textWrapping"/>
-        <w:t xml:space="preserve">- Oasis access -- direct to oasis.sandboxvr.com or their manager</w:t>
-        <w:br w:type="textWrapping"/>
-        <w:t xml:space="preserve">- Hiring, recruiting, candidate questions, offer letters, background checks -- direct to peopleops@sandboxvr.com</w:t>
-        <w:br w:type="textWrapping"/>
-        <w:t xml:space="preserve">- HR policy, employee handbook, benefits, compensation, PTO, leave, payroll -- direct to peopleops@sandboxvr.com</w:t>
-        <w:br w:type="textWrapping"/>
-        <w:t xml:space="preserve">- Employee relations, disciplinary actions, terminations, performance improvement plans -- direct to peopleops@sandboxvr.com</w:t>
-        <w:br w:type="textWrapping"/>
-        <w:t xml:space="preserve">- Workplace complaints, harassment, misconduct reports -- direct to peopleops@sandboxvr.com</w:t>
-        <w:br w:type="textWrapping"/>
-        <w:t xml:space="preserve">- Scheduling disputes, shift coverage, labor budgets, overtime decisions, OU -- direct to Ops Leader</w:t>
-        <w:br w:type="textWrapping"/>
-        <w:t xml:space="preserve">- Refund requests, guest complaints, booking disputes, guest policy exceptions -- direct to Ops Leader</w:t>
-        <w:br w:type="textWrapping"/>
-        <w:t xml:space="preserve">- Age restriction edge cases, comp tickets, event pricing disputes -- direct to Ops Leader</w:t>
-        <w:br w:type="textWrapping"/>
-        <w:t xml:space="preserve">- Guest injury follow-up, accessibility accommodations, guest bans -- direct to Ops Leader</w:t>
-        <w:br w:type="textWrapping"/>
-        <w:t xml:space="preserve">- eLearning assignments, training tasks, LMS access, onboarding training -- direct to manager or Ops Leader</w:t>
-        <w:br w:type="textWrapping"/>
-        <w:t xml:space="preserve">- Marketing, local partnerships, social media, promotional events -- direct to Ops Leader or Territory Leader</w:t>
-        <w:br w:type="textWrapping"/>
-        <w:t xml:space="preserve">- Procurement, replenishment, ordering supplies -- direct to procurement@sandboxvr.com or file 17</w:t>
-        <w:br w:type="textWrapping"/>
-        <w:t xml:space="preserve">- Accountability, performance management, coaching, written warnings -- route to file 31 or direct to manager</w:t>
-        <w:br w:type="textWrapping"/>
-        <w:t xml:space="preserve">- Broken store appliance, facility repair, HVAC, furniture -- Freshdesk Repair and Maintenance form (file 67)</w:t>
-        <w:br w:type="textWrapping"/>
-        <w:t xml:space="preserve">- New team member onboarding (system access) -- Freshdesk Onboarding form (file 67)</w:t>
-        <w:br w:type="textWrapping"/>
-        <w:t xml:space="preserve">- Team member offboarding (system access) -- Freshdesk Offboarding form (file 67)</w:t>
-        <w:br w:type="textWrapping"/>
-        <w:t xml:space="preserve">- Google account password reset -- Freshdesk Google Password Reset form (file 67)</w:t>
-        <w:br w:type="textWrapping"/>
-        <w:t xml:space="preserve">- Store incident report (guest injury, safety event) -- Freshdesk Store Incident Tracker (file 67)</w:t>
-        <w:br w:type="textWrapping"/>
-        <w:t xml:space="preserve">- eWaste disposal -- Freshdesk eWaste form (file 67)</w:t>
-        <w:br w:type="textWrapping"/>
-        <w:t xml:space="preserve">*SPC vs AP Hard Rule (Embedded Here for Redundancy)*</w:t>
-        <w:br w:type="textWrapping"/>
-        <w:t xml:space="preserve">- 1 SPC = 1 HTC headset = 1 player. Always. No exceptions.</w:t>
-        <w:br w:type="textWrapping"/>
-        <w:t xml:space="preserve">- 1 AP = 2 HTC headsets = 2 players. Always. No exceptions.</w:t>
-        <w:br w:type="textWrapping"/>
-        <w:t xml:space="preserve">- Apollo must never say an SPC handles two players.</w:t>
-        <w:br w:type="textWrapping"/>
-        <w:t xml:space="preserve">- Apollo must never say an AP handles one player.</w:t>
-        <w:br w:type="textWrapping"/>
-        <w:t xml:space="preserve">- If any response about tech issues involves SPC or AP ratios, these are the only correct values.</w:t>
-      </w:r>
-    </w:p>
-    <w:p>
-      <w:pPr>
-        <w:pStyle w:val="Heading2"/>
-        <w:rPr>
-          <w:rFonts w:ascii="Proxima Nova" w:cs="Proxima Nova" w:eastAsia="Proxima Nova" w:hAnsi="Proxima Nova"/>
-        </w:rPr>
-      </w:pPr>
-      <w:r>
-        <w:rPr>
-          <w:rFonts w:ascii="Proxima Nova" w:cs="Proxima Nova" w:eastAsia="Proxima Nova" w:hAnsi="Proxima Nova"/>
-          <w:rtl w:val="0"/>
-        </w:rPr>
-        <w:t xml:space="preserve"> 78 OPERATIONS  TECH CHECKLIST</w:t>
-      </w:r>
-    </w:p>
-    <w:p>
-      <w:pPr>
-        <w:rPr>
-          <w:rFonts w:ascii="Proxima Nova" w:cs="Proxima Nova" w:eastAsia="Proxima Nova" w:hAnsi="Proxima Nova"/>
-        </w:rPr>
-      </w:pPr>
-      <w:r>
-        <w:rPr>
-          <w:rFonts w:ascii="Proxima Nova" w:cs="Proxima Nova" w:eastAsia="Proxima Nova" w:hAnsi="Proxima Nova"/>
-          <w:rtl w:val="0"/>
-        </w:rPr>
-        <w:t xml:space="preserve">*78_OPERATIONS__TECH_CHECKLIST*</w:t>
-        <w:br w:type="textWrapping"/>
-        <w:t xml:space="preserve">*Category:* OPERATIONS</w:t>
-        <w:br w:type="textWrapping"/>
-        <w:t xml:space="preserve">*Oasis Link:* https://sites.google.com/sandboxvr.com/theoasis/home/store-operations/guest-centric-operationally-sound/operating-policies-and-procedures/success-routines</w:t>
-        <w:br w:type="textWrapping"/>
-        <w:t xml:space="preserve">---</w:t>
-        <w:br w:type="textWrapping"/>
-        <w:t xml:space="preserve">*Purpose*</w:t>
-        <w:br w:type="textWrapping"/>
-        <w:t xml:space="preserve">---</w:t>
-        <w:br w:type="textWrapping"/>
-        <w:t xml:space="preserve">---</w:t>
-        <w:br w:type="textWrapping"/>
-        <w:t xml:space="preserve">*Tech Checklist Overview*</w:t>
-        <w:br w:type="textWrapping"/>
-        <w:t xml:space="preserve">Yes, the tech checklist is something your store should be doing regularly.</w:t>
-        <w:br w:type="textWrapping"/>
-        <w:t xml:space="preserve">You can find it on the *Success Routines* page on the Oasis. Use it weekly to verify that your tech is supplied, functioning, and being well maintained.</w:t>
-        <w:br w:type="textWrapping"/>
-        <w:t xml:space="preserve">&lt;https://sites.google.com/sandboxvr.com/theoasis/home/store-operations/guest-centric-operationally-sound/operating-policies-and-procedures/success-routines|View Success Routines on Oasis&gt;</w:t>
-        <w:br w:type="textWrapping"/>
-        <w:t xml:space="preserve">---</w:t>
-        <w:br w:type="textWrapping"/>
-        <w:t xml:space="preserve">*Required Response Logic*</w:t>
-        <w:br w:type="textWrapping"/>
-        <w:t xml:space="preserve">- Confirm that yes, the tech checklist is something stores should be doing.</w:t>
-        <w:br w:type="textWrapping"/>
-        <w:t xml:space="preserve">- Direct the user to the Success Routines page on the Oasis.</w:t>
-        <w:br w:type="textWrapping"/>
-        <w:t xml:space="preserve">- Do not guess at the specific checklist contents. Send the user to the Oasis for the full list.</w:t>
-        <w:br w:type="textWrapping"/>
-        <w:t xml:space="preserve">---</w:t>
-        <w:br w:type="textWrapping"/>
-        <w:t xml:space="preserve">*Trigger Phrases*</w:t>
-        <w:br w:type="textWrapping"/>
-        <w:t xml:space="preserve">- tech checklist</w:t>
-        <w:br w:type="textWrapping"/>
-        <w:t xml:space="preserve">- is there a tech checklist</w:t>
-        <w:br w:type="textWrapping"/>
-        <w:t xml:space="preserve">- should we do a tech checklist</w:t>
-        <w:br w:type="textWrapping"/>
-        <w:t xml:space="preserve">- how often tech checklist</w:t>
-        <w:br w:type="textWrapping"/>
-        <w:t xml:space="preserve">- where is the tech checklist</w:t>
-        <w:br w:type="textWrapping"/>
-        <w:t xml:space="preserve">- success routines</w:t>
-        <w:br w:type="textWrapping"/>
-        <w:t xml:space="preserve">- weekly tech check</w:t>
-        <w:br w:type="textWrapping"/>
-        <w:t xml:space="preserve">- tech maintenance checklist</w:t>
-        <w:br w:type="textWrapping"/>
-        <w:t xml:space="preserve">---</w:t>
-        <w:br w:type="textWrapping"/>
-        <w:t xml:space="preserve">*Exclusions*</w:t>
-        <w:br w:type="textWrapping"/>
-        <w:t xml:space="preserve">- Do not reproduce the full checklist contents. Send the user to the Oasis link.</w:t>
-      </w:r>
-    </w:p>
-    <w:p>
-      <w:pPr>
-        <w:pStyle w:val="Heading2"/>
-        <w:rPr>
-          <w:rFonts w:ascii="Proxima Nova" w:cs="Proxima Nova" w:eastAsia="Proxima Nova" w:hAnsi="Proxima Nova"/>
-        </w:rPr>
-      </w:pPr>
-      <w:r>
-        <w:rPr>
-          <w:rFonts w:ascii="Proxima Nova" w:cs="Proxima Nova" w:eastAsia="Proxima Nova" w:hAnsi="Proxima Nova"/>
-          <w:rtl w:val="0"/>
-        </w:rPr>
-        <w:t xml:space="preserve"> 81 OPERATIONS  MEMBERSHIP PASS</w:t>
-      </w:r>
-    </w:p>
-    <w:p>
-      <w:pPr>
-        <w:rPr>
-          <w:rFonts w:ascii="Proxima Nova" w:cs="Proxima Nova" w:eastAsia="Proxima Nova" w:hAnsi="Proxima Nova"/>
-        </w:rPr>
-      </w:pPr>
-      <w:r>
-        <w:rPr>
-          <w:rFonts w:ascii="Proxima Nova" w:cs="Proxima Nova" w:eastAsia="Proxima Nova" w:hAnsi="Proxima Nova"/>
-          <w:rtl w:val="0"/>
-        </w:rPr>
-        <w:t xml:space="preserve">*81_OPERATIONS__MEMBERSHIP_PASS*</w:t>
-        <w:br w:type="textWrapping"/>
-        <w:t xml:space="preserve">*Category:* OPERATIONS</w:t>
-        <w:br w:type="textWrapping"/>
-        <w:t xml:space="preserve">*Oasis:* &lt;https://sites.google.com/sandboxvr.com/theoasis/home/store-operations/guest-centric-operationally-sound/operating-policies-and-procedures/membership|Membership Pass SOP -- Oasis&gt;</w:t>
-        <w:br w:type="textWrapping"/>
-        <w:t xml:space="preserve">---</w:t>
-        <w:br w:type="textWrapping"/>
-        <w:t xml:space="preserve">---</w:t>
-        <w:br w:type="textWrapping"/>
-        <w:t xml:space="preserve">*Purpose*</w:t>
-        <w:br w:type="textWrapping"/>
-        <w:t xml:space="preserve">*Important: The Membership Pass is not available at all Sandbox VR locations. It is only offered at select stores. If a team member is unsure whether their store participates, they should confirm with their Ops Leader before selling or pitching the pass to guests.*</w:t>
-        <w:br w:type="textWrapping"/>
-        <w:t xml:space="preserve">---</w:t>
-        <w:br w:type="textWrapping"/>
-        <w:t xml:space="preserve">---</w:t>
-        <w:br w:type="textWrapping"/>
-        <w:t xml:space="preserve">---</w:t>
-        <w:br w:type="textWrapping"/>
-        <w:t xml:space="preserve">*Membership Pass Overview*</w:t>
-        <w:br w:type="textWrapping"/>
-        <w:t xml:space="preserve">The Membership Pass allows guests to play unlimited Sandbox VR experiences on weekdays (Monday through Friday) at their Home Location for a flat monthly rate.</w:t>
-        <w:br w:type="textWrapping"/>
-        <w:t xml:space="preserve">*Availability: The Membership Pass is only offered at select Sandbox VR locations -- not all stores. Team members should confirm with their Ops Leader that their store is enrolled before selling or promoting the pass.*</w:t>
-        <w:br w:type="textWrapping"/>
-        <w:t xml:space="preserve">It is designed for guests who replay experiences, visit regularly, bring friends or family, or want better long-term value than single-session pricing.</w:t>
-        <w:br w:type="textWrapping"/>
-        <w:t xml:space="preserve">---</w:t>
-        <w:br w:type="textWrapping"/>
-        <w:t xml:space="preserve">*Plans, Pricing, and Benefits*</w:t>
-        <w:br w:type="textWrapping"/>
-        <w:t xml:space="preserve">*Month-to-Month Plan*</w:t>
-        <w:br w:type="textWrapping"/>
-        <w:t xml:space="preserve">- Price: $74.99/month</w:t>
-        <w:br w:type="textWrapping"/>
-        <w:t xml:space="preserve">- Commitment: none</w:t>
-        <w:br w:type="textWrapping"/>
-        <w:t xml:space="preserve">- Core benefit: unlimited weekday play at Home Location</w:t>
-        <w:br w:type="textWrapping"/>
-        <w:t xml:space="preserve">- Additional benefits: 15% off Food &amp; Beverage, 20% off Parties</w:t>
-        <w:br w:type="textWrapping"/>
-        <w:t xml:space="preserve">*6-Month Plan*</w:t>
-        <w:br w:type="textWrapping"/>
-        <w:t xml:space="preserve">- Price: $54.99/month</w:t>
-        <w:br w:type="textWrapping"/>
-        <w:t xml:space="preserve">- Commitment: 6 months</w:t>
-        <w:br w:type="textWrapping"/>
-        <w:t xml:space="preserve">- Core benefit: unlimited weekday play at Home Location</w:t>
-        <w:br w:type="textWrapping"/>
-        <w:t xml:space="preserve">- Additional benefits: bring one Guest for free per session, 15% off Food &amp; Beverage, 20% off Parties</w:t>
-        <w:br w:type="textWrapping"/>
-        <w:t xml:space="preserve">*Key Constraints (do not lead with these -- present benefits first)*</w:t>
-        <w:br w:type="textWrapping"/>
-        <w:t xml:space="preserve">- Valid Monday through Friday only</w:t>
-        <w:br w:type="textWrapping"/>
-        <w:t xml:space="preserve">- Valid at the guest's Home Location only (subject to change)</w:t>
-        <w:br w:type="textWrapping"/>
-        <w:t xml:space="preserve">- Maximum two active bookings at a time</w:t>
-        <w:br w:type="textWrapping"/>
-        <w:t xml:space="preserve">- Weekends, holidays, and blackout dates are not included</w:t>
-        <w:br w:type="textWrapping"/>
-        <w:t xml:space="preserve">*Positioning Rule*</w:t>
-        <w:br w:type="textWrapping"/>
-        <w:t xml:space="preserve">Always position the 6-month plan as the best value. Lead with the 6-month plan in every pitch unless the guest specifically asks about month-to-month.</w:t>
-        <w:br w:type="textWrapping"/>
-        <w:t xml:space="preserve">---</w:t>
-        <w:br w:type="textWrapping"/>
-        <w:t xml:space="preserve">*Selling Philosophy*</w:t>
-        <w:br w:type="textWrapping"/>
-        <w:t xml:space="preserve">- The Membership Pass is an invitation, not a hard sell.</w:t>
-        <w:br w:type="textWrapping"/>
-        <w:t xml:space="preserve">- The goal is to start a conversation, not win every time.</w:t>
-        <w:br w:type="textWrapping"/>
-        <w:t xml:space="preserve">- A "no" today often means timing, not rejection.</w:t>
-        <w:br w:type="textWrapping"/>
-        <w:t xml:space="preserve">- Guests should leave knowing the pass exists, understanding the value, and feeling good about the interaction.</w:t>
-        <w:br w:type="textWrapping"/>
-        <w:t xml:space="preserve">---</w:t>
-        <w:br w:type="textWrapping"/>
-        <w:t xml:space="preserve">*When to Sell (Timing)*</w:t>
-        <w:br w:type="textWrapping"/>
-        <w:t xml:space="preserve">The highest-converting moment is immediately after the experience, during the same visit.</w:t>
-        <w:br w:type="textWrapping"/>
-        <w:t xml:space="preserve">- Guest excitement is highest post-experience.</w:t>
-        <w:br w:type="textWrapping"/>
-        <w:t xml:space="preserve">- Groups are already talking about coming back.</w:t>
-        <w:br w:type="textWrapping"/>
-        <w:t xml:space="preserve">- The pass feels like the natural next move, not an upsell.</w:t>
-        <w:br w:type="textWrapping"/>
-        <w:t xml:space="preserve">---</w:t>
-        <w:br w:type="textWrapping"/>
-        <w:t xml:space="preserve">*In-Store Selling Behaviors*</w:t>
-        <w:br w:type="textWrapping"/>
-        <w:t xml:space="preserve">*Check-In: Seed the Idea*</w:t>
-        <w:br w:type="textWrapping"/>
-        <w:t xml:space="preserve">Goal: create awareness without pressure.</w:t>
-        <w:br w:type="textWrapping"/>
-        <w:t xml:space="preserve">- Keep it short.</w:t>
-        <w:br w:type="textWrapping"/>
-        <w:t xml:space="preserve">- Do not explain full pricing unless asked.</w:t>
-        <w:br w:type="textWrapping"/>
-        <w:t xml:space="preserve">- Frame it as sharing a perk for regulars.</w:t>
-        <w:br w:type="textWrapping"/>
-        <w:t xml:space="preserve">Example framing: "Welcome to Sandbox VR. Are you a member with us?"</w:t>
-        <w:br w:type="textWrapping"/>
-        <w:t xml:space="preserve">*Post-Experience: Primary Pitch*</w:t>
-        <w:br w:type="textWrapping"/>
-        <w:t xml:space="preserve">Goal: convert excited guests before they leave.</w:t>
-        <w:br w:type="textWrapping"/>
-        <w:t xml:space="preserve">- Start with excitement and praise for their session.</w:t>
-        <w:br w:type="textWrapping"/>
-        <w:t xml:space="preserve">- Pause after each benefit to let it land.</w:t>
-        <w:br w:type="textWrapping"/>
-        <w:t xml:space="preserve">- Match the group's energy.</w:t>
-        <w:br w:type="textWrapping"/>
-        <w:t xml:space="preserve">- Offer to help them sign up before they leave.</w:t>
-        <w:br w:type="textWrapping"/>
-        <w:t xml:space="preserve">Core value framing to hit:</w:t>
-        <w:br w:type="textWrapping"/>
-        <w:t xml:space="preserve">- Unlimited weekday play</w:t>
-        <w:br w:type="textWrapping"/>
-        <w:t xml:space="preserve">- Savings compared to single sessions</w:t>
-        <w:br w:type="textWrapping"/>
-        <w:t xml:space="preserve">- Bring a Guest for Free with the 6-month plan</w:t>
-        <w:br w:type="textWrapping"/>
-        <w:t xml:space="preserve">*Same-Day Upgrade Framing*</w:t>
-        <w:br w:type="textWrapping"/>
-        <w:t xml:space="preserve">If a guest played that day, their ticket can be applied toward a 6-Month Membership Pass.</w:t>
-        <w:br w:type="textWrapping"/>
-        <w:t xml:space="preserve">- Frame this as reducing friction: they are not starting from zero -- their visit today already counts.</w:t>
-        <w:br w:type="textWrapping"/>
-        <w:t xml:space="preserve">- This is only available for the 6-month plan. Month-to-month upgrades are not available.</w:t>
-        <w:br w:type="textWrapping"/>
-        <w:t xml:space="preserve">---</w:t>
-        <w:br w:type="textWrapping"/>
-        <w:t xml:space="preserve">*Simple Savings Math (Conversation Aid -- Not a Script)*</w:t>
-        <w:br w:type="textWrapping"/>
-        <w:t xml:space="preserve">Use these ranges to explain value quickly. Ask guests how often they come vs. how often they would come if they had a pass.</w:t>
-        <w:br w:type="textWrapping"/>
-        <w:t xml:space="preserve">- 6-Month Pass, 1x/month: approximately 50% off because the Bring a Guest benefit applies</w:t>
-        <w:br w:type="textWrapping"/>
-        <w:t xml:space="preserve">- 6-Month Pass, 2x/month: approximately 75% off</w:t>
-        <w:br w:type="textWrapping"/>
-        <w:t xml:space="preserve">- 6-Month Pass, 3x/month: approximately 80%+ off</w:t>
-        <w:br w:type="textWrapping"/>
-        <w:t xml:space="preserve">- 6-Month Pass, 4x+/month: approximately 85-90%+ off</w:t>
-        <w:br w:type="textWrapping"/>
-        <w:t xml:space="preserve">- Month-to-Month Pass, 2x/month: savings start at this frequency</w:t>
-        <w:br w:type="textWrapping"/>
-        <w:t xml:space="preserve">- Month-to-Month Pass, 3x/month: approximately 50%+ off</w:t>
-        <w:br w:type="textWrapping"/>
-        <w:t xml:space="preserve">- Month-to-Month Pass, 4x+/month: approximately 65%+ off</w:t>
-        <w:br w:type="textWrapping"/>
-        <w:t xml:space="preserve">*Approved verbal framing:*</w:t>
-        <w:br w:type="textWrapping"/>
-        <w:t xml:space="preserve">- "If you come once a month on the 6-month plan, you're basically getting half off because you bring someone free."</w:t>
-        <w:br w:type="textWrapping"/>
-        <w:t xml:space="preserve">- "If you come twice a month, it more than pays for itself."</w:t>
-        <w:br w:type="textWrapping"/>
-        <w:t xml:space="preserve">- "The more you play, the more you save."</w:t>
-        <w:br w:type="textWrapping"/>
-        <w:t xml:space="preserve">Use round numbers and ranges. Do not over-calculate or itemize during the pitch.</w:t>
-        <w:br w:type="textWrapping"/>
-        <w:t xml:space="preserve">---</w:t>
-        <w:br w:type="textWrapping"/>
-        <w:t xml:space="preserve">*Handling Hesitation and Objections*</w:t>
-        <w:br w:type="textWrapping"/>
-        <w:t xml:space="preserve">*"I need to think about it."*</w:t>
-        <w:br w:type="textWrapping"/>
-        <w:t xml:space="preserve">Goal: leave the door open. Acknowledge, keep it light, offer follow-up.</w:t>
-        <w:br w:type="textWrapping"/>
-        <w:t xml:space="preserve">Track guests who ask for time and follow up the next day with the upgrade offer.</w:t>
-        <w:br w:type="textWrapping"/>
-        <w:t xml:space="preserve">Example response: "Totally fair. A lot of people like to sit with it. Want me to send you the info so you can look it over later?"</w:t>
-        <w:br w:type="textWrapping"/>
-        <w:t xml:space="preserve">*"I don't come that often."*</w:t>
-        <w:br w:type="textWrapping"/>
-        <w:t xml:space="preserve">Goal: re-anchor value. Reframe around realistic visit frequency and point to the best-fit plan.</w:t>
-        <w:br w:type="textWrapping"/>
-        <w:t xml:space="preserve">Example response: "That actually makes sense. Even coming once a month, most people find it still saves them money -- especially on the 6-month plan."</w:t>
-        <w:br w:type="textWrapping"/>
-        <w:t xml:space="preserve">*"Not today."*</w:t>
-        <w:br w:type="textWrapping"/>
-        <w:t xml:space="preserve">Goal: preserve goodwill and future conversion. Accept immediately and offer a simple next step.</w:t>
-        <w:br w:type="textWrapping"/>
-        <w:t xml:space="preserve">Example response: "No worries at all. If you want, I can send you the details so you've got them for next time."</w:t>
-        <w:br w:type="textWrapping"/>
-        <w:t xml:space="preserve">---</w:t>
-        <w:br w:type="textWrapping"/>
-        <w:t xml:space="preserve">*Outbound Outreach: Guest Follow-Up Calls*</w:t>
-        <w:br w:type="textWrapping"/>
-        <w:t xml:space="preserve">*Who to Call*</w:t>
-        <w:br w:type="textWrapping"/>
-        <w:t xml:space="preserve">- Guests from the last 90 days</w:t>
-        <w:br w:type="textWrapping"/>
-        <w:t xml:space="preserve">- Repeat players</w:t>
-        <w:br w:type="textWrapping"/>
-        <w:t xml:space="preserve">- High-spend guests</w:t>
-        <w:br w:type="textWrapping"/>
-        <w:t xml:space="preserve">*How to Prep*</w:t>
-        <w:br w:type="textWrapping"/>
-        <w:t xml:space="preserve">1. Pull the guest from the Customer Directory in Checkfront.</w:t>
-        <w:br w:type="textWrapping"/>
-        <w:t xml:space="preserve">2. Log in to Checkfront, select the Customers drop-down, and select Directory.</w:t>
-        <w:br w:type="textWrapping"/>
-        <w:t xml:space="preserve">3. Click the Bookings column to sort by highest to lowest to surface guests with the most visits.</w:t>
-        <w:br w:type="textWrapping"/>
-        <w:t xml:space="preserve">4. Note visit count and any easy personalization details.</w:t>
-        <w:br w:type="textWrapping"/>
-        <w:t xml:space="preserve">*Core Behaviors on the Call*</w:t>
-        <w:br w:type="textWrapping"/>
-        <w:t xml:space="preserve">- Use exclusive language.</w:t>
-        <w:br w:type="textWrapping"/>
-        <w:t xml:space="preserve">- Reference their visit history.</w:t>
-        <w:br w:type="textWrapping"/>
-        <w:t xml:space="preserve">- Tie the pass to savings and replay value.</w:t>
-        <w:br w:type="textWrapping"/>
-        <w:t xml:space="preserve">*End Every Call With a Next Step*</w:t>
-        <w:br w:type="textWrapping"/>
-        <w:t xml:space="preserve">- Sign up now</w:t>
-        <w:br w:type="textWrapping"/>
-        <w:t xml:space="preserve">- Send payment link</w:t>
-        <w:br w:type="textWrapping"/>
-        <w:t xml:space="preserve">- Schedule a 3-day callback</w:t>
-        <w:br w:type="textWrapping"/>
-        <w:t xml:space="preserve">*Follow-Up Rules*</w:t>
-        <w:br w:type="textWrapping"/>
-        <w:t xml:space="preserve">- Log every call.</w:t>
-        <w:br w:type="textWrapping"/>
-        <w:t xml:space="preserve">- Follow up within 3 days if the guest was unsure.</w:t>
-        <w:br w:type="textWrapping"/>
-        <w:t xml:space="preserve">- A "no" can still become a referral or a future visit.</w:t>
-        <w:br w:type="textWrapping"/>
-        <w:t xml:space="preserve">---</w:t>
-        <w:br w:type="textWrapping"/>
-        <w:t xml:space="preserve">*Follow-Up Emails*</w:t>
-        <w:br w:type="textWrapping"/>
-        <w:t xml:space="preserve">Use approved templates only. Select based on whether the pass was already pitched during their visit.</w:t>
-        <w:br w:type="textWrapping"/>
-        <w:t xml:space="preserve">Emails should:</w:t>
-        <w:br w:type="textWrapping"/>
-        <w:t xml:space="preserve">- Sound personal</w:t>
-        <w:br w:type="textWrapping"/>
-        <w:t xml:space="preserve">- Reference their visit</w:t>
-        <w:br w:type="textWrapping"/>
-        <w:t xml:space="preserve">- Include a direct store phone number</w:t>
-        <w:br w:type="textWrapping"/>
-        <w:t xml:space="preserve">- Avoid pressure language</w:t>
-        <w:br w:type="textWrapping"/>
-        <w:t xml:space="preserve">*Approved Email Template*</w:t>
-        <w:br w:type="textWrapping"/>
-        <w:t xml:space="preserve">Subject: Following Up on Your Sandbox VR Visit</w:t>
-        <w:br w:type="textWrapping"/>
-        <w:t xml:space="preserve">Body:</w:t>
-        <w:br w:type="textWrapping"/>
-        <w:t xml:space="preserve">Hi [Guest Name],</w:t>
-        <w:br w:type="textWrapping"/>
-        <w:t xml:space="preserve">It was great having you in the other day. I wanted to follow up and share the details on our Membership Pass we mentioned. A lot of guests who come back even once a month find it's a great way to save and bring friends along.</w:t>
-        <w:br w:type="textWrapping"/>
-        <w:t xml:space="preserve">If you have any questions or want help getting set up, feel free to reply here or call us directly at [Store Phone Number].</w:t>
-        <w:br w:type="textWrapping"/>
-        <w:t xml:space="preserve">Hope to see you back soon,</w:t>
-        <w:br w:type="textWrapping"/>
-        <w:t xml:space="preserve">[Your Name]</w:t>
-        <w:br w:type="textWrapping"/>
-        <w:t xml:space="preserve">---</w:t>
-        <w:br w:type="textWrapping"/>
-        <w:t xml:space="preserve">*Admin Portal Operations*</w:t>
-        <w:br w:type="textWrapping"/>
-        <w:t xml:space="preserve">*Accessing the Admin Portal*</w:t>
-        <w:br w:type="textWrapping"/>
-        <w:t xml:space="preserve">- URL: &lt;https://admin.sandboxvr.com/subscriptions|Membership Admin Portal&gt;</w:t>
-        <w:br w:type="textWrapping"/>
-        <w:t xml:space="preserve">- Bookmark this page on your store iPad Home Screen.</w:t>
-        <w:br w:type="textWrapping"/>
-        <w:t xml:space="preserve">- Password: Sandboxvr2023!</w:t>
-        <w:br w:type="textWrapping"/>
-        <w:t xml:space="preserve">- If accessing outside a store network, Cloudflare will prompt two-factor authentication (2FA) using your Sandbox VR email address. Complete 2FA, then you will be redirected to the login page.</w:t>
-        <w:br w:type="textWrapping"/>
-        <w:t xml:space="preserve">- Select Subscription in the left navigation bar.</w:t>
-        <w:br w:type="textWrapping"/>
-        <w:t xml:space="preserve">*What the Admin Portal Is Used For*</w:t>
-        <w:br w:type="textWrapping"/>
-        <w:t xml:space="preserve">- Look up Membership Passes</w:t>
-        <w:br w:type="textWrapping"/>
-        <w:t xml:space="preserve">- Run the daily membership report</w:t>
-        <w:br w:type="textWrapping"/>
-        <w:t xml:space="preserve">- Sell passes in-store</w:t>
-        <w:br w:type="textWrapping"/>
-        <w:t xml:space="preserve">- Upgrade tickets to passes</w:t>
-        <w:br w:type="textWrapping"/>
-        <w:t xml:space="preserve">---</w:t>
-        <w:br w:type="textWrapping"/>
-        <w:t xml:space="preserve">*Start of Day: Membership Report*</w:t>
-        <w:br w:type="textWrapping"/>
-        <w:t xml:space="preserve">Goal: know who is coming in on a Membership Pass for the day.</w:t>
-        <w:br w:type="textWrapping"/>
-        <w:t xml:space="preserve">1. Open the Subscription Admin Portal.</w:t>
-        <w:br w:type="textWrapping"/>
-        <w:t xml:space="preserve">2. Go to the report view.</w:t>
-        <w:br w:type="textWrapping"/>
-        <w:t xml:space="preserve">3. Select your store and date, then tap Search.</w:t>
-        <w:br w:type="textWrapping"/>
-        <w:t xml:space="preserve">4. Review booking codes and details.</w:t>
-        <w:br w:type="textWrapping"/>
-        <w:t xml:space="preserve">5. Re-check the report throughout the day as new bookings may appear.</w:t>
-        <w:br w:type="textWrapping"/>
-        <w:t xml:space="preserve">---</w:t>
-        <w:br w:type="textWrapping"/>
-        <w:t xml:space="preserve">*Look Up a Pass*</w:t>
-        <w:br w:type="textWrapping"/>
-        <w:t xml:space="preserve">Use when a guest calls or walks in saying they have a pass.</w:t>
-        <w:br w:type="textWrapping"/>
-        <w:t xml:space="preserve">1. Select Search Subscription.</w:t>
-        <w:br w:type="textWrapping"/>
-        <w:t xml:space="preserve">2. Enter the email address used to purchase the pass. Note: emails are case sensitive -- type exactly as entered at purchase.</w:t>
-        <w:br w:type="textWrapping"/>
-        <w:t xml:space="preserve">3. Review the following details:</w:t>
-        <w:br w:type="textWrapping"/>
-        <w:t xml:space="preserve">   - Pass Owner's Full Name and Email</w:t>
-        <w:br w:type="textWrapping"/>
-        <w:t xml:space="preserve">   - Membership Plan (sp1m = 1-Month Subscription; sp6m = 6-Month Subscription)</w:t>
-        <w:br w:type="textWrapping"/>
-        <w:t xml:space="preserve">   - Plan Status (Valid or Expired; Gift or Purchased)</w:t>
-        <w:br w:type="textWrapping"/>
-        <w:t xml:space="preserve">   - Auto Renewal status</w:t>
-        <w:br w:type="textWrapping"/>
-        <w:t xml:space="preserve">   - Billing Cycle Information</w:t>
-        <w:br w:type="textWrapping"/>
-        <w:t xml:space="preserve">   - Home Location</w:t>
-        <w:br w:type="textWrapping"/>
-        <w:t xml:space="preserve">   - Bookings associated with the pass</w:t>
-        <w:br w:type="textWrapping"/>
-        <w:t xml:space="preserve">*If No Results Appear*</w:t>
-        <w:br w:type="textWrapping"/>
-        <w:t xml:space="preserve">- Confirm email spelling (case sensitive).</w:t>
-        <w:br w:type="textWrapping"/>
-        <w:t xml:space="preserve">- If correct and still no results, escalate to Guest Services.</w:t>
-        <w:br w:type="textWrapping"/>
-        <w:t xml:space="preserve">---</w:t>
-        <w:br w:type="textWrapping"/>
-        <w:t xml:space="preserve">*Sell a Pass In-Store*</w:t>
-        <w:br w:type="textWrapping"/>
-        <w:t xml:space="preserve">1. Open the Subscription Admin Portal.</w:t>
-        <w:br w:type="textWrapping"/>
-        <w:t xml:space="preserve">2. Select Purchase Pass.</w:t>
-        <w:br w:type="textWrapping"/>
-        <w:t xml:space="preserve">3. Select Store.</w:t>
-        <w:br w:type="textWrapping"/>
-        <w:t xml:space="preserve">4. Select Membership Plan.</w:t>
-        <w:br w:type="textWrapping"/>
-        <w:t xml:space="preserve">5. Choose payment method:</w:t>
-        <w:br w:type="textWrapping"/>
-        <w:t xml:space="preserve">   - Card Entry: enter card details manually (no tap-to-pay).</w:t>
-        <w:br w:type="textWrapping"/>
-        <w:t xml:space="preserve">   - QR Code: guest completes payment on their own device (single-use only).</w:t>
-        <w:br w:type="textWrapping"/>
-        <w:t xml:space="preserve">   - Payment Link: send to guest for later completion.</w:t>
-        <w:br w:type="textWrapping"/>
-        <w:t xml:space="preserve">6. Acknowledgment Check: the guest must check each box in the acknowledgment and select "Accept" before the purchase is complete. This confirms they understand the terms and reduces early termination requests.</w:t>
-        <w:br w:type="textWrapping"/>
-        <w:t xml:space="preserve">---</w:t>
-        <w:br w:type="textWrapping"/>
-        <w:t xml:space="preserve">*Upgrade a Ticket to a Pass*</w:t>
-        <w:br w:type="textWrapping"/>
-        <w:t xml:space="preserve">Guests can upgrade their session booking to a 6-Month Membership Pass within 48 hours of their session. Month-to-month upgrades are not available.</w:t>
-        <w:br w:type="textWrapping"/>
-        <w:t xml:space="preserve">Guest pays the difference for the first month of the membership.</w:t>
-        <w:br w:type="textWrapping"/>
-        <w:t xml:space="preserve">Steps:</w:t>
-        <w:br w:type="textWrapping"/>
-        <w:t xml:space="preserve">1. Select Upgrade Pass.</w:t>
-        <w:br w:type="textWrapping"/>
-        <w:t xml:space="preserve">2. Enter the Booking ID (found on the invoice in Checkfront).</w:t>
-        <w:br w:type="textWrapping"/>
-        <w:t xml:space="preserve">3. Press Search.</w:t>
-        <w:br w:type="textWrapping"/>
-        <w:t xml:space="preserve">4. Review Ticket Price Per Guest and Available Upgrades on the right side, then press Next.</w:t>
-        <w:br w:type="textWrapping"/>
-        <w:t xml:space="preserve">5. The checkout screen shows the final amount due for the first month. Confirm and press Generate Payment Link.</w:t>
-        <w:br w:type="textWrapping"/>
-        <w:t xml:space="preserve">6. The guest completes Personal Details and Payment Method for their Membership Pass.</w:t>
-        <w:br w:type="textWrapping"/>
-        <w:t xml:space="preserve">   - Personal details are how the membership is searched and tracked. Ensure the guest uses their primary email address.</w:t>
-        <w:br w:type="textWrapping"/>
-        <w:t xml:space="preserve">7. Only one guest can complete an upgrade at a time. If additional guests want to upgrade, restart from Step 1 for each guest.</w:t>
-        <w:br w:type="textWrapping"/>
-        <w:t xml:space="preserve">8. After paying, the guest receives a digital receipt on the iPad and a confirmation email.</w:t>
-        <w:br w:type="textWrapping"/>
-        <w:t xml:space="preserve">---</w:t>
-        <w:br w:type="textWrapping"/>
-        <w:t xml:space="preserve">*Check-In and Pass Verification*</w:t>
-        <w:br w:type="textWrapping"/>
-        <w:t xml:space="preserve">*ID Verification*</w:t>
-        <w:br w:type="textWrapping"/>
-        <w:t xml:space="preserve">A valid ID is required for all Membership Pass sessions and must be presented at check-in by the member.</w:t>
-        <w:br w:type="textWrapping"/>
-        <w:t xml:space="preserve">Steps:</w:t>
-        <w:br w:type="textWrapping"/>
-        <w:t xml:space="preserve">1. Ask the guest to present their ID when they arrive.</w:t>
-        <w:br w:type="textWrapping"/>
-        <w:t xml:space="preserve">2. Match the ID name to the Membership Pass.</w:t>
-        <w:br w:type="textWrapping"/>
-        <w:t xml:space="preserve">3. Example framing: "Hey [Guest Name], welcome in! I see you've got your Membership Pass with us. Can I grab your ID real quick just to confirm your membership? It only takes a second and we do this for all members."</w:t>
-        <w:br w:type="textWrapping"/>
-        <w:t xml:space="preserve">4. Confirm Bring-a-Guest details if applicable.</w:t>
-        <w:br w:type="textWrapping"/>
-        <w:t xml:space="preserve">5. Add "ID Verified" to the invoice notes.</w:t>
-        <w:br w:type="textWrapping"/>
-        <w:t xml:space="preserve">6. Add any additional notes as needed.</w:t>
-        <w:br w:type="textWrapping"/>
-        <w:t xml:space="preserve">*If the Guest Forgot Their ID*</w:t>
-        <w:br w:type="textWrapping"/>
-        <w:t xml:space="preserve">Example framing: "No worries! Normally we do need to verify ID for all passes. Let me see what I can do. If you have an alternate picture ID or your payment card with your name on the pass, we can try to verify that instead."</w:t>
-        <w:br w:type="textWrapping"/>
-        <w:t xml:space="preserve">Try in order:</w:t>
-        <w:br w:type="textWrapping"/>
-        <w:t xml:space="preserve">1. Secondary photo ID</w:t>
-        <w:br w:type="textWrapping"/>
-        <w:t xml:space="preserve">2. Verify with the name of a payment card (debit or credit) on the invoice</w:t>
-        <w:br w:type="textWrapping"/>
-        <w:t xml:space="preserve">Once verified, document the verification method in the invoice notes.</w:t>
-        <w:br w:type="textWrapping"/>
-        <w:t xml:space="preserve">---</w:t>
-        <w:br w:type="textWrapping"/>
-        <w:t xml:space="preserve">*Edge Cases and Special Scenarios*</w:t>
-        <w:br w:type="textWrapping"/>
-        <w:t xml:space="preserve">For any of the situations listed below, or anything that falls outside normal operations, escalate to Guest Services for resolution and next steps.</w:t>
-        <w:br w:type="textWrapping"/>
-        <w:t xml:space="preserve">- Multiple passes on one email</w:t>
-        <w:br w:type="textWrapping"/>
-        <w:t xml:space="preserve">- Gifted passes</w:t>
-        <w:br w:type="textWrapping"/>
-        <w:t xml:space="preserve">- Corporate purchases</w:t>
-        <w:br w:type="textWrapping"/>
-        <w:t xml:space="preserve">- Expired or invalid passes</w:t>
-        <w:br w:type="textWrapping"/>
-        <w:t xml:space="preserve">Do not attempt to resolve these in-store without Guest Services involvement.</w:t>
-        <w:br w:type="textWrapping"/>
-        <w:t xml:space="preserve">---</w:t>
-        <w:br w:type="textWrapping"/>
-        <w:t xml:space="preserve">*Staff FAQs*</w:t>
-        <w:br w:type="textWrapping"/>
-        <w:t xml:space="preserve">*Q: What's included with the Unlimited Weekday Play Membership Pass?*</w:t>
-        <w:br w:type="textWrapping"/>
-        <w:t xml:space="preserve">A: Unlimited VR play Monday through Friday at the guest's Home Location. Guests can have up to two active bookings at a time. The 6-month plan includes bringing one Guest for free per session, subject to availability.</w:t>
-        <w:br w:type="textWrapping"/>
-        <w:t xml:space="preserve">*Q: How much does the Membership Pass cost?*</w:t>
-        <w:br w:type="textWrapping"/>
-        <w:t xml:space="preserve">A: $54.99 per month plus tax with a 6-month commitment. After 6 months, it renews month-to-month unless canceled. The month-to-month plan is $74.99 per month with no commitment.</w:t>
-        <w:br w:type="textWrapping"/>
-        <w:t xml:space="preserve">*Q: When does billing start?*</w:t>
-        <w:br w:type="textWrapping"/>
-        <w:t xml:space="preserve">A: Billing starts at purchase. If a guest upgrades from a ticket, the first charge may be reduced based on the ticket value applied.</w:t>
-        <w:br w:type="textWrapping"/>
-        <w:t xml:space="preserve">*Q: Can guests cancel their Membership Pass?*</w:t>
-        <w:br w:type="textWrapping"/>
-        <w:t xml:space="preserve">A: Yes. Guests can submit a cancellation request at any time. The membership remains active through the end of the current billing period.</w:t>
-        <w:br w:type="textWrapping"/>
-        <w:t xml:space="preserve">*Q: How do guests cancel?*</w:t>
-        <w:br w:type="textWrapping"/>
-        <w:t xml:space="preserve">A: Guests cancel using the cancellation link in their confirmation email or the online cancellation portal. If they cannot find it, direct them to Guest Services.</w:t>
-        <w:br w:type="textWrapping"/>
-        <w:t xml:space="preserve">*Q: Will guests get a renewal reminder?*</w:t>
-        <w:br w:type="textWrapping"/>
-        <w:t xml:space="preserve">A: Yes. Guests receive an email reminder at least 30 days before renewal after the 6-month term ends.</w:t>
-        <w:br w:type="textWrapping"/>
-        <w:t xml:space="preserve">*Q: What days can the pass be used?*</w:t>
-        <w:br w:type="textWrapping"/>
-        <w:t xml:space="preserve">A: Monday through Friday only. Weekends, holidays, and blackout dates are not included.</w:t>
-        <w:br w:type="textWrapping"/>
-        <w:t xml:space="preserve">*Q: Can guests use the pass at other locations?*</w:t>
-        <w:br w:type="textWrapping"/>
-        <w:t xml:space="preserve">A: No. The pass is only valid at the guest's Home Location. It cannot be shared or transferred.</w:t>
-        <w:br w:type="textWrapping"/>
-        <w:t xml:space="preserve">*Q: How many bookings can a guest have at once?*</w:t>
-        <w:br w:type="textWrapping"/>
-        <w:t xml:space="preserve">A: Up to two active bookings at a time.</w:t>
-        <w:br w:type="textWrapping"/>
-        <w:t xml:space="preserve">*Q: How do guests book using their pass?*</w:t>
-        <w:br w:type="textWrapping"/>
-        <w:t xml:space="preserve">A: Guests book online using the same email address tied to their Membership Pass.</w:t>
-        <w:br w:type="textWrapping"/>
-        <w:t xml:space="preserve">*Q: Can a guest play alone?*</w:t>
-        <w:br w:type="textWrapping"/>
-        <w:t xml:space="preserve">A: Single players can join public sessions only. Private sessions require at least one additional paid ticket.</w:t>
-        <w:br w:type="textWrapping"/>
-        <w:t xml:space="preserve">*Q: What does "Bring a Guest for Free" mean?*</w:t>
-        <w:br w:type="textWrapping"/>
-        <w:t xml:space="preserve">A: On the 6-month plan, the member can bring one additional guest for free on weekday sessions at their Home Location.</w:t>
-        <w:br w:type="textWrapping"/>
-        <w:t xml:space="preserve">*Q: What if a guest says their pass isn't working?*</w:t>
-        <w:br w:type="textWrapping"/>
-        <w:t xml:space="preserve">A: Look up the pass in the Admin Portal using their email address. Confirm the plan status and home location. If the pass is active and still not working, escalate to Guest Services.</w:t>
-        <w:br w:type="textWrapping"/>
-        <w:t xml:space="preserve">---</w:t>
-        <w:br w:type="textWrapping"/>
-        <w:t xml:space="preserve">*Tracking and Feedback*</w:t>
-        <w:br w:type="textWrapping"/>
-        <w:t xml:space="preserve">- Log all membership-related calls and follow-ups daily.</w:t>
-        <w:br w:type="textWrapping"/>
-        <w:t xml:space="preserve">- Track guests who asked for time to consider and follow up within 3 days.</w:t>
-        <w:br w:type="textWrapping"/>
-        <w:t xml:space="preserve">---</w:t>
-        <w:br w:type="textWrapping"/>
-        <w:t xml:space="preserve">*DO NOT Rules*</w:t>
-        <w:br w:type="textWrapping"/>
-        <w:t xml:space="preserve">- Do not confirm whether a specific store has the Membership Pass. Always direct the team member to their Ops Leader to verify enrollment.</w:t>
-        <w:br w:type="textWrapping"/>
-        <w:t xml:space="preserve">- Do not lead with constraints (weekdays only, home location only). Present the benefits first.</w:t>
-        <w:br w:type="textWrapping"/>
-        <w:t xml:space="preserve">- Do not offer or describe a month-to-month upgrade path -- it does not exist.</w:t>
-        <w:br w:type="textWrapping"/>
-        <w:t xml:space="preserve">- Do not allow a guest to use a pass at a non-home location.</w:t>
-        <w:br w:type="textWrapping"/>
-        <w:t xml:space="preserve">- Do not skip ID verification at check-in for any reason.</w:t>
-        <w:br w:type="textWrapping"/>
-        <w:t xml:space="preserve">- Do not attempt to resolve edge cases (gifted passes, expired passes, corporate purchases, multiple passes on one email) in-store. Always escalate to Guest Services.</w:t>
-        <w:br w:type="textWrapping"/>
-        <w:t xml:space="preserve">- Do not share the Admin Portal password in public Slack channels or with guests.</w:t>
-        <w:br w:type="textWrapping"/>
-        <w:t xml:space="preserve">- Do not use the QR code payment method more than once per transaction -- it is single-use only.</w:t>
-        <w:br w:type="textWrapping"/>
-        <w:t xml:space="preserve">- Do not guess on billing, renewal, or cancellation terms not listed here. Direct guests to Guest Services or their confirmation email.</w:t>
-        <w:br w:type="textWrapping"/>
-        <w:t xml:space="preserve">---</w:t>
-        <w:br w:type="textWrapping"/>
-        <w:t xml:space="preserve">*Escalation*</w:t>
-        <w:br w:type="textWrapping"/>
-        <w:t xml:space="preserve">- Guest-facing membership issues (expired pass, wrong location, pass not found): escalate to Guest Services</w:t>
-        <w:br w:type="textWrapping"/>
-        <w:t xml:space="preserve">- In-store selling support or edge cases: escalate to Ops Leader</w:t>
-        <w:br w:type="textWrapping"/>
-        <w:t xml:space="preserve">- Admin Portal login issues: confirm 2FA is completed; if issue persists, escalate to Ops Leader</w:t>
-        <w:br w:type="textWrapping"/>
-        <w:t xml:space="preserve">---</w:t>
-        <w:br w:type="textWrapping"/>
-        <w:t xml:space="preserve">*Trigger Phrases*</w:t>
-        <w:br w:type="textWrapping"/>
-        <w:t xml:space="preserve">- membership pass</w:t>
-        <w:br w:type="textWrapping"/>
-        <w:t xml:space="preserve">- membership pricing</w:t>
-        <w:br w:type="textWrapping"/>
-        <w:t xml:space="preserve">- how much is a membership</w:t>
-        <w:br w:type="textWrapping"/>
-        <w:t xml:space="preserve">- 6-month plan</w:t>
-        <w:br w:type="textWrapping"/>
-        <w:t xml:space="preserve">- month-to-month membership</w:t>
-        <w:br w:type="textWrapping"/>
-        <w:t xml:space="preserve">- unlimited weekday play</w:t>
-        <w:br w:type="textWrapping"/>
-        <w:t xml:space="preserve">- bring a guest free</w:t>
-        <w:br w:type="textWrapping"/>
-        <w:t xml:space="preserve">- sell a membership pass</w:t>
-        <w:br w:type="textWrapping"/>
-        <w:t xml:space="preserve">- how to pitch the membership</w:t>
-        <w:br w:type="textWrapping"/>
-        <w:t xml:space="preserve">- membership objection</w:t>
-        <w:br w:type="textWrapping"/>
-        <w:t xml:space="preserve">- guest said not today membership</w:t>
-        <w:br w:type="textWrapping"/>
-        <w:t xml:space="preserve">- guest follow-up call membership</w:t>
-        <w:br w:type="textWrapping"/>
-        <w:t xml:space="preserve">- membership outreach</w:t>
-        <w:br w:type="textWrapping"/>
-        <w:t xml:space="preserve">- upgrade ticket to membership</w:t>
-        <w:br w:type="textWrapping"/>
-        <w:t xml:space="preserve">- same-day upgrade membership</w:t>
-        <w:br w:type="textWrapping"/>
-        <w:t xml:space="preserve">- Admin Portal membership</w:t>
-        <w:br w:type="textWrapping"/>
-        <w:t xml:space="preserve">- look up a pass</w:t>
-        <w:br w:type="textWrapping"/>
-        <w:t xml:space="preserve">- how to sell a pass in store</w:t>
-        <w:br w:type="textWrapping"/>
-        <w:t xml:space="preserve">- membership check-in</w:t>
-        <w:br w:type="textWrapping"/>
-        <w:t xml:space="preserve">- ID verification membership</w:t>
-        <w:br w:type="textWrapping"/>
-        <w:t xml:space="preserve">- guest forgot ID membership</w:t>
-        <w:br w:type="textWrapping"/>
-        <w:t xml:space="preserve">- membership pass not working</w:t>
-        <w:br w:type="textWrapping"/>
-        <w:t xml:space="preserve">- expired pass</w:t>
-        <w:br w:type="textWrapping"/>
-        <w:t xml:space="preserve">- gifted pass</w:t>
-        <w:br w:type="textWrapping"/>
-        <w:t xml:space="preserve">- corporate membership</w:t>
-        <w:br w:type="textWrapping"/>
-        <w:t xml:space="preserve">- multiple passes one email</w:t>
-        <w:br w:type="textWrapping"/>
-        <w:t xml:space="preserve">- membership staff FAQ</w:t>
-        <w:br w:type="textWrapping"/>
-        <w:t xml:space="preserve">- when does membership billing start</w:t>
-        <w:br w:type="textWrapping"/>
-        <w:t xml:space="preserve">- how to cancel membership</w:t>
-        <w:br w:type="textWrapping"/>
-        <w:t xml:space="preserve">- can guests use pass at other locations</w:t>
-        <w:br w:type="textWrapping"/>
-        <w:t xml:space="preserve">- Admin Portal password</w:t>
-        <w:br w:type="textWrapping"/>
-        <w:t xml:space="preserve">- sp6m</w:t>
-        <w:br w:type="textWrapping"/>
-        <w:t xml:space="preserve">- sp1m</w:t>
-        <w:br w:type="textWrapping"/>
-        <w:t xml:space="preserve">---</w:t>
-        <w:br w:type="textWrapping"/>
-        <w:t xml:space="preserve">*Exclusions*</w:t>
-        <w:br w:type="textWrapping"/>
-        <w:t xml:space="preserve">- Do not use this file for standard single-session bookings with no membership component.</w:t>
-        <w:br w:type="textWrapping"/>
-        <w:t xml:space="preserve">- Do not use this file for event package pricing or group bookings (use file 36).</w:t>
-        <w:br w:type="textWrapping"/>
-        <w:t xml:space="preserve">- Do not use this file for general cancellation or refund policy for non-members (use file 08 or 09).</w:t>
-        <w:br w:type="textWrapping"/>
-        <w:t xml:space="preserve">- Do not improvise billing terms, blackout date lists, or cancellation timelines not documented here.</w:t>
-        <w:br w:type="textWrapping"/>
-        <w:t xml:space="preserve">---</w:t>
-        <w:br w:type="textWrapping"/>
-        <w:t xml:space="preserve">*Example Response Patterns*</w:t>
-        <w:br w:type="textWrapping"/>
-        <w:t xml:space="preserve">- "The Membership Pass gives guests unlimited weekday play at their Home Location. The 6-month plan is $54.99/month and includes bringing a Guest for free. The month-to-month plan is $74.99/month with no commitment."</w:t>
-        <w:br w:type="textWrapping"/>
-        <w:t xml:space="preserve">- "The best time to pitch the pass is right after the experience -- that's when excitement is highest and the pitch feels natural rather than like an upsell."</w:t>
-        <w:br w:type="textWrapping"/>
-        <w:t xml:space="preserve">- "To upgrade a ticket to a 6-month pass, go to the Admin Portal, select Upgrade Pass, enter the Booking ID from Checkfront, and follow the checkout flow. The guest pays the difference for the first month. Only the 6-month plan is available as an upgrade."</w:t>
-        <w:br w:type="textWrapping"/>
-        <w:t xml:space="preserve">- "To look up a pass, go to the Admin Portal, select Search Subscription, and enter the email used at purchase. Emails are case sensitive."</w:t>
-        <w:br w:type="textWrapping"/>
-        <w:t xml:space="preserve">- "ID verification is required at every Membership Pass check-in. If the guest forgot their ID, try a secondary photo ID or match the name on a payment card on the invoice. Document the verification method in the invoice notes."</w:t>
-        <w:br w:type="textWrapping"/>
-        <w:t xml:space="preserve">- "For edge cases like gifted passes, expired passes, or corporate purchases, escalate to Guest Services. Do not try to resolve these in-store."</w:t>
-      </w:r>
-    </w:p>
-    <w:p>
-      <w:pPr>
-        <w:pStyle w:val="Heading2"/>
-        <w:rPr>
-          <w:rFonts w:ascii="Proxima Nova" w:cs="Proxima Nova" w:eastAsia="Proxima Nova" w:hAnsi="Proxima Nova"/>
-        </w:rPr>
-      </w:pPr>
-      <w:r>
-        <w:rPr>
-          <w:rFonts w:ascii="Proxima Nova" w:cs="Proxima Nova" w:eastAsia="Proxima Nova" w:hAnsi="Proxima Nova"/>
-          <w:rtl w:val="0"/>
-        </w:rPr>
-        <w:t xml:space="preserve"> 82 OPERATIONS  FRANCHISE INQUIRY</w:t>
-      </w:r>
-    </w:p>
-    <w:p>
-      <w:pPr>
-        <w:rPr>
-          <w:rFonts w:ascii="Proxima Nova" w:cs="Proxima Nova" w:eastAsia="Proxima Nova" w:hAnsi="Proxima Nova"/>
-        </w:rPr>
-      </w:pPr>
-      <w:r>
-        <w:rPr>
-          <w:rFonts w:ascii="Proxima Nova" w:cs="Proxima Nova" w:eastAsia="Proxima Nova" w:hAnsi="Proxima Nova"/>
-          <w:rtl w:val="0"/>
-        </w:rPr>
-        <w:t xml:space="preserve">*82_OPERATIONS__FRANCHISE_INQUIRY*</w:t>
-        <w:br w:type="textWrapping"/>
-        <w:t xml:space="preserve">*Category:* OPERATIONS</w:t>
-        <w:br w:type="textWrapping"/>
-        <w:t xml:space="preserve">*Franchise Brochure:* &lt;https://sandboxvr.my.canva.site/website-franchise-brochure|Sandbox VR Franchise Brochure&gt;</w:t>
-        <w:br w:type="textWrapping"/>
-        <w:t xml:space="preserve">*Franchise Website:* &lt;https://franchise.sandboxvr.com|franchise.sandboxvr.com&gt;</w:t>
-        <w:br w:type="textWrapping"/>
-        <w:t xml:space="preserve">---</w:t>
-        <w:br w:type="textWrapping"/>
-        <w:t xml:space="preserve">---</w:t>
-        <w:br w:type="textWrapping"/>
-        <w:t xml:space="preserve">*Purpose*</w:t>
-        <w:br w:type="textWrapping"/>
-        <w:t xml:space="preserve">This file defines how Apollo should respond when a guest, team member, or store operator asks about franchising with Sandbox VR. It covers what franchising looks like, who it is for, what support is provided, how the process works, and where to direct interested parties.</w:t>
-        <w:br w:type="textWrapping"/>
-        <w:t xml:space="preserve">---</w:t>
-        <w:br w:type="textWrapping"/>
-        <w:t xml:space="preserve">---</w:t>
-        <w:br w:type="textWrapping"/>
-        <w:t xml:space="preserve">---</w:t>
-        <w:br w:type="textWrapping"/>
-        <w:t xml:space="preserve">*What Sandbox VR Is*</w:t>
-        <w:br w:type="textWrapping"/>
-        <w:t xml:space="preserve">Sandbox VR is a global leader in virtual reality location-based entertainment. Using a proprietary, patented IMMERSION platform, it offers socially immersive full-body VR experiences in premium retail locations.</w:t>
-        <w:br w:type="textWrapping"/>
-        <w:t xml:space="preserve">Guests spend an average of $50 per ticket. The primary demographic is millennials ages 25-34, which makes up approximately 40% of guests, with a nearly even male-to-female ratio. Sandbox VR holds an NPS of 80 with over 20,000 five-star reviews.</w:t>
-        <w:br w:type="textWrapping"/>
-        <w:t xml:space="preserve">---</w:t>
-        <w:br w:type="textWrapping"/>
-        <w:t xml:space="preserve">*Who Franchise Opportunities Are For*</w:t>
-        <w:br w:type="textWrapping"/>
-        <w:t xml:space="preserve">Sandbox VR is seeking franchise partners including:</w:t>
-        <w:br w:type="textWrapping"/>
-        <w:t xml:space="preserve">- Entrepreneurs</w:t>
-        <w:br w:type="textWrapping"/>
-        <w:t xml:space="preserve">- Retail and hospitality groups</w:t>
-        <w:br w:type="textWrapping"/>
-        <w:t xml:space="preserve">- Established brand operators</w:t>
-        <w:br w:type="textWrapping"/>
-        <w:t xml:space="preserve">Sandbox VR's goal is to have a location in every neighborhood. The company is actively expanding across the US, Canada, Europe, Asia, and new international markets, and franchise operators are central to making that happen.</w:t>
-        <w:br w:type="textWrapping"/>
-        <w:t xml:space="preserve">Ideal locations range from big malls to downtown streets to suburban neighborhoods.</w:t>
-        <w:br w:type="textWrapping"/>
-        <w:t xml:space="preserve">---</w:t>
-        <w:br w:type="textWrapping"/>
-        <w:t xml:space="preserve">*Global Footprint*</w:t>
-        <w:br w:type="textWrapping"/>
-        <w:t xml:space="preserve">Sandbox VR has locations across the US, Canada, Europe, Asia, the Middle East, and Australia -- and is opening new stores regularly. For the current full list of locations, visit &lt;https://www.sandboxvr.com|sandboxvr.com&gt;.</w:t>
-        <w:br w:type="textWrapping"/>
-        <w:t xml:space="preserve">For specific store addresses, phone numbers, and hours, see File 84 (Store Locations Directory) or direct guests to &lt;https://www.sandboxvr.com|sandboxvr.com&gt;.</w:t>
-        <w:br w:type="textWrapping"/>
-        <w:t xml:space="preserve">---</w:t>
-        <w:br w:type="textWrapping"/>
-        <w:t xml:space="preserve">*What Franchise Operators Get*</w:t>
-        <w:br w:type="textWrapping"/>
-        <w:t xml:space="preserve">*Content and Experiences*</w:t>
-        <w:br w:type="textWrapping"/>
-        <w:t xml:space="preserve">Sandbox VR has three internal studios developing new content continuously for franchise owners. Content development is led by Michael Hampden, a lead designer of Assassin's Creed and some of the largest-budget VR titles in the world.</w:t>
-        <w:br w:type="textWrapping"/>
-        <w:t xml:space="preserve">Franchise operators currently have access to eight thrilling experiences developed in-house by AAA gaming veterans. As the Sandbox network grows, an ecosystem of third-party developers will be published through Sandbox VR, expanding the experience library further.</w:t>
-        <w:br w:type="textWrapping"/>
-        <w:t xml:space="preserve">Operators will always receive the latest technology, the latest haptics, and the latest experiences -- Sandbox VR is a living, evolving product, not a static one.</w:t>
-        <w:br w:type="textWrapping"/>
-        <w:t xml:space="preserve">*Support*</w:t>
-        <w:br w:type="textWrapping"/>
-        <w:t xml:space="preserve">Franchise operators receive a full winning roadmap covering:</w:t>
-        <w:br w:type="textWrapping"/>
-        <w:t xml:space="preserve">- Site selection</w:t>
-        <w:br w:type="textWrapping"/>
-        <w:t xml:space="preserve">- Design and construction</w:t>
-        <w:br w:type="textWrapping"/>
-        <w:t xml:space="preserve">- Technical support (24/7)</w:t>
-        <w:br w:type="textWrapping"/>
-        <w:t xml:space="preserve">- Training</w:t>
-        <w:br w:type="textWrapping"/>
-        <w:t xml:space="preserve">- Marketing support (online marketing, digital tools, shareable highlight videos)</w:t>
-        <w:br w:type="textWrapping"/>
-        <w:t xml:space="preserve">- Ongoing performance measurement -- Sandbox VR helps operators understand which experiences resonate with their customers</w:t>
-        <w:br w:type="textWrapping"/>
-        <w:t xml:space="preserve">Support comes from a global team of over 500 professionals. If a franchise operator has a question about anything, the support team is available around the clock to answer it.</w:t>
-        <w:br w:type="textWrapping"/>
-        <w:t xml:space="preserve">*Brand Value*</w:t>
-        <w:br w:type="textWrapping"/>
-        <w:t xml:space="preserve">As Sandbox VR expands globally, brand awareness grows with it. Every new location benefits from the word of mouth and brand equity built by every other Sandbox VR location in the world.</w:t>
-        <w:br w:type="textWrapping"/>
-        <w:t xml:space="preserve">*The Playbook*</w:t>
-        <w:br w:type="textWrapping"/>
-        <w:t xml:space="preserve">The franchise model is built around three pillars:</w:t>
-        <w:br w:type="textWrapping"/>
-        <w:t xml:space="preserve">1. Attracting the target audience through digital marketing</w:t>
-        <w:br w:type="textWrapping"/>
-        <w:t xml:space="preserve">2. Amplifying the experience with shareable proprietary highlight videos</w:t>
-        <w:br w:type="textWrapping"/>
-        <w:t xml:space="preserve">3. Retaining guests through replayable game features and leaderboards</w:t>
-        <w:br w:type="textWrapping"/>
-        <w:t xml:space="preserve">---</w:t>
-        <w:br w:type="textWrapping"/>
-        <w:t xml:space="preserve">*Franchise Roadmap*</w:t>
-        <w:br w:type="textWrapping"/>
-        <w:t xml:space="preserve">The process to become a franchise operator:</w:t>
-        <w:br w:type="textWrapping"/>
-        <w:t xml:space="preserve">1. Complete the inquiry form at &lt;https://franchise.sandboxvr.com|franchise.sandboxvr.com&gt; or email &lt;mailto:Franchise@sandboxvr.com|Franchise@sandboxvr.com&gt;</w:t>
-        <w:br w:type="textWrapping"/>
-        <w:t xml:space="preserve">2. Introductory video meeting with a Franchise Account Executive</w:t>
-        <w:br w:type="textWrapping"/>
-        <w:t xml:space="preserve">3. Review the Franchise Disclosure Document (FDD) and conduct due diligence</w:t>
-        <w:br w:type="textWrapping"/>
-        <w:t xml:space="preserve">4. Attend a Discovery Day to try the experience and meet the team</w:t>
-        <w:br w:type="textWrapping"/>
-        <w:t xml:space="preserve">5. Sign the Franchise Agreement</w:t>
-        <w:br w:type="textWrapping"/>
-        <w:t xml:space="preserve">6. Participate in training and pre-opening project management</w:t>
-        <w:br w:type="textWrapping"/>
-        <w:t xml:space="preserve">7. Store fit-out and launch</w:t>
-        <w:br w:type="textWrapping"/>
-        <w:t xml:space="preserve">---</w:t>
-        <w:br w:type="textWrapping"/>
-        <w:t xml:space="preserve">*How to Respond to an Interested Guest or Team Member*</w:t>
-        <w:br w:type="textWrapping"/>
-        <w:t xml:space="preserve">When a guest or team member asks about franchising, respond warmly and direct them to the right resources. Do not attempt to qualify them, estimate costs, or make promises about market availability.</w:t>
-        <w:br w:type="textWrapping"/>
-        <w:t xml:space="preserve">A good response covers:</w:t>
-        <w:br w:type="textWrapping"/>
-        <w:t xml:space="preserve">- A brief, excited description of what Sandbox VR is and why the franchise opportunity is compelling</w:t>
-        <w:br w:type="textWrapping"/>
-        <w:t xml:space="preserve">- The key support pillars (24/7 support, content pipeline, brand value, the playbook)</w:t>
-        <w:br w:type="textWrapping"/>
-        <w:t xml:space="preserve">- The franchise website and email as the next step</w:t>
-        <w:br w:type="textWrapping"/>
-        <w:t xml:space="preserve">*Example response framing:*</w:t>
-        <w:br w:type="textWrapping"/>
-        <w:t xml:space="preserve">"Sandbox VR franchise opportunities are open to entrepreneurs, retail groups, and established operators. Franchise owners get access to our full content library, 24/7 support, and a proven playbook for attracting and retaining guests. The best next step is to visit &lt;https://franchise.sandboxvr.com|franchise.sandboxvr.com&gt; or reach out directly at &lt;mailto:Franchise@sandboxvr.com|Franchise@sandboxvr.com&gt; -- the team will walk you through everything from there."</w:t>
-        <w:br w:type="textWrapping"/>
-        <w:t xml:space="preserve">---</w:t>
-        <w:br w:type="textWrapping"/>
-        <w:t xml:space="preserve">*DO NOT Rules*</w:t>
-        <w:br w:type="textWrapping"/>
-        <w:t xml:space="preserve">- Do not speculate on investment amounts, build costs, royalty fees, or financial requirements. Direct to the franchise team.</w:t>
-        <w:br w:type="textWrapping"/>
-        <w:t xml:space="preserve">- Do not promise availability in a specific city, region, or country.</w:t>
-        <w:br w:type="textWrapping"/>
-        <w:t xml:space="preserve">- Do not attempt to complete or process a franchise inquiry in-store or through Apollo.</w:t>
-        <w:br w:type="textWrapping"/>
-        <w:t xml:space="preserve">- Do not use this file for standard guest booking or policy questions.</w:t>
-        <w:br w:type="textWrapping"/>
-        <w:t xml:space="preserve">---</w:t>
-        <w:br w:type="textWrapping"/>
-        <w:t xml:space="preserve">*Escalation*</w:t>
-        <w:br w:type="textWrapping"/>
-        <w:t xml:space="preserve">All franchise interest should be directed externally:</w:t>
-        <w:br w:type="textWrapping"/>
-        <w:t xml:space="preserve">- *Franchise website:* &lt;https://franchise.sandboxvr.com|franchise.sandboxvr.com&gt;</w:t>
-        <w:br w:type="textWrapping"/>
-        <w:t xml:space="preserve">- *Franchise email:* &lt;mailto:Franchise@sandboxvr.com|Franchise@sandboxvr.com&gt;</w:t>
-        <w:br w:type="textWrapping"/>
-        <w:t xml:space="preserve">- *Franchise brochure:* &lt;https://sandboxvr.my.canva.site/website-franchise-brochure|Sandbox VR Franchise Brochure&gt;</w:t>
-        <w:br w:type="textWrapping"/>
-        <w:t xml:space="preserve">If a team member is asking on behalf of a guest who expressed interest in owning a location, give them the above resources to pass along.</w:t>
-        <w:br w:type="textWrapping"/>
-        <w:t xml:space="preserve">---</w:t>
-        <w:br w:type="textWrapping"/>
-        <w:t xml:space="preserve">*Trigger Phrases*</w:t>
-        <w:br w:type="textWrapping"/>
-        <w:t xml:space="preserve">- franchise Sandbox VR</w:t>
-        <w:br w:type="textWrapping"/>
-        <w:t xml:space="preserve">- how to open a Sandbox VR</w:t>
-        <w:br w:type="textWrapping"/>
-        <w:t xml:space="preserve">- franchise opportunity</w:t>
-        <w:br w:type="textWrapping"/>
-        <w:t xml:space="preserve">- own a Sandbox VR</w:t>
-        <w:br w:type="textWrapping"/>
-        <w:t xml:space="preserve">- franchise inquiry</w:t>
-        <w:br w:type="textWrapping"/>
-        <w:t xml:space="preserve">- how do I become a franchise owner</w:t>
-        <w:br w:type="textWrapping"/>
-        <w:t xml:space="preserve">- franchise partner</w:t>
-        <w:br w:type="textWrapping"/>
-        <w:t xml:space="preserve">- open my own location</w:t>
-        <w:br w:type="textWrapping"/>
-        <w:t xml:space="preserve">- franchise cost</w:t>
-        <w:br w:type="textWrapping"/>
-        <w:t xml:space="preserve">- how much to open a Sandbox VR</w:t>
-        <w:br w:type="textWrapping"/>
-        <w:t xml:space="preserve">- franchise contact</w:t>
-        <w:br w:type="textWrapping"/>
-        <w:t xml:space="preserve">- franchise email</w:t>
-        <w:br w:type="textWrapping"/>
-        <w:t xml:space="preserve">- franchise team</w:t>
-        <w:br w:type="textWrapping"/>
-        <w:t xml:space="preserve">- franchise brochure</w:t>
-        <w:br w:type="textWrapping"/>
-        <w:t xml:space="preserve">- Franchise Account Executive</w:t>
-        <w:br w:type="textWrapping"/>
-        <w:t xml:space="preserve">- Discovery Day</w:t>
-        <w:br w:type="textWrapping"/>
-        <w:t xml:space="preserve">- Franchise Disclosure Document</w:t>
-        <w:br w:type="textWrapping"/>
-        <w:t xml:space="preserve">- FDD</w:t>
-        <w:br w:type="textWrapping"/>
-        <w:t xml:space="preserve">- franchise roadmap</w:t>
-        <w:br w:type="textWrapping"/>
-        <w:t xml:space="preserve">- franchise application</w:t>
-        <w:br w:type="textWrapping"/>
-        <w:t xml:space="preserve">- where can I open a Sandbox VR</w:t>
-        <w:br w:type="textWrapping"/>
-        <w:t xml:space="preserve">- is Sandbox VR a franchise</w:t>
-        <w:br w:type="textWrapping"/>
-        <w:t xml:space="preserve">- expanding Sandbox VR</w:t>
-        <w:br w:type="textWrapping"/>
-        <w:t xml:space="preserve">- new Sandbox VR location</w:t>
-        <w:br w:type="textWrapping"/>
-        <w:t xml:space="preserve">- franchise markets</w:t>
-        <w:br w:type="textWrapping"/>
-        <w:t xml:space="preserve">- Michael Hampden content</w:t>
-        <w:br w:type="textWrapping"/>
-        <w:t xml:space="preserve">- franchise support</w:t>
-        <w:br w:type="textWrapping"/>
-        <w:t xml:space="preserve">---</w:t>
-        <w:br w:type="textWrapping"/>
-        <w:t xml:space="preserve">*Exclusions*</w:t>
-        <w:br w:type="textWrapping"/>
-        <w:t xml:space="preserve">- Do not use this file for guest policy, booking, or tech support questions.</w:t>
-        <w:br w:type="textWrapping"/>
-        <w:t xml:space="preserve">- Do not provide specific financial investment figures. These are not documented here and must come from the franchise team directly.</w:t>
-        <w:br w:type="textWrapping"/>
-        <w:t xml:space="preserve">- Do not confirm or deny availability in any specific market without directing the inquiry to franchise.sandboxvr.com.</w:t>
-        <w:br w:type="textWrapping"/>
-        <w:t xml:space="preserve">---</w:t>
-        <w:br w:type="textWrapping"/>
-        <w:t xml:space="preserve">*Example Response Patterns*</w:t>
-        <w:br w:type="textWrapping"/>
-        <w:t xml:space="preserve">- "Sandbox VR is actively growing its global franchise network. Franchise partners get access to a full content pipeline, 24/7 support, and a proven playbook for driving guest visits and repeat play. To learn more or start the process, visit &lt;https://franchise.sandboxvr.com|franchise.sandboxvr.com&gt; or email &lt;mailto:Franchise@sandboxvr.com|Franchise@sandboxvr.com&gt;."</w:t>
-        <w:br w:type="textWrapping"/>
-        <w:t xml:space="preserve">- "The franchise roadmap starts with submitting an inquiry online, followed by a video call with a Franchise Account Executive, a review of the FDD, and a Discovery Day where you get to try the experience and meet the team. You can get started at &lt;https://franchise.sandboxvr.com|franchise.sandboxvr.com&gt;."</w:t>
-        <w:br w:type="textWrapping"/>
-        <w:t xml:space="preserve">- "Sandbox VR has three internal studios continuously developing new experiences for franchise owners. Content is led by Michael Hampden, who designed Assassin's Creed and some of the biggest VR titles in the world. Every franchise operator gets the latest technology and experiences as they launch."</w:t>
-        <w:br w:type="textWrapping"/>
-        <w:t xml:space="preserve">- "For specific questions about costs or market availability, the franchise team is the right contact. You can reach them at &lt;mailto:Franchise@sandboxvr.com|Franchise@sandboxvr.com&gt; or through the inquiry form at &lt;https://franchise.sandboxvr.com|franchise.sandboxvr.com&gt;."</w:t>
-      </w:r>
-    </w:p>
-    <w:p>
-      <w:pPr>
-        <w:pStyle w:val="Heading2"/>
-        <w:rPr>
-          <w:rFonts w:ascii="Proxima Nova" w:cs="Proxima Nova" w:eastAsia="Proxima Nova" w:hAnsi="Proxima Nova"/>
-        </w:rPr>
-      </w:pPr>
-      <w:r>
-        <w:rPr>
-          <w:rFonts w:ascii="Proxima Nova" w:cs="Proxima Nova" w:eastAsia="Proxima Nova" w:hAnsi="Proxima Nova"/>
-          <w:rtl w:val="0"/>
-        </w:rPr>
-        <w:t xml:space="preserve"> 87 OPERATIONS  ROBO DINO SETUP AND OPERATION</w:t>
-      </w:r>
-    </w:p>
-    <w:p>
-      <w:pPr>
-        <w:rPr>
-          <w:rFonts w:ascii="Proxima Nova" w:cs="Proxima Nova" w:eastAsia="Proxima Nova" w:hAnsi="Proxima Nova"/>
-        </w:rPr>
-      </w:pPr>
-      <w:r>
-        <w:rPr>
-          <w:rFonts w:ascii="Proxima Nova" w:cs="Proxima Nova" w:eastAsia="Proxima Nova" w:hAnsi="Proxima Nova"/>
-          <w:rtl w:val="0"/>
-        </w:rPr>
-        <w:t xml:space="preserve">*87_OPERATIONS__ROBO_DINO_SETUP_AND_OPERATION*</w:t>
-        <w:br w:type="textWrapping"/>
-        <w:t xml:space="preserve">*Category:* OPERATIONS</w:t>
-        <w:br w:type="textWrapping"/>
-        <w:t xml:space="preserve">*Oasis Link:* &lt;https://sites.google.com/sandboxvr.com/theoasis/home/store-operations/guest-centric-operationally-sound/experiences/age-of-dinosaurs|Age of Dinosaurs on Oasis&gt;</w:t>
-        <w:br w:type="textWrapping"/>
-        <w:t xml:space="preserve">---</w:t>
-        <w:br w:type="textWrapping"/>
-        <w:t xml:space="preserve">---</w:t>
-        <w:br w:type="textWrapping"/>
-        <w:t xml:space="preserve">*Purpose*</w:t>
-        <w:br w:type="textWrapping"/>
-        <w:t xml:space="preserve">This file covers the full setup, startup, operation, shutdown, charging, troubleshooting, and checklists for the Robo Dino (Teddy the Triceratops). Use this file when someone asks how to set up, power on, connect, charge, or troubleshoot the robotic dinosaur.</w:t>
-        <w:br w:type="textWrapping"/>
-        <w:t xml:space="preserve">---</w:t>
-        <w:br w:type="textWrapping"/>
-        <w:t xml:space="preserve">---</w:t>
-        <w:br w:type="textWrapping"/>
-        <w:t xml:space="preserve">*Safety Rules (Always Apply)*</w:t>
-        <w:br w:type="textWrapping"/>
-        <w:t xml:space="preserve">- Keep the dinosaur in your line of sight and stay at least 5 ft away during operation.</w:t>
-        <w:br w:type="textWrapping"/>
-        <w:t xml:space="preserve">- Do not touch it while it is powered on and moving.</w:t>
-        <w:br w:type="textWrapping"/>
-        <w:t xml:space="preserve">- Power off and recharge when the body battery shows 1 LED remaining.</w:t>
-        <w:br w:type="textWrapping"/>
-        <w:t xml:space="preserve">- Do not use on wet ground or in rain, snow, or high humidity.</w:t>
-        <w:br w:type="textWrapping"/>
-        <w:t xml:space="preserve">- Operate only between 5°C and 35°C (41°F to 95°F).</w:t>
-        <w:br w:type="textWrapping"/>
-        <w:t xml:space="preserve">- Use flat, stable surfaces only.</w:t>
-        <w:br w:type="textWrapping"/>
-        <w:t xml:space="preserve">- Keep hands clear of moving joints, especially the knees.</w:t>
-        <w:br w:type="textWrapping"/>
-        <w:t xml:space="preserve">- Always return the dinosaur to a lying position before powering off.</w:t>
-        <w:br w:type="textWrapping"/>
-        <w:t xml:space="preserve">---</w:t>
-        <w:br w:type="textWrapping"/>
-        <w:t xml:space="preserve">*Key Components*</w:t>
-        <w:br w:type="textWrapping"/>
-        <w:t xml:space="preserve">- *Dinosaur body* -- main robotic unit with internal battery area and ID label</w:t>
-        <w:br w:type="textWrapping"/>
-        <w:t xml:space="preserve">- *Body battery* -- powers movement and body; has a front LED indicator</w:t>
-        <w:br w:type="textWrapping"/>
-        <w:t xml:space="preserve">- *Body battery charger* -- use only the correct charger</w:t>
-        <w:br w:type="textWrapping"/>
-        <w:t xml:space="preserve">- *Head (AHA)* -- Animatronic Head Assembly; separate power path from body</w:t>
-        <w:br w:type="textWrapping"/>
-        <w:t xml:space="preserve">- *AHA power supply* -- powers the head system; has a power switch and fan switch</w:t>
-        <w:br w:type="textWrapping"/>
-        <w:t xml:space="preserve">- *AHA battery (blue battery)* -- powers the AHA; no built-in battery indicator</w:t>
-        <w:br w:type="textWrapping"/>
-        <w:t xml:space="preserve">- *AHA battery charger* -- separate charger from the body charger</w:t>
-        <w:br w:type="textWrapping"/>
-        <w:t xml:space="preserve">- *AHA remote control* -- toggles head sound and face loop on/off</w:t>
-        <w:br w:type="textWrapping"/>
-        <w:t xml:space="preserve">- *Sponge* -- reduces AHA battery movement; installed next to the AHA battery</w:t>
-        <w:br w:type="textWrapping"/>
-        <w:t xml:space="preserve">DO NOT throw away any part, component, packaging, or shipping material.</w:t>
-        <w:br w:type="textWrapping"/>
-        <w:t xml:space="preserve">---</w:t>
-        <w:br w:type="textWrapping"/>
-        <w:t xml:space="preserve">*Assembly and Internal Setup*</w:t>
-        <w:br w:type="textWrapping"/>
-        <w:t xml:space="preserve">Follow this order exactly.</w:t>
-        <w:br w:type="textWrapping"/>
-        <w:t xml:space="preserve">1. *Power on the AHA power supply first* -- turn ON the power switch, then turn ON the fan switch. Confirm the control line faces outward and the AHA power supply sits on the left side of the body.</w:t>
-        <w:br w:type="textWrapping"/>
-        <w:t xml:space="preserve">2. *Install the AHA power supply* -- connect to the control line and place inside the body, switch side on the left.</w:t>
-        <w:br w:type="textWrapping"/>
-        <w:t xml:space="preserve">3. *Install the AHA battery (blue battery)* -- connect to the AHA power supply, place next to the power supply, tuck all wires, confirm no wires are pinched or blocking movement.</w:t>
-        <w:br w:type="textWrapping"/>
-        <w:t xml:space="preserve">4. *Secure the AHA battery and install the sponge* -- place the sponge on the right side of the battery area, pull the hook from the left side across and attach to the steel handle on the right.</w:t>
-        <w:br w:type="textWrapping"/>
-        <w:t xml:space="preserve">5. *Install the body battery* -- insert into the robot, press and hold the middle section while inserting, push until fully seated.</w:t>
-        <w:br w:type="textWrapping"/>
-        <w:t xml:space="preserve">---</w:t>
-        <w:br w:type="textWrapping"/>
-        <w:t xml:space="preserve">*Battery Reference*</w:t>
-        <w:br w:type="textWrapping"/>
-        <w:t xml:space="preserve">- *AHA battery (blue battery):* powers the head; no built-in indicator; runtime about 1 month under normal use; recharge on a regular schedule and when head performance drops.</w:t>
-        <w:br w:type="textWrapping"/>
-        <w:t xml:space="preserve">- *Body battery:* powers movement and body; front LED indicator; runtime about 2 hours total (about 30 minutes per LED); stop and recharge when 1 LED remains.</w:t>
-        <w:br w:type="textWrapping"/>
-        <w:t xml:space="preserve">---</w:t>
-        <w:br w:type="textWrapping"/>
-        <w:t xml:space="preserve">*iPad Assignment*</w:t>
-        <w:br w:type="textWrapping"/>
-        <w:t xml:space="preserve">Each dinosaur is assigned a specific iPad. Log in using the correct account for that iPad. Do not mismatch iPad labels and accounts.</w:t>
-        <w:br w:type="textWrapping"/>
-        <w:t xml:space="preserve">- *iPad 1* -- West (LA, SF, Seattle) -- dog1@sandboxvr.com -- Sbvr2026</w:t>
-        <w:br w:type="textWrapping"/>
-        <w:t xml:space="preserve">- *iPad 2* -- East (Battery, Boro, Terminal) -- dog2@sandboxvr.com -- Sbvr2026</w:t>
-        <w:br w:type="textWrapping"/>
-        <w:t xml:space="preserve">- *iPad 3* -- Central (Chicago, St. Louis) -- dog3@sandboxvr.com -- Sbvr2026</w:t>
-        <w:br w:type="textWrapping"/>
-        <w:t xml:space="preserve">- *iPad 4* -- South (Dallas, Austin) -- dog4@sandboxvr.com -- Sbvr2026</w:t>
-        <w:br w:type="textWrapping"/>
-        <w:t xml:space="preserve">Allow all required app permissions including Bluetooth and Location before pairing.</w:t>
-        <w:br w:type="textWrapping"/>
-        <w:t xml:space="preserve">---</w:t>
-        <w:br w:type="textWrapping"/>
-        <w:t xml:space="preserve">*Initial Posture Before Power On*</w:t>
-        <w:br w:type="textWrapping"/>
-        <w:t xml:space="preserve">Before powering on, the dinosaur body must be symmetrical and all four limbs must be positioned symmetrically. Incorrect posture can prevent the dinosaur from standing.</w:t>
-        <w:br w:type="textWrapping"/>
-        <w:t xml:space="preserve">---</w:t>
-        <w:br w:type="textWrapping"/>
-        <w:t xml:space="preserve">*Power On Sequence*</w:t>
-        <w:br w:type="textWrapping"/>
-        <w:t xml:space="preserve">DO NOT turn on the head until after the dinosaur is fully standing.</w:t>
-        <w:br w:type="textWrapping"/>
-        <w:t xml:space="preserve">1. Briefly press the gray power button, then press and hold for 3 seconds (short press then long press).</w:t>
-        <w:br w:type="textWrapping"/>
-        <w:t xml:space="preserve">2. Wait about 1 minute. The dinosaur will stand automatically when startup is complete.</w:t>
-        <w:br w:type="textWrapping"/>
-        <w:t xml:space="preserve">3. Once the dinosaur is fully standing and stable, turn on the head (AHA) by reaching into the left side of the power supply area and toggling the first switch (power switch) on. Confirm the fan switch remains on.</w:t>
-        <w:br w:type="textWrapping"/>
-        <w:t xml:space="preserve">4. Close the zipper.</w:t>
-        <w:br w:type="textWrapping"/>
-        <w:t xml:space="preserve">---</w:t>
-        <w:br w:type="textWrapping"/>
-        <w:t xml:space="preserve">*Pairing a Dinosaur to an iPad (First Time Only)*</w:t>
-        <w:br w:type="textWrapping"/>
-        <w:t xml:space="preserve">Skip this section if the dinosaur is already paired.</w:t>
-        <w:br w:type="textWrapping"/>
-        <w:t xml:space="preserve">1. Open the Unitree app.</w:t>
-        <w:br w:type="textWrapping"/>
-        <w:t xml:space="preserve">2. Tap *Add Robot Dog* and wait for scan results.</w:t>
-        <w:br w:type="textWrapping"/>
-        <w:t xml:space="preserve">3. Tap the detected robot on the right side of the screen. Leave settings as default.</w:t>
-        <w:br w:type="textWrapping"/>
-        <w:t xml:space="preserve">4. Tap *Bind Your Robot Dog*.</w:t>
-        <w:br w:type="textWrapping"/>
-        <w:t xml:space="preserve">5. Select *AP Mode*. Leave the username as default.</w:t>
-        <w:br w:type="textWrapping"/>
-        <w:t xml:space="preserve">6. Enter the AP mode password: `glo12345678`</w:t>
-        <w:br w:type="textWrapping"/>
-        <w:t xml:space="preserve">7. When prompted, tap *Join* for the AP WiFi network.</w:t>
-        <w:br w:type="textWrapping"/>
-        <w:t xml:space="preserve">8. Wait for pairing to complete, then tap *Confirm*.</w:t>
-        <w:br w:type="textWrapping"/>
-        <w:t xml:space="preserve">9. Confirm the upper left indicator is green and the robot name is shown.</w:t>
-        <w:br w:type="textWrapping"/>
-        <w:t xml:space="preserve">---</w:t>
-        <w:br w:type="textWrapping"/>
-        <w:t xml:space="preserve">*Daily Connection (Already Paired)*</w:t>
-        <w:br w:type="textWrapping"/>
-        <w:t xml:space="preserve">The primary connection must be through AP Mode. Forget all other iPad WiFi networks including SBVR_STAFF to avoid connection issues.</w:t>
-        <w:br w:type="textWrapping"/>
-        <w:t xml:space="preserve">1. Open the Unitree app on the assigned iPad.</w:t>
-        <w:br w:type="textWrapping"/>
-        <w:t xml:space="preserve">2. Tap *Connect*, then *Confirm*, then *Join*.</w:t>
-        <w:br w:type="textWrapping"/>
-        <w:t xml:space="preserve">3. Wait until the upper left connection indicator turns green.</w:t>
-        <w:br w:type="textWrapping"/>
-        <w:t xml:space="preserve">*If the regular connect steps do not work:*</w:t>
-        <w:br w:type="textWrapping"/>
-        <w:t xml:space="preserve">1. Forget all WiFi networks except the Dino AP network in iPad WiFi settings.</w:t>
-        <w:br w:type="textWrapping"/>
-        <w:t xml:space="preserve">2. Power cycle the dinosaur (tap then hold the battery power button to turn off, repeat to turn back on).</w:t>
-        <w:br w:type="textWrapping"/>
-        <w:t xml:space="preserve">3. Connect the iPad to the Dino AP network.</w:t>
-        <w:br w:type="textWrapping"/>
-        <w:t xml:space="preserve">4. Open the Unitree app, tap the Device Settings button, then *Robot Dog Settings*.</w:t>
-        <w:br w:type="textWrapping"/>
-        <w:t xml:space="preserve">5. Scroll down and select *AP Mode*.</w:t>
-        <w:br w:type="textWrapping"/>
-        <w:t xml:space="preserve">6. Enter password: `glo12345678`. Username: leave as default.</w:t>
-        <w:br w:type="textWrapping"/>
-        <w:t xml:space="preserve">7. Tap *Join* if prompted to confirm the network. If the network name shows but is not connecting, tap the network name and confirm joining.</w:t>
-        <w:br w:type="textWrapping"/>
-        <w:t xml:space="preserve">---</w:t>
-        <w:br w:type="textWrapping"/>
-        <w:t xml:space="preserve">*Approved Movement Modes*</w:t>
-        <w:br w:type="textWrapping"/>
-        <w:t xml:space="preserve">From the main menu, tap *Function* &gt; *Remote Control*. Under Mode, select *Classic*. Use the virtual joystick to move.</w:t>
-        <w:br w:type="textWrapping"/>
-        <w:t xml:space="preserve">Approved modes: Damping, Sit Down, Pose, Lie Down, Run, Classic, Normal.</w:t>
-        <w:br w:type="textWrapping"/>
-        <w:t xml:space="preserve">Do not use any unlisted mode. Unsupported modes can cause instability, loss of control, or skin damage.</w:t>
-        <w:br w:type="textWrapping"/>
-        <w:t xml:space="preserve">---</w:t>
-        <w:br w:type="textWrapping"/>
-        <w:t xml:space="preserve">*AHA Head Control*</w:t>
-        <w:br w:type="textWrapping"/>
-        <w:t xml:space="preserve">The AHA automatically starts a loop when powered on: mouth movement, eye blinking, and sound effects.</w:t>
-        <w:br w:type="textWrapping"/>
-        <w:t xml:space="preserve">- Press the AHA remote button once to pause the face and sound loop.</w:t>
-        <w:br w:type="textWrapping"/>
-        <w:t xml:space="preserve">- Press again to resume.</w:t>
-        <w:br w:type="textWrapping"/>
-        <w:t xml:space="preserve">---</w:t>
-        <w:br w:type="textWrapping"/>
-        <w:t xml:space="preserve">*Shutdown Sequence*</w:t>
-        <w:br w:type="textWrapping"/>
-        <w:t xml:space="preserve">Always return the dinosaur to its lying posture before powering off.</w:t>
-        <w:br w:type="textWrapping"/>
-        <w:t xml:space="preserve">1. Open the dinosaur zipper.</w:t>
-        <w:br w:type="textWrapping"/>
-        <w:t xml:space="preserve">2. In the Unitree app, open *Remote Control*, select *Damping*, and wait for the dinosaur to return to its lying posture.</w:t>
-        <w:br w:type="textWrapping"/>
-        <w:t xml:space="preserve">3. Briefly press the gray power button, then press and hold for 3 seconds to turn off the body.</w:t>
-        <w:br w:type="textWrapping"/>
-        <w:t xml:space="preserve">4. Reach into the left side of the power supply area and toggle the first switch to turn off the head (AHA).</w:t>
-        <w:br w:type="textWrapping"/>
-        <w:t xml:space="preserve">---</w:t>
-        <w:br w:type="textWrapping"/>
-        <w:t xml:space="preserve">*Charging*</w:t>
-        <w:br w:type="textWrapping"/>
-        <w:t xml:space="preserve">Charge both batteries after use at the same time.</w:t>
-        <w:br w:type="textWrapping"/>
-        <w:t xml:space="preserve">*AHA battery:* unplug the AHA battery inside the body, connect the AHA power adapter to the AHA power input jack, allow about 5 hours for a full charge from empty.</w:t>
-        <w:br w:type="textWrapping"/>
-        <w:t xml:space="preserve">*Body battery:* remove from the body, plug the body battery charger into the charging port on the back of the battery. Use about 20 minutes per LED as a planning estimate.</w:t>
-        <w:br w:type="textWrapping"/>
-        <w:t xml:space="preserve">---</w:t>
-        <w:br w:type="textWrapping"/>
-        <w:t xml:space="preserve">*Pre-Use Checklist*</w:t>
-        <w:br w:type="textWrapping"/>
-        <w:t xml:space="preserve">- All required parts present</w:t>
-        <w:br w:type="textWrapping"/>
-        <w:t xml:space="preserve">- AHA battery charged</w:t>
-        <w:br w:type="textWrapping"/>
-        <w:t xml:space="preserve">- Body battery charged</w:t>
-        <w:br w:type="textWrapping"/>
-        <w:t xml:space="preserve">- AHA power switch ON</w:t>
-        <w:br w:type="textWrapping"/>
-        <w:t xml:space="preserve">- AHA fan switch ON</w:t>
-        <w:br w:type="textWrapping"/>
-        <w:t xml:space="preserve">- Sponge installed and hook secured</w:t>
-        <w:br w:type="textWrapping"/>
-        <w:t xml:space="preserve">- Body battery fully seated</w:t>
-        <w:br w:type="textWrapping"/>
-        <w:t xml:space="preserve">- Correct iPad assigned</w:t>
-        <w:br w:type="textWrapping"/>
-        <w:t xml:space="preserve">- App permissions enabled</w:t>
-        <w:br w:type="textWrapping"/>
-        <w:t xml:space="preserve">- Dinosaur in correct initial posture</w:t>
-        <w:br w:type="textWrapping"/>
-        <w:t xml:space="preserve">- Surface dry and stable</w:t>
-        <w:br w:type="textWrapping"/>
-        <w:t xml:space="preserve">- Area is clear and operator has safe distance</w:t>
-        <w:br w:type="textWrapping"/>
-        <w:t xml:space="preserve">---</w:t>
-        <w:br w:type="textWrapping"/>
-        <w:t xml:space="preserve">*Post-Use Checklist*</w:t>
-        <w:br w:type="textWrapping"/>
-        <w:t xml:space="preserve">- Damping selected and dinosaur returned to lying posture</w:t>
-        <w:br w:type="textWrapping"/>
-        <w:t xml:space="preserve">- Body power OFF</w:t>
-        <w:br w:type="textWrapping"/>
-        <w:t xml:space="preserve">- AHA power OFF</w:t>
-        <w:br w:type="textWrapping"/>
-        <w:t xml:space="preserve">- AHA battery unplugged for charging</w:t>
-        <w:br w:type="textWrapping"/>
-        <w:t xml:space="preserve">- Body battery removed for charging</w:t>
-        <w:br w:type="textWrapping"/>
-        <w:t xml:space="preserve">- Both batteries on the correct chargers</w:t>
-        <w:br w:type="textWrapping"/>
-        <w:t xml:space="preserve">- Zipper left in correct state for storage/charging</w:t>
-        <w:br w:type="textWrapping"/>
-        <w:t xml:space="preserve">- No visible skin damage</w:t>
-        <w:br w:type="textWrapping"/>
-        <w:t xml:space="preserve">- Remote and chargers stored together</w:t>
-        <w:br w:type="textWrapping"/>
-        <w:t xml:space="preserve">---</w:t>
-        <w:br w:type="textWrapping"/>
-        <w:t xml:space="preserve">*Troubleshooting*</w:t>
-        <w:br w:type="textWrapping"/>
-        <w:t xml:space="preserve">For all issues, start with the checks below. If unresolved, tag *@dinohelp* in your store's Slack channel.</w:t>
-        <w:br w:type="textWrapping"/>
-        <w:t xml:space="preserve">*Dinosaur does not stand up:* confirm initial posture is symmetrical, body battery is seated and charged, repeat body power sequence, wait full startup time.</w:t>
-        <w:br w:type="textWrapping"/>
-        <w:t xml:space="preserve">*Head (AHA) does not move or make sound:* confirm AHA battery is connected, AHA power switch is ON, fan switch is ON, press remote to resume loop.</w:t>
-        <w:br w:type="textWrapping"/>
-        <w:t xml:space="preserve">*iPad cannot connect:* confirm correct assigned iPad and dinosaur, body is powered on, Bluetooth and Location permissions are allowed, retry connection flow. If still failing, repeat the full pairing flow.</w:t>
-        <w:br w:type="textWrapping"/>
-        <w:t xml:space="preserve">*Movement feels unstable:* stop movement, move to flat stable surface, use approved modes only, recheck battery level and operator distance.</w:t>
-        <w:br w:type="textWrapping"/>
-        <w:t xml:space="preserve">*Dinosaur losing balance:*</w:t>
-        <w:br w:type="textWrapping"/>
-        <w:t xml:space="preserve">1. Select Damping and wait for lying posture before powering off.</w:t>
-        <w:br w:type="textWrapping"/>
-        <w:t xml:space="preserve">2. If limbs are still moving and app is not connected, carefully avoid moving limbs and press the battery switch to turn off directly.</w:t>
-        <w:br w:type="textWrapping"/>
-        <w:t xml:space="preserve">3. Manually adjust the dinosaur to the correct lying posture with limbs symmetrical.</w:t>
-        <w:br w:type="textWrapping"/>
-        <w:t xml:space="preserve">4. Power on again. If still unstable, repeat. Tag @dinohelp if unresolved.</w:t>
-        <w:br w:type="textWrapping"/>
-        <w:t xml:space="preserve">*Dinosaur cannot connect after power on:* connect to the robot AP through WiFi settings, open Unitree app &gt; Device &gt; Robot Dog Settings &gt; AP Mode, enter password `glo12345678`, wait for reconnection.</w:t>
-        <w:br w:type="textWrapping"/>
-        <w:t xml:space="preserve">*Dinosaur is beeping:* AHA battery is nearly empty. Turn off the AHA power control first, unplug the AHA battery, and charge using the correct power adapter.</w:t>
-        <w:br w:type="textWrapping"/>
-        <w:t xml:space="preserve">*Dinosaur suddenly lies down and cannot be controlled (overheating):* check the app for a red exclamation mark in the upper left (indicates body over 70°C/158°F). Shut down the body, ensure the fan button on the AHA control is on, allow about 30 minutes to cool in a cool environment. Do not use Lock On mode -- it rapidly raises body temperature. Once cooled, restart and check temperature in Go mode.</w:t>
-        <w:br w:type="textWrapping"/>
-        <w:t xml:space="preserve">---</w:t>
-        <w:br w:type="textWrapping"/>
-        <w:t xml:space="preserve">*Escalation*</w:t>
-        <w:br w:type="textWrapping"/>
-        <w:t xml:space="preserve">Tag *@dinohelp* in your store's Slack channel for any issue not resolved by the checks above.</w:t>
-        <w:br w:type="textWrapping"/>
-        <w:t xml:space="preserve">---</w:t>
-        <w:br w:type="textWrapping"/>
-        <w:t xml:space="preserve">*Trigger Phrases*</w:t>
-        <w:br w:type="textWrapping"/>
-        <w:t xml:space="preserve">- robo dino</w:t>
-        <w:br w:type="textWrapping"/>
-        <w:t xml:space="preserve">- robotic dinosaur</w:t>
-        <w:br w:type="textWrapping"/>
-        <w:t xml:space="preserve">- teddy the triceratops</w:t>
-        <w:br w:type="textWrapping"/>
-        <w:t xml:space="preserve">- dino setup</w:t>
-        <w:br w:type="textWrapping"/>
-        <w:t xml:space="preserve">- how to turn on the dinosaur</w:t>
-        <w:br w:type="textWrapping"/>
-        <w:t xml:space="preserve">- power on dinosaur</w:t>
-        <w:br w:type="textWrapping"/>
-        <w:t xml:space="preserve">- how to charge the dino</w:t>
-        <w:br w:type="textWrapping"/>
-        <w:t xml:space="preserve">- dino battery</w:t>
-        <w:br w:type="textWrapping"/>
-        <w:t xml:space="preserve">- AHA head</w:t>
-        <w:br w:type="textWrapping"/>
-        <w:t xml:space="preserve">- dino won't stand</w:t>
-        <w:br w:type="textWrapping"/>
-        <w:t xml:space="preserve">- dinosaur not connecting</w:t>
-        <w:br w:type="textWrapping"/>
-        <w:t xml:space="preserve">- unitree app</w:t>
-        <w:br w:type="textWrapping"/>
-        <w:t xml:space="preserve">- pair dino iPad</w:t>
-        <w:br w:type="textWrapping"/>
-        <w:t xml:space="preserve">- dino troubleshooting</w:t>
-        <w:br w:type="textWrapping"/>
-        <w:t xml:space="preserve">- dino checklist</w:t>
-        <w:br w:type="textWrapping"/>
-        <w:t xml:space="preserve">- pre-use checklist dino</w:t>
-        <w:br w:type="textWrapping"/>
-        <w:t xml:space="preserve">- post-use checklist dino</w:t>
-        <w:br w:type="textWrapping"/>
-        <w:t xml:space="preserve">- shutdown dinosaur</w:t>
-        <w:br w:type="textWrapping"/>
-        <w:t xml:space="preserve">- dino overheating</w:t>
-        <w:br w:type="textWrapping"/>
-        <w:t xml:space="preserve">- dino beeping</w:t>
-        <w:br w:type="textWrapping"/>
-        <w:t xml:space="preserve">- AP mode dino</w:t>
-        <w:br w:type="textWrapping"/>
-        <w:t xml:space="preserve">- glo12345678</w:t>
-        <w:br w:type="textWrapping"/>
-        <w:t xml:space="preserve">- body battery</w:t>
-        <w:br w:type="textWrapping"/>
-        <w:t xml:space="preserve">- AHA battery</w:t>
-        <w:br w:type="textWrapping"/>
-        <w:t xml:space="preserve">- dino assembly</w:t>
-      </w:r>
-    </w:p>
-    <w:p>
-      <w:pPr>
-        <w:pStyle w:val="Heading2"/>
-        <w:rPr>
-          <w:rFonts w:ascii="Proxima Nova" w:cs="Proxima Nova" w:eastAsia="Proxima Nova" w:hAnsi="Proxima Nova"/>
-        </w:rPr>
-      </w:pPr>
-      <w:r>
-        <w:rPr>
-          <w:rFonts w:ascii="Proxima Nova" w:cs="Proxima Nova" w:eastAsia="Proxima Nova" w:hAnsi="Proxima Nova"/>
-          <w:rtl w:val="0"/>
-        </w:rPr>
-        <w:t xml:space="preserve"> 88 OPERATIONS  ROBO DINO FLOOR ACTIVATION AND MEDIA</w:t>
-      </w:r>
-    </w:p>
-    <w:p>
-      <w:pPr>
-        <w:rPr>
-          <w:rFonts w:ascii="Proxima Nova" w:cs="Proxima Nova" w:eastAsia="Proxima Nova" w:hAnsi="Proxima Nova"/>
-        </w:rPr>
-      </w:pPr>
-      <w:r>
-        <w:rPr>
-          <w:rFonts w:ascii="Proxima Nova" w:cs="Proxima Nova" w:eastAsia="Proxima Nova" w:hAnsi="Proxima Nova"/>
-          <w:rtl w:val="0"/>
-        </w:rPr>
-        <w:t xml:space="preserve">*_88_OPERATIONS__ROBO_DINO_FLOOR_ACTIVATION_AND_MEDIA*</w:t>
-        <w:br w:type="textWrapping"/>
-        <w:t xml:space="preserve">*Category:* OPERATIONS</w:t>
-        <w:br w:type="textWrapping"/>
-        <w:t xml:space="preserve">*Oasis Link:* &lt;https://sites.google.com/sandboxvr.com/theoasis/home/store-operations/guest-centric-operationally-sound/experiences/age-of-dinosaurs|Age of Dinosaurs on Oasis&gt;</w:t>
-        <w:br w:type="textWrapping"/>
-        <w:t xml:space="preserve">---</w:t>
-        <w:br w:type="textWrapping"/>
-        <w:t xml:space="preserve">---</w:t>
-        <w:br w:type="textWrapping"/>
-        <w:t xml:space="preserve">*Purpose*</w:t>
-        <w:br w:type="textWrapping"/>
-        <w:t xml:space="preserve">This file covers how to use the Robo Dino on the floor to drive guest excitement, generate bookings, and handle media visits. Use this file when someone asks about floor activation, selling with the dino, guest rules, safety during activation, or the media/press protocol.</w:t>
-        <w:br w:type="textWrapping"/>
-        <w:t xml:space="preserve">---</w:t>
-        <w:br w:type="textWrapping"/>
-        <w:t xml:space="preserve">---</w:t>
-        <w:br w:type="textWrapping"/>
-        <w:t xml:space="preserve">*Purpose of the Robo Dino on the Floor*</w:t>
-        <w:br w:type="textWrapping"/>
-        <w:t xml:space="preserve">The Robo Dino drives awareness for Age of Dinosaurs, increases walk-in traffic and impulse bookings, creates social media moments, supports press and influencer events, and increases in-store energy during peak times.</w:t>
-        <w:br w:type="textWrapping"/>
-        <w:t xml:space="preserve">A *trained Dino Handler is required* for every activation. If the area becomes unsafe or the dino malfunctions, stop immediately, remove it from the floor, and tag *@dinohelp* in your store's Slack channel.</w:t>
-        <w:br w:type="textWrapping"/>
-        <w:t xml:space="preserve">---</w:t>
-        <w:br w:type="textWrapping"/>
-        <w:t xml:space="preserve">*When to Activate*</w:t>
-        <w:br w:type="textWrapping"/>
-        <w:t xml:space="preserve">Default schedule: peak hours and high-traffic windows.</w:t>
-        <w:br w:type="textWrapping"/>
-        <w:t xml:space="preserve">Extra activation triggers (when safe and staffing allows):</w:t>
-        <w:br w:type="textWrapping"/>
-        <w:t xml:space="preserve">- Mall traffic surges</w:t>
-        <w:br w:type="textWrapping"/>
-        <w:t xml:space="preserve">- Birthday party check-ins</w:t>
-        <w:br w:type="textWrapping"/>
-        <w:t xml:space="preserve">- Corporate group arrivals</w:t>
-        <w:br w:type="textWrapping"/>
-        <w:t xml:space="preserve">- Press or influencer events</w:t>
-        <w:br w:type="textWrapping"/>
-        <w:t xml:space="preserve">---</w:t>
-        <w:br w:type="textWrapping"/>
-        <w:t xml:space="preserve">*Approved Locations and Movement*</w:t>
-        <w:br w:type="textWrapping"/>
-        <w:t xml:space="preserve">The dino should move in a controlled, predictable way. Avoid chaotic or unpredictable movement.</w:t>
-        <w:br w:type="textWrapping"/>
-        <w:t xml:space="preserve">- *In-store lobby/check-in:* slow roaming near check-in, controlled approach, pause for photo moments between movement cycles. Do not get too close to guests or block check-in flow.</w:t>
-        <w:br w:type="textWrapping"/>
-        <w:t xml:space="preserve">- *In front of the store (if space allows):* walk near the entrance, perform sit/pose/lie down, pause for photos. Do not block main walkways.</w:t>
-        <w:br w:type="textWrapping"/>
-        <w:t xml:space="preserve">- *Around the mall (if safe):* slow walk, pause when people gather, perform sit/pose/lie down. Avoid congested areas.</w:t>
-        <w:br w:type="textWrapping"/>
-        <w:t xml:space="preserve">---</w:t>
-        <w:br w:type="textWrapping"/>
-        <w:t xml:space="preserve">*Activation Timing and Battery Rhythm*</w:t>
-        <w:br w:type="textWrapping"/>
-        <w:t xml:space="preserve">- Active movement: 15 to 20 minutes max per window</w:t>
-        <w:br w:type="textWrapping"/>
-        <w:t xml:space="preserve">- Rest period: 15 to 30 minutes between windows</w:t>
-        <w:br w:type="textWrapping"/>
-        <w:t xml:space="preserve">- Total daily use: about 3 to 5 hours of intermittent activation</w:t>
-        <w:br w:type="textWrapping"/>
-        <w:t xml:space="preserve">- Always start fully charged and check battery before each window</w:t>
-        <w:br w:type="textWrapping"/>
-        <w:t xml:space="preserve">---</w:t>
-        <w:br w:type="textWrapping"/>
-        <w:t xml:space="preserve">*Staff Roles*</w:t>
-        <w:br w:type="textWrapping"/>
-        <w:t xml:space="preserve">- *Dino Handler (required):* controls movement, maintains safe distance, pauses for photos, stops immediately if unsafe.</w:t>
-        <w:br w:type="textWrapping"/>
-        <w:t xml:space="preserve">- *Sales Lead (recommended during busy periods):* talks to guests, encourages filming, connects the dino to Age of Dinosaurs, invites booking, and hands out SBVR Welcome 10 Flyers.</w:t>
-        <w:br w:type="textWrapping"/>
-        <w:t xml:space="preserve">---</w:t>
-        <w:br w:type="textWrapping"/>
-        <w:t xml:space="preserve">*Selling Behavior*</w:t>
-        <w:br w:type="textWrapping"/>
-        <w:t xml:space="preserve">Keep it short and tied to what the guest is seeing.</w:t>
-        <w:br w:type="textWrapping"/>
-        <w:t xml:space="preserve">*Soft sell example:* "That's our Triceratops from Age of Dinosaurs. You actually get to step inside that world in full-body VR."</w:t>
-        <w:br w:type="textWrapping"/>
-        <w:t xml:space="preserve">*Tie-in lines:*</w:t>
-        <w:br w:type="textWrapping"/>
-        <w:t xml:space="preserve">- "You'll come face to face with dinosaurs."</w:t>
-        <w:br w:type="textWrapping"/>
-        <w:t xml:space="preserve">- "You're not watching them. You're inside their world."</w:t>
-        <w:br w:type="textWrapping"/>
-        <w:t xml:space="preserve">- "If you like this, wait until you see it in VR."</w:t>
-        <w:br w:type="textWrapping"/>
-        <w:t xml:space="preserve">---</w:t>
-        <w:br w:type="textWrapping"/>
-        <w:t xml:space="preserve">*Guest Rules*</w:t>
-        <w:br w:type="textWrapping"/>
-        <w:t xml:space="preserve">*Allowed:*</w:t>
-        <w:br w:type="textWrapping"/>
-        <w:t xml:space="preserve">- Photos and videos -- encourage from a safe distance</w:t>
-        <w:br w:type="textWrapping"/>
-        <w:t xml:space="preserve">- Sharing on social media -- ask them to tag Sandbox VR</w:t>
-        <w:br w:type="textWrapping"/>
-        <w:t xml:space="preserve">- Watching -- keep at least 5 feet away</w:t>
-        <w:br w:type="textWrapping"/>
-        <w:t xml:space="preserve">- Children watching -- adults must supervise</w:t>
-        <w:br w:type="textWrapping"/>
-        <w:t xml:space="preserve">*Not allowed:*</w:t>
-        <w:br w:type="textWrapping"/>
-        <w:t xml:space="preserve">- Climbing or sitting on the dino -- stop immediately</w:t>
-        <w:br w:type="textWrapping"/>
-        <w:t xml:space="preserve">- Grabbing horns or tail -- redirect and increase distance</w:t>
-        <w:br w:type="textWrapping"/>
-        <w:t xml:space="preserve">- Blocking the path -- clear path before movement continues</w:t>
-        <w:br w:type="textWrapping"/>
-        <w:t xml:space="preserve">- Attempting to ride -- stop immediately</w:t>
-        <w:br w:type="textWrapping"/>
-        <w:t xml:space="preserve">- Interfering with controls -- stop interaction and reset perimeter</w:t>
-        <w:br w:type="textWrapping"/>
-        <w:t xml:space="preserve">---</w:t>
-        <w:br w:type="textWrapping"/>
-        <w:t xml:space="preserve">*Safety Minimums*</w:t>
-        <w:br w:type="textWrapping"/>
-        <w:t xml:space="preserve">- Maintain a clear perimeter of at least 5 feet at all times.</w:t>
-        <w:br w:type="textWrapping"/>
-        <w:t xml:space="preserve">- Do not activate in congested areas.</w:t>
-        <w:br w:type="textWrapping"/>
-        <w:t xml:space="preserve">- Never activate during an emergency or evacuation.</w:t>
-        <w:br w:type="textWrapping"/>
-        <w:t xml:space="preserve">- Keep the dino away from drinks and liquids.</w:t>
-        <w:br w:type="textWrapping"/>
-        <w:t xml:space="preserve">- Shut down immediately if anything seems unsafe or the unit malfunctions.</w:t>
-        <w:br w:type="textWrapping"/>
-        <w:t xml:space="preserve">*Escalation triggers:* dino stops responding, battery drains rapidly, mechanical noise changes, or software malfunction occurs.</w:t>
-        <w:br w:type="textWrapping"/>
-        <w:t xml:space="preserve">*Escalation steps:* power down, remove from the floor, tag *@dinohelp* in your store's Slack channel.</w:t>
-        <w:br w:type="textWrapping"/>
-        <w:t xml:space="preserve">---</w:t>
-        <w:br w:type="textWrapping"/>
-        <w:t xml:space="preserve">*Media Protocol (Promotional Tour)*</w:t>
-        <w:br w:type="textWrapping"/>
-        <w:t xml:space="preserve">The four Robo Dinos are on a promotional tour to key US markets to promote Age of Dinosaurs. Each dino spends approximately 1.5 weeks per market. Metro PR arranges all local media opportunities and contacts store managers directly with outlet info, expectations, and a detailed briefing sheet for day-of operations.</w:t>
-        <w:br w:type="textWrapping"/>
-        <w:t xml:space="preserve">*Types of media visits:*</w:t>
-        <w:br w:type="textWrapping"/>
-        <w:t xml:space="preserve">- *In-store:* media visits your Sandbox VR location and will likely play Age of Dinosaurs.</w:t>
-        <w:br w:type="textWrapping"/>
-        <w:t xml:space="preserve">- *In-studio:* you bring the dino to a local news station and operate it on-air.</w:t>
-        <w:br w:type="textWrapping"/>
-        <w:t xml:space="preserve">---</w:t>
-        <w:br w:type="textWrapping"/>
-        <w:t xml:space="preserve">*Media Talking Points*</w:t>
-        <w:br w:type="textWrapping"/>
-        <w:t xml:space="preserve">*DO say:*</w:t>
-        <w:br w:type="textWrapping"/>
-        <w:t xml:space="preserve">- "Age of Dinosaurs is available at all 80+ Sandbox VR locations worldwide, including the location here in [your city]. Visit sandboxvr.com to book tickets."</w:t>
-        <w:br w:type="textWrapping"/>
-        <w:t xml:space="preserve">- "Age of Dinosaurs is a family-friendly experience for guests of all ages."</w:t>
-        <w:br w:type="textWrapping"/>
-        <w:t xml:space="preserve">- "Guests don't just observe dinosaurs -- they walk among them, feel the ground shake beneath their footsteps, and experience their true scale as these massive animals tower overhead."</w:t>
-        <w:br w:type="textWrapping"/>
-        <w:t xml:space="preserve">- "Age of Dinosaurs is a rare blend of thrilling entertainment and scientific education, created in partnership with the Natural History Museum London and leading paleontologists."</w:t>
-        <w:br w:type="textWrapping"/>
-        <w:t xml:space="preserve">- "Age of Dinosaurs is only available at Sandbox VR."</w:t>
-        <w:br w:type="textWrapping"/>
-        <w:t xml:space="preserve">- Other available experiences include Stranger Things: Catalyst and Squid Game Virtuals (both in partnership with Netflix), as well as the popular Deadwood franchise.</w:t>
-        <w:br w:type="textWrapping"/>
-        <w:t xml:space="preserve">*DO NOT say:*</w:t>
-        <w:br w:type="textWrapping"/>
-        <w:t xml:space="preserve">- Age of Dinosaurs is only for kids and families -- it is an experience for guests of all ages.</w:t>
-        <w:br w:type="textWrapping"/>
-        <w:t xml:space="preserve">- Age of Dinosaurs is the only experience at Sandbox VR -- it is one of many experiences guests can book.</w:t>
-        <w:br w:type="textWrapping"/>
-        <w:t xml:space="preserve">---</w:t>
-        <w:br w:type="textWrapping"/>
-        <w:t xml:space="preserve">*Media Visit Recommendations*</w:t>
-        <w:br w:type="textWrapping"/>
-        <w:t xml:space="preserve">- Dress professionally in solid-colored clothing. Only visible logos should be Sandbox VR logos.</w:t>
-        <w:br w:type="textWrapping"/>
-        <w:t xml:space="preserve">- Keep the conversation light-hearted and relaxed.</w:t>
-        <w:br w:type="textWrapping"/>
-        <w:t xml:space="preserve">- Speak confidently about Age of Dinosaurs and Sandbox VR as a whole.</w:t>
-        <w:br w:type="textWrapping"/>
-        <w:t xml:space="preserve">*If media is coming in-store:*</w:t>
-        <w:br w:type="textWrapping"/>
-        <w:t xml:space="preserve">- Have a staff member available to join the journalist in the experience -- they typically will not bring a second player from their crew.</w:t>
-        <w:br w:type="textWrapping"/>
-        <w:t xml:space="preserve">- Make sure the store feels full during the visit. If no bookings are scheduled during the media window, ask friends and family to be on-site.</w:t>
-        <w:br w:type="textWrapping"/>
-        <w:t xml:space="preserve">- Ensure the store is clean and well organized with Age of Dinosaurs promotional materials clearly displayed.</w:t>
-        <w:br w:type="textWrapping"/>
-        <w:t xml:space="preserve">---</w:t>
-        <w:br w:type="textWrapping"/>
-        <w:t xml:space="preserve">*Escalation*</w:t>
-        <w:br w:type="textWrapping"/>
-        <w:t xml:space="preserve">Tag *@dinohelp* in your store's Slack channel for any safety issue, malfunction, or escalation during activation or a media visit.</w:t>
-        <w:br w:type="textWrapping"/>
-        <w:t xml:space="preserve">---</w:t>
-        <w:br w:type="textWrapping"/>
-        <w:t xml:space="preserve">*DO NOT Rules*</w:t>
-        <w:br w:type="textWrapping"/>
-        <w:t xml:space="preserve">- DO NOT activate without a trained Dino Handler present.</w:t>
-        <w:br w:type="textWrapping"/>
-        <w:t xml:space="preserve">- DO NOT use unlisted movement modes -- unsupported modes can cause instability, loss of control, or skin damage.</w:t>
-        <w:br w:type="textWrapping"/>
-        <w:t xml:space="preserve">- DO NOT allow guests to touch, grab, ride, or climb the dinosaur.</w:t>
-        <w:br w:type="textWrapping"/>
-        <w:t xml:space="preserve">- DO NOT activate in wet, congested, or unsafe areas.</w:t>
-        <w:br w:type="textWrapping"/>
-        <w:t xml:space="preserve">- DO NOT tell media that Age of Dinosaurs is the only experience at Sandbox VR.</w:t>
-        <w:br w:type="textWrapping"/>
-        <w:t xml:space="preserve">- DO NOT tell media that Age of Dinosaurs is only for kids and families.</w:t>
-        <w:br w:type="textWrapping"/>
-        <w:t xml:space="preserve">---</w:t>
-        <w:br w:type="textWrapping"/>
-        <w:t xml:space="preserve">*Trigger Phrases*</w:t>
-        <w:br w:type="textWrapping"/>
-        <w:t xml:space="preserve">- robo dino activation</w:t>
-        <w:br w:type="textWrapping"/>
-        <w:t xml:space="preserve">- dino on the floor</w:t>
-        <w:br w:type="textWrapping"/>
-        <w:t xml:space="preserve">- floor activation dinosaur</w:t>
-        <w:br w:type="textWrapping"/>
-        <w:t xml:space="preserve">- how to use the dino for sales</w:t>
-        <w:br w:type="textWrapping"/>
-        <w:t xml:space="preserve">- dino selling</w:t>
-        <w:br w:type="textWrapping"/>
-        <w:t xml:space="preserve">- dino handler</w:t>
-        <w:br w:type="textWrapping"/>
-        <w:t xml:space="preserve">- guest rules dinosaur</w:t>
-        <w:br w:type="textWrapping"/>
-        <w:t xml:space="preserve">- dino safety</w:t>
-        <w:br w:type="textWrapping"/>
-        <w:t xml:space="preserve">- media visit dinosaur</w:t>
-        <w:br w:type="textWrapping"/>
-        <w:t xml:space="preserve">- press visit dino</w:t>
-        <w:br w:type="textWrapping"/>
-        <w:t xml:space="preserve">- in-studio dino</w:t>
-        <w:br w:type="textWrapping"/>
-        <w:t xml:space="preserve">- metro PR</w:t>
-        <w:br w:type="textWrapping"/>
-        <w:t xml:space="preserve">- dinosaur talking points</w:t>
-        <w:br w:type="textWrapping"/>
-        <w:t xml:space="preserve">- what to say about age of dinosaurs</w:t>
-        <w:br w:type="textWrapping"/>
-        <w:t xml:space="preserve">- dino promotional tour</w:t>
-        <w:br w:type="textWrapping"/>
-        <w:t xml:space="preserve">- age of dinosaurs media</w:t>
-        <w:br w:type="textWrapping"/>
-        <w:t xml:space="preserve">- dino on the news</w:t>
-        <w:br w:type="textWrapping"/>
-        <w:t xml:space="preserve">- news station dino</w:t>
-        <w:br w:type="textWrapping"/>
-        <w:t xml:space="preserve">- @dinohelp</w:t>
-        <w:br w:type="textWrapping"/>
-        <w:t xml:space="preserve">- dino escalation</w:t>
-      </w:r>
-    </w:p>
-    <w:p>
-      <w:pPr>
-        <w:pStyle w:val="Heading2"/>
-        <w:rPr>
-          <w:rFonts w:ascii="Proxima Nova" w:cs="Proxima Nova" w:eastAsia="Proxima Nova" w:hAnsi="Proxima Nova"/>
-        </w:rPr>
-      </w:pPr>
-      <w:r>
-        <w:rPr>
-          <w:rFonts w:ascii="Proxima Nova" w:cs="Proxima Nova" w:eastAsia="Proxima Nova" w:hAnsi="Proxima Nova"/>
-          <w:rtl w:val="0"/>
-        </w:rPr>
-        <w:t xml:space="preserve"> 92 OPERATIONS  FLIPPING A HOLODECK</w:t>
-      </w:r>
-    </w:p>
-    <w:p>
-      <w:pPr>
-        <w:rPr>
-          <w:rFonts w:ascii="Proxima Nova" w:cs="Proxima Nova" w:eastAsia="Proxima Nova" w:hAnsi="Proxima Nova"/>
-        </w:rPr>
-      </w:pPr>
-      <w:r>
-        <w:rPr>
-          <w:rFonts w:ascii="Proxima Nova" w:cs="Proxima Nova" w:eastAsia="Proxima Nova" w:hAnsi="Proxima Nova"/>
-          <w:rtl w:val="0"/>
-        </w:rPr>
-        <w:t xml:space="preserve">*92_OPERATIONS__FLIPPING_A_HOLODECK*</w:t>
-        <w:br w:type="textWrapping"/>
-        <w:t xml:space="preserve">*Category:* OPERATIONS</w:t>
-        <w:br w:type="textWrapping"/>
-        <w:t xml:space="preserve">*Oasis Link:* &lt;https://sites.google.com/sandboxvr.com/theoasis/home/store-operations/guest-centric-operationally-sound/operating-policies-and-procedures/elearning-service-essentials-guest-journey|Service Essentials: Guest Journey on Oasis&gt;</w:t>
-        <w:br w:type="textWrapping"/>
-        <w:t xml:space="preserve">---</w:t>
-        <w:br w:type="textWrapping"/>
-        <w:t xml:space="preserve">---</w:t>
-        <w:br w:type="textWrapping"/>
-        <w:t xml:space="preserve">*Purpose*</w:t>
-        <w:br w:type="textWrapping"/>
-        <w:t xml:space="preserve">---</w:t>
-        <w:br w:type="textWrapping"/>
-        <w:t xml:space="preserve">---</w:t>
-        <w:br w:type="textWrapping"/>
-        <w:t xml:space="preserve">*Holodeck Flip Checklist*</w:t>
-        <w:br w:type="textWrapping"/>
-        <w:t xml:space="preserve">Complete all steps between every session.</w:t>
-        <w:br w:type="textWrapping"/>
-        <w:t xml:space="preserve">1. Disinfect vests, headsets, and trackers with Briotech on a microfiber cloth</w:t>
-        <w:br w:type="textWrapping"/>
-        <w:t xml:space="preserve">2. Clean HTC lenses with a dry microfiber cloth only</w:t>
-        <w:br w:type="textWrapping"/>
-        <w:t xml:space="preserve">3. Wipe down props if any makeup or dirt got on them</w:t>
-        <w:br w:type="textWrapping"/>
-        <w:t xml:space="preserve">4. Deodorize vests with Renuzit Snuggle Fabric Refresher</w:t>
-        <w:br w:type="textWrapping"/>
-        <w:t xml:space="preserve">5. Swap HTC batteries on any headset with fewer than 3 lights</w:t>
-        <w:br w:type="textWrapping"/>
-        <w:t xml:space="preserve">6. Plug in HTCs</w:t>
-        <w:br w:type="textWrapping"/>
-        <w:t xml:space="preserve">*Charging rules:* HTCs plug in between sessions. Vests and props do NOT -- those charge overnight only.</w:t>
-        <w:br w:type="textWrapping"/>
-        <w:t xml:space="preserve">---</w:t>
-        <w:br w:type="textWrapping"/>
-        <w:t xml:space="preserve">*Example Response Pattern*</w:t>
-        <w:br w:type="textWrapping"/>
-        <w:t xml:space="preserve">Here's the holodeck flip checklist:</w:t>
-        <w:br w:type="textWrapping"/>
-        <w:t xml:space="preserve">1. Disinfect vests, headsets, and trackers (Briotech on a microfiber cloth)</w:t>
-        <w:br w:type="textWrapping"/>
-        <w:t xml:space="preserve">2. Clean HTC lenses (dry microfiber only -- no lens wipes)</w:t>
-        <w:br w:type="textWrapping"/>
-        <w:t xml:space="preserve">3. Wipe down props if dirty</w:t>
-        <w:br w:type="textWrapping"/>
-        <w:t xml:space="preserve">4. Deodorize vests with Renuzit</w:t>
-        <w:br w:type="textWrapping"/>
-        <w:t xml:space="preserve">5. Swap batteries on any HTC with fewer than 3 lights</w:t>
-        <w:br w:type="textWrapping"/>
-        <w:t xml:space="preserve">6. Plug in HTCs</w:t>
-        <w:br w:type="textWrapping"/>
-        <w:t xml:space="preserve">Vests and props do NOT get plugged in between sessions -- those charge overnight.</w:t>
-        <w:br w:type="textWrapping"/>
-        <w:t xml:space="preserve">---</w:t>
-        <w:br w:type="textWrapping"/>
-        <w:t xml:space="preserve">*DO NOT Rules*</w:t>
-        <w:br w:type="textWrapping"/>
-        <w:t xml:space="preserve">- DO NOT spray Briotech or any liquid directly onto items -- always spray onto the cloth first.</w:t>
-        <w:br w:type="textWrapping"/>
-        <w:t xml:space="preserve">- DO NOT use lens cleaning wipes on HTC lenses -- dry microfiber only.</w:t>
-        <w:br w:type="textWrapping"/>
-        <w:t xml:space="preserve">- DO NOT plug in vests between sessions -- overnight charging only.</w:t>
-        <w:br w:type="textWrapping"/>
-        <w:t xml:space="preserve">- DO NOT plug in props between sessions -- overnight charging only.</w:t>
-        <w:br w:type="textWrapping"/>
-        <w:t xml:space="preserve">- DO NOT use Renuzit as a substitute for washing vest liners -- wash them on a weekly cadence.</w:t>
-        <w:br w:type="textWrapping"/>
-        <w:t xml:space="preserve">---</w:t>
-        <w:br w:type="textWrapping"/>
-        <w:t xml:space="preserve">*Trigger Phrases*</w:t>
-        <w:br w:type="textWrapping"/>
-        <w:t xml:space="preserve">- flip a holodeck</w:t>
-        <w:br w:type="textWrapping"/>
-        <w:t xml:space="preserve">- flip a room</w:t>
-        <w:br w:type="textWrapping"/>
-        <w:t xml:space="preserve">- flip the room</w:t>
-        <w:br w:type="textWrapping"/>
-        <w:t xml:space="preserve">- reset holodeck</w:t>
-        <w:br w:type="textWrapping"/>
-        <w:t xml:space="preserve">- reset a room</w:t>
-        <w:br w:type="textWrapping"/>
-        <w:t xml:space="preserve">- reset the room</w:t>
-        <w:br w:type="textWrapping"/>
-        <w:t xml:space="preserve">- turn over a room</w:t>
-        <w:br w:type="textWrapping"/>
-        <w:t xml:space="preserve">- room reset</w:t>
-        <w:br w:type="textWrapping"/>
-        <w:t xml:space="preserve">- between sessions cleaning</w:t>
-        <w:br w:type="textWrapping"/>
-        <w:t xml:space="preserve">- what do I do between sessions</w:t>
-        <w:br w:type="textWrapping"/>
-        <w:t xml:space="preserve">- session reset</w:t>
-        <w:br w:type="textWrapping"/>
-        <w:t xml:space="preserve">- holodeck turnover</w:t>
-        <w:br w:type="textWrapping"/>
-        <w:t xml:space="preserve">- cleaning between sessions</w:t>
-        <w:br w:type="textWrapping"/>
-        <w:t xml:space="preserve">- room flip checklist</w:t>
-      </w:r>
-    </w:p>
-    <w:p>
-      <w:pPr>
-        <w:pStyle w:val="Heading2"/>
-        <w:rPr>
-          <w:rFonts w:ascii="Proxima Nova" w:cs="Proxima Nova" w:eastAsia="Proxima Nova" w:hAnsi="Proxima Nova"/>
-        </w:rPr>
-      </w:pPr>
-      <w:r>
-        <w:rPr>
-          <w:rFonts w:ascii="Proxima Nova" w:cs="Proxima Nova" w:eastAsia="Proxima Nova" w:hAnsi="Proxima Nova"/>
-          <w:rtl w:val="0"/>
-        </w:rPr>
-        <w:t xml:space="preserve"> 97 OPERATIONS  STORE LAYOUT AND DESIGN</w:t>
-      </w:r>
-    </w:p>
-    <w:p>
-      <w:pPr>
-        <w:rPr>
-          <w:rFonts w:ascii="Proxima Nova" w:cs="Proxima Nova" w:eastAsia="Proxima Nova" w:hAnsi="Proxima Nova"/>
-        </w:rPr>
-      </w:pPr>
-      <w:r>
-        <w:rPr>
-          <w:rFonts w:ascii="Proxima Nova" w:cs="Proxima Nova" w:eastAsia="Proxima Nova" w:hAnsi="Proxima Nova"/>
-          <w:rtl w:val="0"/>
-        </w:rPr>
-        <w:t xml:space="preserve">*_97_OPERATIONS__STORE_LAYOUT_AND_DESIGN*</w:t>
-        <w:br w:type="textWrapping"/>
-        <w:t xml:space="preserve">*Category:* OPERATIONS</w:t>
-        <w:br w:type="textWrapping"/>
-        <w:t xml:space="preserve">---</w:t>
-        <w:br w:type="textWrapping"/>
-        <w:t xml:space="preserve">*Purpose*</w:t>
-        <w:br w:type="textWrapping"/>
-        <w:t xml:space="preserve">---</w:t>
-        <w:br w:type="textWrapping"/>
-        <w:t xml:space="preserve">---</w:t>
-        <w:br w:type="textWrapping"/>
-        <w:t xml:space="preserve">---</w:t>
-        <w:br w:type="textWrapping"/>
-        <w:t xml:space="preserve">*Overall Store Size*</w:t>
-        <w:br w:type="textWrapping"/>
-        <w:t xml:space="preserve">A standard 4-room Sandbox VR location is designed for 4,500 to 5,000 square feet (approximately 420 to 465 square meters).</w:t>
-        <w:br w:type="textWrapping"/>
-        <w:t xml:space="preserve">The space must accommodate:</w:t>
-        <w:br w:type="textWrapping"/>
-        <w:t xml:space="preserve">- Entry and kiosk check-in</w:t>
-        <w:br w:type="textWrapping"/>
-        <w:t xml:space="preserve">- Gear-up area</w:t>
-        <w:br w:type="textWrapping"/>
-        <w:t xml:space="preserve">- Four Holodecks</w:t>
-        <w:br w:type="textWrapping"/>
-        <w:t xml:space="preserve">- Post-experience area</w:t>
-        <w:br w:type="textWrapping"/>
-        <w:t xml:space="preserve">- Stockroom</w:t>
-        <w:br w:type="textWrapping"/>
-        <w:t xml:space="preserve">- Restrooms (per local code)</w:t>
-        <w:br w:type="textWrapping"/>
-        <w:t xml:space="preserve">- Optional party room</w:t>
-        <w:br w:type="textWrapping"/>
-        <w:t xml:space="preserve">---</w:t>
-        <w:br w:type="textWrapping"/>
-        <w:t xml:space="preserve">*Guest Flow -- The Journey Through the Store*</w:t>
-        <w:br w:type="textWrapping"/>
-        <w:t xml:space="preserve">The physical layout supports a clear, intentional guest journey:</w:t>
-        <w:br w:type="textWrapping"/>
-        <w:t xml:space="preserve">1. *Entry* -- guests arrive and are greeted at the front of the store</w:t>
-        <w:br w:type="textWrapping"/>
-        <w:t xml:space="preserve">2. *Kiosk Check-In* -- guests check in at the kiosk station near the Poly Wall</w:t>
-        <w:br w:type="textWrapping"/>
-        <w:t xml:space="preserve">3. *Gear-Up* -- guests put on trackers and equipment just outside the Holodeck</w:t>
-        <w:br w:type="textWrapping"/>
-        <w:t xml:space="preserve">4. *Holodeck* -- guests enter for the immersive experience</w:t>
-        <w:br w:type="textWrapping"/>
-        <w:t xml:space="preserve">5. *Post Experience* -- guests exit and watch recap videos, view scores, and share highlights</w:t>
-        <w:br w:type="textWrapping"/>
-        <w:t xml:space="preserve">Every step of this journey is intentional. The store is designed so that the energy of one stage is visible to guests at the next stage -- turning the experience itself into a marketing moment.</w:t>
-        <w:br w:type="textWrapping"/>
-        <w:t xml:space="preserve">---</w:t>
-        <w:br w:type="textWrapping"/>
-        <w:t xml:space="preserve">*The Poly Wall*</w:t>
-        <w:br w:type="textWrapping"/>
-        <w:t xml:space="preserve">The Poly Wall is the signature brand element at the front of the store. It sits in the entry area paired with the kiosk check-in station.</w:t>
-        <w:br w:type="textWrapping"/>
-        <w:t xml:space="preserve">- It is a large, freestanding geometric wall with a faceted, angular design</w:t>
-        <w:br w:type="textWrapping"/>
-        <w:t xml:space="preserve">- The Sandbox VR logo is illuminated on the Poly Wall</w:t>
-        <w:br w:type="textWrapping"/>
-        <w:t xml:space="preserve">- It comes in two layout options: left justified or right justified, to accommodate different spaces</w:t>
-        <w:br w:type="textWrapping"/>
-        <w:t xml:space="preserve">- It is the first major brand moment guests encounter when they enter</w:t>
-        <w:br w:type="textWrapping"/>
-        <w:t xml:space="preserve">- It should immediately communicate that guests are entering a premium, high-tech environment</w:t>
-        <w:br w:type="textWrapping"/>
-        <w:t xml:space="preserve">---</w:t>
-        <w:br w:type="textWrapping"/>
-        <w:t xml:space="preserve">*Kiosk Area*</w:t>
-        <w:br w:type="textWrapping"/>
-        <w:t xml:space="preserve">The kiosk station is positioned near the Poly Wall at the front of the store.</w:t>
-        <w:br w:type="textWrapping"/>
-        <w:t xml:space="preserve">- For a 4-Holodeck location, the standard is 6 kiosks</w:t>
-        <w:br w:type="textWrapping"/>
-        <w:t xml:space="preserve">- Kiosks are slim, angular, freestanding units</w:t>
-        <w:br w:type="textWrapping"/>
-        <w:t xml:space="preserve">- They are designed for guest check-in</w:t>
-        <w:br w:type="textWrapping"/>
-        <w:t xml:space="preserve">- Size and quantity scale with the number of Holodecks</w:t>
-        <w:br w:type="textWrapping"/>
-        <w:t xml:space="preserve">- Power and data requirements are per shop drawings</w:t>
-        <w:br w:type="textWrapping"/>
-        <w:t xml:space="preserve">---</w:t>
-        <w:br w:type="textWrapping"/>
-        <w:t xml:space="preserve">*Gear-Up Area*</w:t>
-        <w:br w:type="textWrapping"/>
-        <w:t xml:space="preserve">The Gear-Up Area is the staging zone just outside the Holodeck entrance where guests put on their equipment before entering.</w:t>
-        <w:br w:type="textWrapping"/>
-        <w:t xml:space="preserve">- Located directly adjacent to the Holodeck</w:t>
-        <w:br w:type="textWrapping"/>
-        <w:t xml:space="preserve">- Guests sit and have trackers, vests, and other gear fitted here</w:t>
-        <w:br w:type="textWrapping"/>
-        <w:t xml:space="preserve">- Equipment storage (vests, props, gear racks) is organized and visible in or near this area</w:t>
-        <w:br w:type="textWrapping"/>
-        <w:t xml:space="preserve">- The area supports smooth throughput so sessions start on time</w:t>
-        <w:br w:type="textWrapping"/>
-        <w:t xml:space="preserve">---</w:t>
-        <w:br w:type="textWrapping"/>
-        <w:t xml:space="preserve">*The Holodeck*</w:t>
-        <w:br w:type="textWrapping"/>
-        <w:t xml:space="preserve">The Holodeck is the room where the immersive VR experience takes place.</w:t>
-        <w:br w:type="textWrapping"/>
-        <w:t xml:space="preserve">*Dimensions (exterior)*</w:t>
-        <w:br w:type="textWrapping"/>
-        <w:t xml:space="preserve">- 26'-2" x 20'-6" x 8'-11" high</w:t>
-        <w:br w:type="textWrapping"/>
-        <w:t xml:space="preserve">- Approximately 533 square feet / 50 square meters per Holodeck</w:t>
-        <w:br w:type="textWrapping"/>
-        <w:t xml:space="preserve">- Designed for up to 6 players</w:t>
-        <w:br w:type="textWrapping"/>
-        <w:t xml:space="preserve">*Ceiling Height*</w:t>
-        <w:br w:type="textWrapping"/>
-        <w:t xml:space="preserve">- Ideal minimum clear ceiling height: 11'-0" (3,350 mm)</w:t>
-        <w:br w:type="textWrapping"/>
-        <w:t xml:space="preserve">- Absolute minimum to physically fit a Holodeck: 9'-0" (2,740 mm)</w:t>
-        <w:br w:type="textWrapping"/>
-        <w:t xml:space="preserve">- All mechanical, electrical, plumbing, pipes, ductwork, and lighting must be installed above the 9'-0" clear space</w:t>
-        <w:br w:type="textWrapping"/>
-        <w:t xml:space="preserve">*Playing Area*</w:t>
-        <w:br w:type="textWrapping"/>
-        <w:t xml:space="preserve">- The interior playing area must be completely unobstructed</w:t>
-        <w:br w:type="textWrapping"/>
-        <w:t xml:space="preserve">- No columns or structural bracing allowed inside the Holodeck</w:t>
-        <w:br w:type="textWrapping"/>
-        <w:t xml:space="preserve">*Temperature*</w:t>
-        <w:br w:type="textWrapping"/>
-        <w:t xml:space="preserve">- The Holodeck must be maintained at 68°F / 20°C or below</w:t>
-        <w:br w:type="textWrapping"/>
-        <w:t xml:space="preserve">- HVAC must be properly configured to hold this temperature</w:t>
-        <w:br w:type="textWrapping"/>
-        <w:t xml:space="preserve">*Power and Signal*</w:t>
-        <w:br w:type="textWrapping"/>
-        <w:t xml:space="preserve">- Per shop drawings and construction documents</w:t>
-        <w:br w:type="textWrapping"/>
-        <w:t xml:space="preserve">---</w:t>
-        <w:br w:type="textWrapping"/>
-        <w:t xml:space="preserve">*Post-Experience Area*</w:t>
-        <w:br w:type="textWrapping"/>
-        <w:t xml:space="preserve">The Post-Experience Area is where guests go after the experience ends to watch their recap video, view their scores, and share highlights.</w:t>
-        <w:br w:type="textWrapping"/>
-        <w:t xml:space="preserve">- Ideally located near the store entry so that people who have not yet played can see the excitement of guests coming out</w:t>
-        <w:br w:type="textWrapping"/>
-        <w:t xml:space="preserve">- This makes the post-experience area a live marketing moment</w:t>
-        <w:br w:type="textWrapping"/>
-        <w:t xml:space="preserve">- The wall is constructed of metal pipe and MDF panels, braced to the ground</w:t>
-        <w:br w:type="textWrapping"/>
-        <w:t xml:space="preserve">- It accommodates a 75" TV monitor</w:t>
-        <w:br w:type="textWrapping"/>
-        <w:t xml:space="preserve">- It uses angular, crisscrossed metal detailing with integrated lighting strips</w:t>
-        <w:br w:type="textWrapping"/>
-        <w:t xml:space="preserve">- The design matches the futuristic aesthetic of the rest of the store</w:t>
-        <w:br w:type="textWrapping"/>
-        <w:t xml:space="preserve">---</w:t>
-        <w:br w:type="textWrapping"/>
-        <w:t xml:space="preserve">*TV Displays*</w:t>
-        <w:br w:type="textWrapping"/>
-        <w:t xml:space="preserve">TV displays are used as a marketing and educational tool throughout the store.</w:t>
-        <w:br w:type="textWrapping"/>
-        <w:t xml:space="preserve">- Primarily located in the storeroom window or in high foot-traffic areas</w:t>
-        <w:br w:type="textWrapping"/>
-        <w:t xml:space="preserve">- Designed to mimic the angular geometry of the Poly Wall</w:t>
-        <w:br w:type="textWrapping"/>
-        <w:t xml:space="preserve">- Constructed of black MDF panels</w:t>
-        <w:br w:type="textWrapping"/>
-        <w:t xml:space="preserve">- Ideal size is a 75" monitor</w:t>
-        <w:br w:type="textWrapping"/>
-        <w:t xml:space="preserve">- Can be mounted in portrait or landscape orientation</w:t>
-        <w:br w:type="textWrapping"/>
-        <w:t xml:space="preserve">- When space is constrained, a TV display unit can serve as an alternative post-experience setup, subject to approval</w:t>
-        <w:br w:type="textWrapping"/>
-        <w:t xml:space="preserve">---</w:t>
-        <w:br w:type="textWrapping"/>
-        <w:t xml:space="preserve">*Stockroom*</w:t>
-        <w:br w:type="textWrapping"/>
-        <w:t xml:space="preserve">- Approximately 275 square feet / 26 square meters</w:t>
-        <w:br w:type="textWrapping"/>
-        <w:t xml:space="preserve">- Used for equipment, supplies, and back-of-house operations</w:t>
-        <w:br w:type="textWrapping"/>
-        <w:t xml:space="preserve">---</w:t>
-        <w:br w:type="textWrapping"/>
-        <w:t xml:space="preserve">*Optional Party Room*</w:t>
-        <w:br w:type="textWrapping"/>
-        <w:t xml:space="preserve">- Approximately 200 to 300 square feet (18.5 to 28 square meters)</w:t>
-        <w:br w:type="textWrapping"/>
-        <w:t xml:space="preserve">- Suitable for approximately 12-person occupancy</w:t>
-        <w:br w:type="textWrapping"/>
-        <w:t xml:space="preserve">- Optional addition depending on the location</w:t>
-        <w:br w:type="textWrapping"/>
-        <w:t xml:space="preserve">---</w:t>
-        <w:br w:type="textWrapping"/>
-        <w:t xml:space="preserve">*Exterior Signage*</w:t>
-        <w:br w:type="textWrapping"/>
-        <w:t xml:space="preserve">- Illuminated facelit storefront signage is preferred</w:t>
-        <w:br w:type="textWrapping"/>
-        <w:t xml:space="preserve">- Signage quantity and letter height are determined on a location-by-location basis</w:t>
-        <w:br w:type="textWrapping"/>
-        <w:t xml:space="preserve">- Logo options: stacked or horizontal (do not use both styles on the same storefront)</w:t>
-        <w:br w:type="textWrapping"/>
-        <w:t xml:space="preserve">- Blade signs are available in stacked, horizontal, or logo-only formats, ideally illuminated</w:t>
-        <w:br w:type="textWrapping"/>
-        <w:t xml:space="preserve">- Ideal color temperature: 5,000K to 6,000K</w:t>
-        <w:br w:type="textWrapping"/>
-        <w:t xml:space="preserve">- Interior and exterior signage should use the same color temperature for consistency</w:t>
-        <w:br w:type="textWrapping"/>
-        <w:t xml:space="preserve">---</w:t>
-        <w:br w:type="textWrapping"/>
-        <w:t xml:space="preserve">*Internet Speed Requirements*</w:t>
-        <w:br w:type="textWrapping"/>
-        <w:t xml:space="preserve">These are the requirements for the store's dedicated internet connection:</w:t>
-        <w:br w:type="textWrapping"/>
-        <w:t xml:space="preserve">Minimum:</w:t>
-        <w:br w:type="textWrapping"/>
-        <w:t xml:space="preserve">- Dedicated fiber, 500 Mbps upload and download</w:t>
-        <w:br w:type="textWrapping"/>
-        <w:t xml:space="preserve">- Ping of 50 ms or less</w:t>
-        <w:br w:type="textWrapping"/>
-        <w:t xml:space="preserve">Optimal:</w:t>
-        <w:br w:type="textWrapping"/>
-        <w:t xml:space="preserve">- Dedicated fiber, 1 Gbps upload and download</w:t>
-        <w:br w:type="textWrapping"/>
-        <w:t xml:space="preserve">- Ping of 30 ms or less</w:t>
-        <w:br w:type="textWrapping"/>
-        <w:t xml:space="preserve">---</w:t>
-        <w:br w:type="textWrapping"/>
-        <w:t xml:space="preserve">*Overall Design Aesthetic*</w:t>
-        <w:br w:type="textWrapping"/>
-        <w:t xml:space="preserve">Sandbox VR locations are designed to feel futuristic, cinematic, and immersive before a guest ever puts on a headset.</w:t>
-        <w:br w:type="textWrapping"/>
-        <w:t xml:space="preserve">Key design elements used throughout:</w:t>
-        <w:br w:type="textWrapping"/>
-        <w:t xml:space="preserve">- Angular, faceted geometric forms (Poly Wall, kiosk bases, TV stands, post-experience wall)</w:t>
-        <w:br w:type="textWrapping"/>
-        <w:t xml:space="preserve">- Black structural elements with cool accent lighting</w:t>
-        <w:br w:type="textWrapping"/>
-        <w:t xml:space="preserve">- Polished concrete floors</w:t>
-        <w:br w:type="textWrapping"/>
-        <w:t xml:space="preserve">- Exposed ceilings with industrial finishes</w:t>
-        <w:br w:type="textWrapping"/>
-        <w:t xml:space="preserve">- Illuminated Sandbox VR branding</w:t>
-        <w:br w:type="textWrapping"/>
-        <w:t xml:space="preserve">- Experience posters and campaign graphics throughout the space</w:t>
-        <w:br w:type="textWrapping"/>
-        <w:t xml:space="preserve">The store environment is intentional. Every element -- from the signage outside to the gear-up benches -- is designed to communicate that this is a premium entertainment experience.</w:t>
-        <w:br w:type="textWrapping"/>
-        <w:t xml:space="preserve">---</w:t>
-        <w:br w:type="textWrapping"/>
-        <w:t xml:space="preserve">*DO NOT Rules*</w:t>
-        <w:br w:type="textWrapping"/>
-        <w:t xml:space="preserve">- Do not guess specific dimensions for a user's particular store. Dimensions in this file are standards. Actual stores may vary.</w:t>
-        <w:br w:type="textWrapping"/>
-        <w:t xml:space="preserve">- Do not provide construction or build advice. Route any construction questions to the franchise or facilities team.</w:t>
-        <w:br w:type="textWrapping"/>
-        <w:t xml:space="preserve">- Do not use two different logo styles on the same storefront.</w:t>
-        <w:br w:type="textWrapping"/>
-        <w:t xml:space="preserve">---</w:t>
-        <w:br w:type="textWrapping"/>
-        <w:t xml:space="preserve">*Trigger Phrases*</w:t>
-        <w:br w:type="textWrapping"/>
-        <w:t xml:space="preserve">- how big is a Sandbox VR store</w:t>
-        <w:br w:type="textWrapping"/>
-        <w:t xml:space="preserve">- what is the square footage of a store</w:t>
-        <w:br w:type="textWrapping"/>
-        <w:t xml:space="preserve">- how big is a Holodeck</w:t>
-        <w:br w:type="textWrapping"/>
-        <w:t xml:space="preserve">- Holodeck dimensions</w:t>
-        <w:br w:type="textWrapping"/>
-        <w:t xml:space="preserve">- Holodeck size</w:t>
-        <w:br w:type="textWrapping"/>
-        <w:t xml:space="preserve">- how big is the room</w:t>
-        <w:br w:type="textWrapping"/>
-        <w:t xml:space="preserve">- what is a Poly Wall</w:t>
-        <w:br w:type="textWrapping"/>
-        <w:t xml:space="preserve">- what does the Poly Wall do</w:t>
-        <w:br w:type="textWrapping"/>
-        <w:t xml:space="preserve">- what is the kiosk area</w:t>
-        <w:br w:type="textWrapping"/>
-        <w:t xml:space="preserve">- kiosk station</w:t>
-        <w:br w:type="textWrapping"/>
-        <w:t xml:space="preserve">- how many kiosks</w:t>
-        <w:br w:type="textWrapping"/>
-        <w:t xml:space="preserve">- what is the gear-up area</w:t>
-        <w:br w:type="textWrapping"/>
-        <w:t xml:space="preserve">- gear up area</w:t>
-        <w:br w:type="textWrapping"/>
-        <w:t xml:space="preserve">- what is the post experience area</w:t>
-        <w:br w:type="textWrapping"/>
-        <w:t xml:space="preserve">- post experience wall</w:t>
-        <w:br w:type="textWrapping"/>
-        <w:t xml:space="preserve">- recap area</w:t>
-        <w:br w:type="textWrapping"/>
-        <w:t xml:space="preserve">- post experience TV</w:t>
-        <w:br w:type="textWrapping"/>
-        <w:t xml:space="preserve">- what is a TV display</w:t>
-        <w:br w:type="textWrapping"/>
-        <w:t xml:space="preserve">- where do TV displays go</w:t>
-        <w:br w:type="textWrapping"/>
-        <w:t xml:space="preserve">- what is the stockroom size</w:t>
-        <w:br w:type="textWrapping"/>
-        <w:t xml:space="preserve">- stockroom square footage</w:t>
-        <w:br w:type="textWrapping"/>
-        <w:t xml:space="preserve">- party room</w:t>
-        <w:br w:type="textWrapping"/>
-        <w:t xml:space="preserve">- optional party room</w:t>
-        <w:br w:type="textWrapping"/>
-        <w:t xml:space="preserve">- how big is the party room</w:t>
-        <w:br w:type="textWrapping"/>
-        <w:t xml:space="preserve">- what is the ceiling height requirement</w:t>
-        <w:br w:type="textWrapping"/>
-        <w:t xml:space="preserve">- minimum ceiling height</w:t>
-        <w:br w:type="textWrapping"/>
-        <w:t xml:space="preserve">- Holodeck ceiling</w:t>
-        <w:br w:type="textWrapping"/>
-        <w:t xml:space="preserve">- temperature requirement store</w:t>
-        <w:br w:type="textWrapping"/>
-        <w:t xml:space="preserve">- temperature requirement Holodeck</w:t>
-        <w:br w:type="textWrapping"/>
-        <w:t xml:space="preserve">- HVAC Holodeck</w:t>
-        <w:br w:type="textWrapping"/>
-        <w:t xml:space="preserve">- internet speed requirement</w:t>
-        <w:br w:type="textWrapping"/>
-        <w:t xml:space="preserve">- fiber requirement</w:t>
-        <w:br w:type="textWrapping"/>
-        <w:t xml:space="preserve">- internet requirements Sandbox VR</w:t>
-        <w:br w:type="textWrapping"/>
-        <w:t xml:space="preserve">- what does the store look like</w:t>
-        <w:br w:type="textWrapping"/>
-        <w:t xml:space="preserve">- what is the store design</w:t>
-        <w:br w:type="textWrapping"/>
-        <w:t xml:space="preserve">- store layout</w:t>
-        <w:br w:type="textWrapping"/>
-        <w:t xml:space="preserve">- floor plan</w:t>
-        <w:br w:type="textWrapping"/>
-        <w:t xml:space="preserve">- guest flow through store</w:t>
-        <w:br w:type="textWrapping"/>
-        <w:t xml:space="preserve">- how do guests move through the store</w:t>
-        <w:br w:type="textWrapping"/>
-        <w:t xml:space="preserve">- store aesthetic</w:t>
-        <w:br w:type="textWrapping"/>
-        <w:t xml:space="preserve">- signage types</w:t>
-        <w:br w:type="textWrapping"/>
-        <w:t xml:space="preserve">- exterior signage</w:t>
-        <w:br w:type="textWrapping"/>
-        <w:t xml:space="preserve">- blade sign</w:t>
-        <w:br w:type="textWrapping"/>
-        <w:t xml:space="preserve">- illuminated signage</w:t>
-        <w:br w:type="textWrapping"/>
-        <w:t xml:space="preserve">- what is the Poly Wall made of</w:t>
-        <w:br w:type="textWrapping"/>
-        <w:t xml:space="preserve">- what is the post experience wall made of</w:t>
-        <w:br w:type="textWrapping"/>
-        <w:t xml:space="preserve">- what is a holodeck made of</w:t>
-        <w:br w:type="textWrapping"/>
-        <w:t xml:space="preserve">- store design guidelines</w:t>
-        <w:br w:type="textWrapping"/>
-        <w:t xml:space="preserve">- what should the store feel like</w:t>
-        <w:br w:type="textWrapping"/>
-        <w:t xml:space="preserve">---</w:t>
-        <w:br w:type="textWrapping"/>
-        <w:t xml:space="preserve">*Example Response Patterns*</w:t>
-        <w:br w:type="textWrapping"/>
-        <w:t xml:space="preserve">- "A standard 4-room Sandbox VR store is 4,500 to 5,000 square feet. That includes the Holodecks, kiosk area, gear-up, post-experience, and stockroom."</w:t>
-        <w:br w:type="textWrapping"/>
-        <w:t xml:space="preserve">- "Each Holodeck is approximately 26'-2" x 20'-6" with a ceiling height requirement of at least 9'-0" (ideally 11'-0"). The playing area must be completely free of columns or obstructions."</w:t>
-        <w:br w:type="textWrapping"/>
-        <w:t xml:space="preserve">- "The Poly Wall is the large, angular geometric wall at the front of the store with an illuminated Sandbox VR logo. It's the first major brand moment guests see when they walk in."</w:t>
-        <w:br w:type="textWrapping"/>
-        <w:t xml:space="preserve">- "The post-experience area is intentionally placed near the entry so that guests who haven't played yet can see the excitement of guests coming out. It turns the end of the experience into a live marketing moment."</w:t>
-        <w:br w:type="textWrapping"/>
-        <w:t xml:space="preserve">- "Internet requirements are a minimum of dedicated fiber at 500 Mbps with 50 ms ping or less. Optimal is 1 Gbps with 30 ms ping or less."</w:t>
-        <w:br w:type="textWrapping"/>
-        <w:t xml:space="preserve">- "The Holodeck must be kept at 68°F / 20°C or below. HVAC must be configured to hold that temperature."</w:t>
-      </w:r>
-    </w:p>
-    <w:p>
-      <w:pPr>
-        <w:rPr>
-          <w:rFonts w:ascii="Proxima Nova" w:cs="Proxima Nova" w:eastAsia="Proxima Nova" w:hAnsi="Proxima Nova"/>
-        </w:rPr>
-      </w:pPr>
-      <w:r>
-        <w:br w:type="page"/>
-      </w:r>
-      <w:r>
-        <w:rPr>
-          <w:rtl w:val="0"/>
-        </w:rPr>
-      </w:r>
-    </w:p>
-    <w:p>
-      <w:pPr>
-        <w:pStyle w:val="Heading1"/>
-        <w:rPr>
-          <w:rFonts w:ascii="Proxima Nova" w:cs="Proxima Nova" w:eastAsia="Proxima Nova" w:hAnsi="Proxima Nova"/>
-        </w:rPr>
-      </w:pPr>
-      <w:r>
-        <w:rPr>
-          <w:rFonts w:ascii="Proxima Nova" w:cs="Proxima Nova" w:eastAsia="Proxima Nova" w:hAnsi="Proxima Nova"/>
-          <w:rtl w:val="0"/>
-        </w:rPr>
-        <w:t xml:space="preserve">Guest Experience</w:t>
-      </w:r>
-    </w:p>
-    <w:p>
-      <w:pPr>
-        <w:pStyle w:val="Heading2"/>
-        <w:rPr>
-          <w:rFonts w:ascii="Proxima Nova" w:cs="Proxima Nova" w:eastAsia="Proxima Nova" w:hAnsi="Proxima Nova"/>
-        </w:rPr>
-      </w:pPr>
-      <w:r>
-        <w:rPr>
-          <w:rFonts w:ascii="Proxima Nova" w:cs="Proxima Nova" w:eastAsia="Proxima Nova" w:hAnsi="Proxima Nova"/>
-          <w:rtl w:val="0"/>
-        </w:rPr>
-        <w:t xml:space="preserve"> 08 POLICY  INTERNAL GUEST POLICIES AND RECOVERY</w:t>
-      </w:r>
-    </w:p>
-    <w:p>
-      <w:pPr>
-        <w:rPr>
-          <w:rFonts w:ascii="Proxima Nova" w:cs="Proxima Nova" w:eastAsia="Proxima Nova" w:hAnsi="Proxima Nova"/>
-        </w:rPr>
-      </w:pPr>
-      <w:r>
-        <w:rPr>
-          <w:rFonts w:ascii="Proxima Nova" w:cs="Proxima Nova" w:eastAsia="Proxima Nova" w:hAnsi="Proxima Nova"/>
-          <w:rtl w:val="0"/>
-        </w:rPr>
-        <w:t xml:space="preserve">*08_POLICY__INTERNAL_GUEST_POLICIES_AND_RECOVERY*</w:t>
-        <w:br w:type="textWrapping"/>
-        <w:t xml:space="preserve">---</w:t>
-        <w:br w:type="textWrapping"/>
-        <w:t xml:space="preserve">*Purpose*</w:t>
-        <w:br w:type="textWrapping"/>
-        <w:t xml:space="preserve">This file defines the internal store-facing guidance Apollo should use when answering questions about guest policies and guest recovery inside Sandbox VR operations.</w:t>
-      </w:r>
-    </w:p>
-    <w:p>
-      <w:pPr>
-        <w:pStyle w:val="Heading2"/>
-        <w:rPr>
-          <w:rFonts w:ascii="Proxima Nova" w:cs="Proxima Nova" w:eastAsia="Proxima Nova" w:hAnsi="Proxima Nova"/>
-        </w:rPr>
-      </w:pPr>
-      <w:r>
-        <w:rPr>
-          <w:rFonts w:ascii="Proxima Nova" w:cs="Proxima Nova" w:eastAsia="Proxima Nova" w:hAnsi="Proxima Nova"/>
-          <w:rtl w:val="0"/>
-        </w:rPr>
-        <w:t xml:space="preserve"> 09 POLICY  CUSTOMER FAQ OFFICIAL GUEST FACING</w:t>
-      </w:r>
-    </w:p>
-    <w:p>
-      <w:pPr>
-        <w:rPr>
-          <w:rFonts w:ascii="Proxima Nova" w:cs="Proxima Nova" w:eastAsia="Proxima Nova" w:hAnsi="Proxima Nova"/>
-        </w:rPr>
-      </w:pPr>
-      <w:r>
-        <w:rPr>
-          <w:rFonts w:ascii="Proxima Nova" w:cs="Proxima Nova" w:eastAsia="Proxima Nova" w:hAnsi="Proxima Nova"/>
-          <w:rtl w:val="0"/>
-        </w:rPr>
-        <w:t xml:space="preserve">*09_POLICY__CUSTOMER_FAQ_OFFICIAL_GUEST_FACING*</w:t>
-        <w:br w:type="textWrapping"/>
-        <w:t xml:space="preserve">---</w:t>
-        <w:br w:type="textWrapping"/>
-        <w:t xml:space="preserve">*Purpose*</w:t>
-        <w:br w:type="textWrapping"/>
-        <w:t xml:space="preserve">This file defines the official guest-facing policy guidance Apollo should use when the user is asking what to tell a guest or asking about official Sandbox VR customer policies.</w:t>
-      </w:r>
-    </w:p>
-    <w:p>
-      <w:pPr>
-        <w:pStyle w:val="Heading2"/>
-        <w:rPr>
-          <w:rFonts w:ascii="Proxima Nova" w:cs="Proxima Nova" w:eastAsia="Proxima Nova" w:hAnsi="Proxima Nova"/>
-        </w:rPr>
-      </w:pPr>
-      <w:r>
-        <w:rPr>
-          <w:rFonts w:ascii="Proxima Nova" w:cs="Proxima Nova" w:eastAsia="Proxima Nova" w:hAnsi="Proxima Nova"/>
-          <w:rtl w:val="0"/>
-        </w:rPr>
-        <w:t xml:space="preserve"> 100 GUEST  SERVICE ANIMALS LEGAL WIFI STORE HOURS</w:t>
-      </w:r>
-    </w:p>
-    <w:p>
-      <w:pPr>
-        <w:rPr>
-          <w:rFonts w:ascii="Proxima Nova" w:cs="Proxima Nova" w:eastAsia="Proxima Nova" w:hAnsi="Proxima Nova"/>
-        </w:rPr>
-      </w:pPr>
-      <w:r>
-        <w:rPr>
-          <w:rFonts w:ascii="Proxima Nova" w:cs="Proxima Nova" w:eastAsia="Proxima Nova" w:hAnsi="Proxima Nova"/>
-          <w:rtl w:val="0"/>
-        </w:rPr>
-        <w:t xml:space="preserve">*_100_GUEST__SERVICE_ANIMALS_LEGAL_WIFI_STORE_HOURS*</w:t>
-        <w:br w:type="textWrapping"/>
-        <w:t xml:space="preserve">*Category:* GUEST</w:t>
-        <w:br w:type="textWrapping"/>
-        <w:t xml:space="preserve">*Oasis:* &lt;https://sites.google.com/sandboxvr.com/theoasis/home/store-operations/guest-centric-operationally-sound/operating-policies-and-procedures/operations-best-practices|Operations Best Practices -- Oasis&gt;</w:t>
-        <w:br w:type="textWrapping"/>
-        <w:t xml:space="preserve">---</w:t>
-        <w:br w:type="textWrapping"/>
-        <w:t xml:space="preserve">*Purpose*</w:t>
-        <w:br w:type="textWrapping"/>
-        <w:t xml:space="preserve">---</w:t>
-        <w:br w:type="textWrapping"/>
-        <w:t xml:space="preserve">---</w:t>
-        <w:br w:type="textWrapping"/>
-        <w:t xml:space="preserve">*Service Animal Policy*</w:t>
-        <w:br w:type="textWrapping"/>
-        <w:t xml:space="preserve">Sandbox VR welcomes service animals. The following rules apply without exception:</w:t>
-        <w:br w:type="textWrapping"/>
-        <w:t xml:space="preserve">- While the owner is playing, the service animal *must be supervised by another member of the guest's party* -- not by staff.</w:t>
-        <w:br w:type="textWrapping"/>
-        <w:t xml:space="preserve">- Staff are *not* responsible for supervising, holding, or monitoring service animals at any time.</w:t>
-        <w:br w:type="textWrapping"/>
-        <w:t xml:space="preserve">- Service animals may not wait unsupervised. If no one in the party can stay with the animal, the guest will need to make alternative arrangements.</w:t>
-        <w:br w:type="textWrapping"/>
-        <w:t xml:space="preserve">- Do not question whether the animal is a service animal.</w:t>
-        <w:br w:type="textWrapping"/>
-        <w:t xml:space="preserve">- Do not make exceptions based on staffing levels or guest pressure.</w:t>
-        <w:br w:type="textWrapping"/>
-        <w:t xml:space="preserve">*What to say to the guest:*</w:t>
-        <w:br w:type="textWrapping"/>
-        <w:t xml:space="preserve">"While you're in the experience, another member of your party must remain with your service animal at all times. Our staff are not able to supervise animals during sessions."</w:t>
-        <w:br w:type="textWrapping"/>
-        <w:t xml:space="preserve">*Non-Service Animals (Pets)*</w:t>
-        <w:br w:type="textWrapping"/>
-        <w:t xml:space="preserve">For any animal that is not a service animal -- including pets, emotional support animals, or companion animals -- do not apply the service animal policy. Direct the staff member to their Ops Leader for guidance specific to their location. Policies may vary by store.</w:t>
-        <w:br w:type="textWrapping"/>
-        <w:t xml:space="preserve">---</w:t>
-        <w:br w:type="textWrapping"/>
-        <w:t xml:space="preserve">*Guest Legal Inquiries*</w:t>
-        <w:br w:type="textWrapping"/>
-        <w:t xml:space="preserve">For any guest legal matter, direct them to:</w:t>
-        <w:br w:type="textWrapping"/>
-        <w:t xml:space="preserve">*legal@sandboxvr.com*</w:t>
-        <w:br w:type="textWrapping"/>
-        <w:t xml:space="preserve">- Do not provide legal advice, interpretation, or commentary.</w:t>
-        <w:br w:type="textWrapping"/>
-        <w:t xml:space="preserve">- Do not route through store teams or management.</w:t>
-        <w:br w:type="textWrapping"/>
-        <w:t xml:space="preserve">- One line only: "For legal matters, guests should contact our legal team directly at legal@sandboxvr.com."</w:t>
-        <w:br w:type="textWrapping"/>
-        <w:t xml:space="preserve">---</w:t>
-        <w:br w:type="textWrapping"/>
-        <w:t xml:space="preserve">*Guest Wi-Fi Passcode*</w:t>
-        <w:br w:type="textWrapping"/>
-        <w:t xml:space="preserve">The guest Wi-Fi passcode should be: *sbxguest*</w:t>
-        <w:br w:type="textWrapping"/>
-        <w:t xml:space="preserve">- Use "should be" -- do not guarantee this is correct for every location.</w:t>
-        <w:br w:type="textWrapping"/>
-        <w:t xml:space="preserve">- If the passcode does not work, contact T1 via Slack to confirm the correct code for that store.</w:t>
-        <w:br w:type="textWrapping"/>
-        <w:t xml:space="preserve">- Do not invent alternative passwords.</w:t>
-        <w:br w:type="textWrapping"/>
-        <w:t xml:space="preserve">---</w:t>
-        <w:br w:type="textWrapping"/>
-        <w:t xml:space="preserve">*Store Operating Hours*</w:t>
-        <w:br w:type="textWrapping"/>
-        <w:t xml:space="preserve">There is no universal closing time. Store hours vary by location, day, and business needs.</w:t>
-        <w:br w:type="textWrapping"/>
-        <w:t xml:space="preserve">General reference only (not guaranteed for all locations):</w:t>
-        <w:br w:type="textWrapping"/>
-        <w:t xml:space="preserve">- Mon--Thu (non-peak): 10:00 AM -- 11:00 PM</w:t>
-        <w:br w:type="textWrapping"/>
-        <w:t xml:space="preserve">- Fri--Sun (non-peak): 10:00 AM -- 12:00 AM</w:t>
-        <w:br w:type="textWrapping"/>
-        <w:t xml:space="preserve">- Peak periods (all days): 10:00 AM -- 12:00 AM</w:t>
-        <w:br w:type="textWrapping"/>
-        <w:t xml:space="preserve">Always confirm hours with the Store Manager or Territory Leader for the specific location.</w:t>
-        <w:br w:type="textWrapping"/>
-        <w:t xml:space="preserve">---</w:t>
-        <w:br w:type="textWrapping"/>
-        <w:t xml:space="preserve">*Lobby Signage*</w:t>
-        <w:br w:type="textWrapping"/>
-        <w:t xml:space="preserve">Lobby poster requirements vary by state, season, and active marketing initiatives. Partner with the Territory Leader for current guidance. Do not guess or list specific posters.</w:t>
-        <w:br w:type="textWrapping"/>
-        <w:t xml:space="preserve">---</w:t>
-        <w:br w:type="textWrapping"/>
-        <w:t xml:space="preserve">*DO NOT Rules*</w:t>
-        <w:br w:type="textWrapping"/>
-        <w:t xml:space="preserve">- Do not question whether an animal is a service animal.</w:t>
-        <w:br w:type="textWrapping"/>
-        <w:t xml:space="preserve">- Do not tell staff that they or other staff members should supervise a service animal.</w:t>
-        <w:br w:type="textWrapping"/>
-        <w:t xml:space="preserve">- Do not make exceptions to the service animal policy for any reason.</w:t>
-        <w:br w:type="textWrapping"/>
-        <w:t xml:space="preserve">- Do not apply the service animal policy to non-service animals. Direct to the Ops Leader instead.</w:t>
-        <w:br w:type="textWrapping"/>
-        <w:t xml:space="preserve">- Do not provide legal advice or route legal matters through store management.</w:t>
-        <w:br w:type="textWrapping"/>
-        <w:t xml:space="preserve">- Do not guarantee the Wi-Fi passcode is correct for every location.</w:t>
-        <w:br w:type="textWrapping"/>
-        <w:t xml:space="preserve">- Do not invent alternative Wi-Fi passwords.</w:t>
-        <w:br w:type="textWrapping"/>
-        <w:t xml:space="preserve">- Do not state a universal store closing time. Hours vary by location.</w:t>
-        <w:br w:type="textWrapping"/>
-        <w:t xml:space="preserve">- Do not list specific lobby posters. Signage requirements vary.</w:t>
-        <w:br w:type="textWrapping"/>
-        <w:t xml:space="preserve">---</w:t>
-        <w:br w:type="textWrapping"/>
-        <w:t xml:space="preserve">*Trigger Phrases*</w:t>
-        <w:br w:type="textWrapping"/>
-        <w:t xml:space="preserve">- service animal</w:t>
-        <w:br w:type="textWrapping"/>
-        <w:t xml:space="preserve">- service dog</w:t>
-        <w:br w:type="textWrapping"/>
-        <w:t xml:space="preserve">- guide dog</w:t>
-        <w:br w:type="textWrapping"/>
-        <w:t xml:space="preserve">- assistance animal</w:t>
-        <w:br w:type="textWrapping"/>
-        <w:t xml:space="preserve">- emotional support animal</w:t>
-        <w:br w:type="textWrapping"/>
-        <w:t xml:space="preserve">- dog in store</w:t>
-        <w:br w:type="textWrapping"/>
-        <w:t xml:space="preserve">- pet in store</w:t>
-        <w:br w:type="textWrapping"/>
-        <w:t xml:space="preserve">- can a guest bring a dog</w:t>
-        <w:br w:type="textWrapping"/>
-        <w:t xml:space="preserve">- service animal policy</w:t>
-        <w:br w:type="textWrapping"/>
-        <w:t xml:space="preserve">- supervise service animal</w:t>
-        <w:br w:type="textWrapping"/>
-        <w:t xml:space="preserve">- service animal alone</w:t>
-        <w:br w:type="textWrapping"/>
-        <w:t xml:space="preserve">- who watches service animal</w:t>
-        <w:br w:type="textWrapping"/>
-        <w:t xml:space="preserve">- guest legal</w:t>
-        <w:br w:type="textWrapping"/>
-        <w:t xml:space="preserve">- legal inquiry</w:t>
-        <w:br w:type="textWrapping"/>
-        <w:t xml:space="preserve">- legal email</w:t>
-        <w:br w:type="textWrapping"/>
-        <w:t xml:space="preserve">- legal@sandboxvr.com</w:t>
-        <w:br w:type="textWrapping"/>
-        <w:t xml:space="preserve">- legal contact</w:t>
-        <w:br w:type="textWrapping"/>
-        <w:t xml:space="preserve">- guest Wi-Fi</w:t>
-        <w:br w:type="textWrapping"/>
-        <w:t xml:space="preserve">- WiFi password</w:t>
-        <w:br w:type="textWrapping"/>
-        <w:t xml:space="preserve">- WiFi passcode</w:t>
-        <w:br w:type="textWrapping"/>
-        <w:t xml:space="preserve">- guest network</w:t>
-        <w:br w:type="textWrapping"/>
-        <w:t xml:space="preserve">- sbxguest</w:t>
-        <w:br w:type="textWrapping"/>
-        <w:t xml:space="preserve">- WiFi not working</w:t>
-        <w:br w:type="textWrapping"/>
-        <w:t xml:space="preserve">- store hours</w:t>
-        <w:br w:type="textWrapping"/>
-        <w:t xml:space="preserve">- operating hours</w:t>
-        <w:br w:type="textWrapping"/>
-        <w:t xml:space="preserve">- what time do you close</w:t>
-        <w:br w:type="textWrapping"/>
-        <w:t xml:space="preserve">- store closing time</w:t>
-        <w:br w:type="textWrapping"/>
-        <w:t xml:space="preserve">- when does store open</w:t>
-        <w:br w:type="textWrapping"/>
-        <w:t xml:space="preserve">- holiday hours</w:t>
-        <w:br w:type="textWrapping"/>
-        <w:t xml:space="preserve">- lobby posters</w:t>
-        <w:br w:type="textWrapping"/>
-        <w:t xml:space="preserve">- lobby signage</w:t>
-        <w:br w:type="textWrapping"/>
-        <w:t xml:space="preserve">- poster requirements</w:t>
-        <w:br w:type="textWrapping"/>
-        <w:t xml:space="preserve">- marketing posters</w:t>
-        <w:br w:type="textWrapping"/>
-        <w:t xml:space="preserve">---</w:t>
-        <w:br w:type="textWrapping"/>
-        <w:t xml:space="preserve">*Example Response Patterns*</w:t>
-        <w:br w:type="textWrapping"/>
-        <w:t xml:space="preserve">- "While a guest is in the experience, another member of their party must stay with the service animal. Staff cannot supervise animals during sessions."</w:t>
-        <w:br w:type="textWrapping"/>
-        <w:t xml:space="preserve">- "For a non-service animal, check with your Ops Leader -- policies can vary by location."</w:t>
-        <w:br w:type="textWrapping"/>
-        <w:t xml:space="preserve">- "For legal matters, guests should contact our legal team directly at legal@sandboxvr.com."</w:t>
-        <w:br w:type="textWrapping"/>
-        <w:t xml:space="preserve">- "The guest Wi-Fi passcode should be sbxguest. If that doesn't work, contact T1 via Slack to confirm the correct code for your store."</w:t>
-        <w:br w:type="textWrapping"/>
-        <w:t xml:space="preserve">- "Store hours vary by location. General reference: Mon--Thu until 11 PM, Fri--Sun until midnight, with peak periods running until midnight daily. Confirm with your Store Manager or Territory Leader for your specific hours."</w:t>
-      </w:r>
-    </w:p>
-    <w:p>
-      <w:pPr>
-        <w:pStyle w:val="Heading2"/>
-        <w:rPr>
-          <w:rFonts w:ascii="Proxima Nova" w:cs="Proxima Nova" w:eastAsia="Proxima Nova" w:hAnsi="Proxima Nova"/>
-        </w:rPr>
-      </w:pPr>
-      <w:r>
-        <w:rPr>
-          <w:rFonts w:ascii="Proxima Nova" w:cs="Proxima Nova" w:eastAsia="Proxima Nova" w:hAnsi="Proxima Nova"/>
-          <w:rtl w:val="0"/>
-        </w:rPr>
-        <w:t xml:space="preserve"> 10 EXPERIENCES  CURRENT EXPERIENCE CATALOG</w:t>
+      <w:r>
+        <w:t>*41_TECH__POWER_FAILURE_AND_REBOOT_PROCESS* --- *Purpose*</w:t>
+      </w:r>
+    </w:p>
+    <w:p>
+      <w:r>
+        <w:t>If the ATH Powers Off Completely (All LEDs Dark)</w:t>
+      </w:r>
+    </w:p>
+    <w:p>
+      <w:r>
+        <w:t>- Check whether the ATH battery is charged — the ATH charges simultaneously with the headset</w:t>
+      </w:r>
+    </w:p>
+    <w:p>
+      <w:r>
+        <w:t>makes it seem like the ATH has its own battery.. The ATH DOES NOT HAVE ITS OWN BATTERY. It is simply on when it is plugged into the HTC. If it is turning off, but its plugged in and powered on, then that is a problem with either cable not being seated fully, or the cable being damaged, or antoher separate issue regarding the itnernal hardware of the ATH.</w:t>
+      </w:r>
+    </w:p>
+    <w:p>
+      <w:r>
+        <w:t>If this happens the team should simply submit a tracking workflow and explain the issue clearly to T1.</w:t>
       </w:r>
     </w:p>
     <w:p>

</xml_diff>